<commit_message>
docs: agregar evidencia de ejecución del equipo para TG3 (pytest y calibración en máquina)
</commit_message>
<xml_diff>
--- a/docs/documentacion_tecnica.docx
+++ b/docs/documentacion_tecnica.docx
@@ -2688,6 +2688,1379 @@
         <w:spacing w:after="150" w:before="300"/>
       </w:pPr>
       <w:r>
+        <w:t xml:space="preserve">3. Calibración del modelo matemático — src/calibration.py (TG3)</w:t>
+      </w:r>
+    </w:p>
+    <w:p>
+      <w:pPr>
+        <w:spacing w:after="120"/>
+      </w:pPr>
+      <w:r>
+        <w:t xml:space="preserve">Responsable: Valery Salas Vargas.</w:t>
+      </w:r>
+    </w:p>
+    <w:p>
+      <w:pPr>
+        <w:spacing w:after="120"/>
+      </w:pPr>
+      <w:r>
+        <w:t xml:space="preserve">El sistema no opera sobre un servidor real, por lo que no hay telemetría externa contra la cual calibrar. En su lugar, se generan observaciones sintéticas con ruido gaussiano controlado a partir de los parámetros base definidos en simulation.py, y se comprueba que el ajuste no lineal por mínimos cuadrados (scipy.optimize.curve_fit) recupera esos parámetros dentro de una tolerancia razonable. Esto valida que la metodología de ajuste sería correcta si en el futuro se dispusiera de telemetría real.</w:t>
+      </w:r>
+    </w:p>
+    <w:p>
+      <w:pPr>
+        <w:pStyle w:val="Heading2"/>
+        <w:spacing w:after="110" w:before="220"/>
+      </w:pPr>
+      <w:r>
+        <w:t xml:space="preserve">3.1 Dependencia agregada</w:t>
+      </w:r>
+    </w:p>
+    <w:p>
+      <w:pPr>
+        <w:spacing w:after="120"/>
+      </w:pPr>
+      <w:r>
+        <w:t xml:space="preserve">Se añadió scipy==1.18.0 a requirements.txt, necesaria para curve_fit (ajuste no lineal por mínimos cuadrados).</w:t>
+      </w:r>
+    </w:p>
+    <w:p>
+      <w:pPr>
+        <w:pStyle w:val="Heading2"/>
+        <w:spacing w:after="110" w:before="220"/>
+      </w:pPr>
+      <w:r>
+        <w:t xml:space="preserve">3.2 Configuración del experimento de calibración</w:t>
+      </w:r>
+    </w:p>
+    <w:tbl>
+      <w:tblPr>
+        <w:tblW w:type="dxa" w:w="9360"/>
+        <w:tblBorders>
+          <w:top w:val="single" w:color="auto" w:sz="4"/>
+          <w:left w:val="single" w:color="auto" w:sz="4"/>
+          <w:bottom w:val="single" w:color="auto" w:sz="4"/>
+          <w:right w:val="single" w:color="auto" w:sz="4"/>
+          <w:insideH w:val="single" w:color="auto" w:sz="4"/>
+          <w:insideV w:val="single" w:color="auto" w:sz="4"/>
+        </w:tblBorders>
+      </w:tblPr>
+      <w:tblGrid>
+        <w:gridCol w:w="3200"/>
+        <w:gridCol w:w="6160"/>
+      </w:tblGrid>
+      <w:tr>
+        <w:trPr>
+          <w:tblHeader/>
+        </w:trPr>
+        <w:tc>
+          <w:tcPr>
+            <w:tcW w:type="dxa" w:w="3200"/>
+            <w:shd w:fill="1F4E79" w:color="auto" w:val="clear"/>
+            <w:tcMar>
+              <w:top w:type="dxa" w:w="60"/>
+              <w:left w:type="dxa" w:w="80"/>
+              <w:bottom w:type="dxa" w:w="60"/>
+              <w:right w:type="dxa" w:w="80"/>
+            </w:tcMar>
+          </w:tcPr>
+          <w:p>
+            <w:pPr>
+              <w:spacing w:after="40"/>
+            </w:pPr>
+            <w:r>
+              <w:rPr>
+                <w:b/>
+                <w:bCs/>
+                <w:color w:val="FFFFFF"/>
+              </w:rPr>
+              <w:t xml:space="preserve">Parámetro del experimento</w:t>
+            </w:r>
+          </w:p>
+        </w:tc>
+        <w:tc>
+          <w:tcPr>
+            <w:tcW w:type="dxa" w:w="6160"/>
+            <w:shd w:fill="1F4E79" w:color="auto" w:val="clear"/>
+            <w:tcMar>
+              <w:top w:type="dxa" w:w="60"/>
+              <w:left w:type="dxa" w:w="80"/>
+              <w:bottom w:type="dxa" w:w="60"/>
+              <w:right w:type="dxa" w:w="80"/>
+            </w:tcMar>
+          </w:tcPr>
+          <w:p>
+            <w:pPr>
+              <w:spacing w:after="40"/>
+            </w:pPr>
+            <w:r>
+              <w:rPr>
+                <w:b/>
+                <w:bCs/>
+                <w:color w:val="FFFFFF"/>
+              </w:rPr>
+              <w:t xml:space="preserve">Valor</w:t>
+            </w:r>
+          </w:p>
+        </w:tc>
+      </w:tr>
+      <w:tr>
+        <w:tc>
+          <w:tcPr>
+            <w:tcW w:type="dxa" w:w="3200"/>
+            <w:tcMar>
+              <w:top w:type="dxa" w:w="60"/>
+              <w:left w:type="dxa" w:w="80"/>
+              <w:bottom w:type="dxa" w:w="60"/>
+              <w:right w:type="dxa" w:w="80"/>
+            </w:tcMar>
+          </w:tcPr>
+          <w:p>
+            <w:pPr>
+              <w:spacing w:after="40"/>
+            </w:pPr>
+            <w:r>
+              <w:rPr>
+                <w:rFonts w:ascii="Consolas" w:cs="Consolas" w:eastAsia="Consolas" w:hAnsi="Consolas"/>
+                <w:b w:val="false"/>
+                <w:bCs w:val="false"/>
+                <w:sz w:val="19"/>
+                <w:szCs w:val="19"/>
+              </w:rPr>
+              <w:t xml:space="preserve">Ruido relativo (RUIDO_RELATIVO)</w:t>
+            </w:r>
+          </w:p>
+        </w:tc>
+        <w:tc>
+          <w:tcPr>
+            <w:tcW w:type="dxa" w:w="6160"/>
+            <w:tcMar>
+              <w:top w:type="dxa" w:w="60"/>
+              <w:left w:type="dxa" w:w="80"/>
+              <w:bottom w:type="dxa" w:w="60"/>
+              <w:right w:type="dxa" w:w="80"/>
+            </w:tcMar>
+          </w:tcPr>
+          <w:p>
+            <w:pPr>
+              <w:spacing w:after="40"/>
+            </w:pPr>
+            <w:r>
+              <w:rPr>
+                <w:b w:val="false"/>
+                <w:bCs w:val="false"/>
+              </w:rPr>
+              <w:t xml:space="preserve">5% (desviación estándar gaussiana proporcional a cada punto)</w:t>
+            </w:r>
+          </w:p>
+        </w:tc>
+      </w:tr>
+      <w:tr>
+        <w:tc>
+          <w:tcPr>
+            <w:tcW w:type="dxa" w:w="3200"/>
+            <w:shd w:fill="F7F7F7" w:color="auto" w:val="clear"/>
+            <w:tcMar>
+              <w:top w:type="dxa" w:w="60"/>
+              <w:left w:type="dxa" w:w="80"/>
+              <w:bottom w:type="dxa" w:w="60"/>
+              <w:right w:type="dxa" w:w="80"/>
+            </w:tcMar>
+          </w:tcPr>
+          <w:p>
+            <w:pPr>
+              <w:spacing w:after="40"/>
+            </w:pPr>
+            <w:r>
+              <w:rPr>
+                <w:rFonts w:ascii="Consolas" w:cs="Consolas" w:eastAsia="Consolas" w:hAnsi="Consolas"/>
+                <w:b w:val="false"/>
+                <w:bCs w:val="false"/>
+                <w:sz w:val="19"/>
+                <w:szCs w:val="19"/>
+              </w:rPr>
+              <w:t xml:space="preserve">Semilla aleatoria (SEMILLA_ALEATORIA)</w:t>
+            </w:r>
+          </w:p>
+        </w:tc>
+        <w:tc>
+          <w:tcPr>
+            <w:tcW w:type="dxa" w:w="6160"/>
+            <w:shd w:fill="F7F7F7" w:color="auto" w:val="clear"/>
+            <w:tcMar>
+              <w:top w:type="dxa" w:w="60"/>
+              <w:left w:type="dxa" w:w="80"/>
+              <w:bottom w:type="dxa" w:w="60"/>
+              <w:right w:type="dxa" w:w="80"/>
+            </w:tcMar>
+          </w:tcPr>
+          <w:p>
+            <w:pPr>
+              <w:spacing w:after="40"/>
+            </w:pPr>
+            <w:r>
+              <w:rPr>
+                <w:b w:val="false"/>
+                <w:bCs w:val="false"/>
+              </w:rPr>
+              <w:t xml:space="preserve">42 (fija, para resultados reproducibles)</w:t>
+            </w:r>
+          </w:p>
+        </w:tc>
+      </w:tr>
+      <w:tr>
+        <w:tc>
+          <w:tcPr>
+            <w:tcW w:type="dxa" w:w="3200"/>
+            <w:tcMar>
+              <w:top w:type="dxa" w:w="60"/>
+              <w:left w:type="dxa" w:w="80"/>
+              <w:bottom w:type="dxa" w:w="60"/>
+              <w:right w:type="dxa" w:w="80"/>
+            </w:tcMar>
+          </w:tcPr>
+          <w:p>
+            <w:pPr>
+              <w:spacing w:after="40"/>
+            </w:pPr>
+            <w:r>
+              <w:rPr>
+                <w:rFonts w:ascii="Consolas" w:cs="Consolas" w:eastAsia="Consolas" w:hAnsi="Consolas"/>
+                <w:b w:val="false"/>
+                <w:bCs w:val="false"/>
+                <w:sz w:val="19"/>
+                <w:szCs w:val="19"/>
+              </w:rPr>
+              <w:t xml:space="preserve">Puntos de muestreo (n)</w:t>
+            </w:r>
+          </w:p>
+        </w:tc>
+        <w:tc>
+          <w:tcPr>
+            <w:tcW w:type="dxa" w:w="6160"/>
+            <w:tcMar>
+              <w:top w:type="dxa" w:w="60"/>
+              <w:left w:type="dxa" w:w="80"/>
+              <w:bottom w:type="dxa" w:w="60"/>
+              <w:right w:type="dxa" w:w="80"/>
+            </w:tcMar>
+          </w:tcPr>
+          <w:p>
+            <w:pPr>
+              <w:spacing w:after="40"/>
+            </w:pPr>
+            <w:r>
+              <w:rPr>
+                <w:b w:val="false"/>
+                <w:bCs w:val="false"/>
+              </w:rPr>
+              <w:t xml:space="preserve">80</w:t>
+            </w:r>
+          </w:p>
+        </w:tc>
+      </w:tr>
+    </w:tbl>
+    <w:p>
+      <w:pPr>
+        <w:pStyle w:val="Heading2"/>
+        <w:spacing w:after="110" w:before="220"/>
+      </w:pPr>
+      <w:r>
+        <w:t xml:space="preserve">3.3 Resultados — throughput T(x)</w:t>
+      </w:r>
+    </w:p>
+    <w:tbl>
+      <w:tblPr>
+        <w:tblW w:type="dxa" w:w="9360"/>
+        <w:tblBorders>
+          <w:top w:val="single" w:color="auto" w:sz="4"/>
+          <w:left w:val="single" w:color="auto" w:sz="4"/>
+          <w:bottom w:val="single" w:color="auto" w:sz="4"/>
+          <w:right w:val="single" w:color="auto" w:sz="4"/>
+          <w:insideH w:val="single" w:color="auto" w:sz="4"/>
+          <w:insideV w:val="single" w:color="auto" w:sz="4"/>
+        </w:tblBorders>
+      </w:tblPr>
+      <w:tblGrid>
+        <w:gridCol w:w="2800"/>
+        <w:gridCol w:w="3000"/>
+        <w:gridCol w:w="3560"/>
+      </w:tblGrid>
+      <w:tr>
+        <w:trPr>
+          <w:tblHeader/>
+        </w:trPr>
+        <w:tc>
+          <w:tcPr>
+            <w:tcW w:type="dxa" w:w="2800"/>
+            <w:shd w:fill="1F4E79" w:color="auto" w:val="clear"/>
+            <w:tcMar>
+              <w:top w:type="dxa" w:w="60"/>
+              <w:left w:type="dxa" w:w="80"/>
+              <w:bottom w:type="dxa" w:w="60"/>
+              <w:right w:type="dxa" w:w="80"/>
+            </w:tcMar>
+          </w:tcPr>
+          <w:p>
+            <w:pPr>
+              <w:spacing w:after="40"/>
+            </w:pPr>
+            <w:r>
+              <w:rPr>
+                <w:b/>
+                <w:bCs/>
+                <w:color w:val="FFFFFF"/>
+              </w:rPr>
+              <w:t xml:space="preserve">Parámetro</w:t>
+            </w:r>
+          </w:p>
+        </w:tc>
+        <w:tc>
+          <w:tcPr>
+            <w:tcW w:type="dxa" w:w="3000"/>
+            <w:shd w:fill="1F4E79" w:color="auto" w:val="clear"/>
+            <w:tcMar>
+              <w:top w:type="dxa" w:w="60"/>
+              <w:left w:type="dxa" w:w="80"/>
+              <w:bottom w:type="dxa" w:w="60"/>
+              <w:right w:type="dxa" w:w="80"/>
+            </w:tcMar>
+          </w:tcPr>
+          <w:p>
+            <w:pPr>
+              <w:spacing w:after="40"/>
+            </w:pPr>
+            <w:r>
+              <w:rPr>
+                <w:b/>
+                <w:bCs/>
+                <w:color w:val="FFFFFF"/>
+              </w:rPr>
+              <w:t xml:space="preserve">Valor base (simulation.py)</w:t>
+            </w:r>
+          </w:p>
+        </w:tc>
+        <w:tc>
+          <w:tcPr>
+            <w:tcW w:type="dxa" w:w="3560"/>
+            <w:shd w:fill="1F4E79" w:color="auto" w:val="clear"/>
+            <w:tcMar>
+              <w:top w:type="dxa" w:w="60"/>
+              <w:left w:type="dxa" w:w="80"/>
+              <w:bottom w:type="dxa" w:w="60"/>
+              <w:right w:type="dxa" w:w="80"/>
+            </w:tcMar>
+          </w:tcPr>
+          <w:p>
+            <w:pPr>
+              <w:spacing w:after="40"/>
+            </w:pPr>
+            <w:r>
+              <w:rPr>
+                <w:b/>
+                <w:bCs/>
+                <w:color w:val="FFFFFF"/>
+              </w:rPr>
+              <w:t xml:space="preserve">Valor calibrado (curve_fit)</w:t>
+            </w:r>
+          </w:p>
+        </w:tc>
+      </w:tr>
+      <w:tr>
+        <w:tc>
+          <w:tcPr>
+            <w:tcW w:type="dxa" w:w="2800"/>
+            <w:tcMar>
+              <w:top w:type="dxa" w:w="60"/>
+              <w:left w:type="dxa" w:w="80"/>
+              <w:bottom w:type="dxa" w:w="60"/>
+              <w:right w:type="dxa" w:w="80"/>
+            </w:tcMar>
+          </w:tcPr>
+          <w:p>
+            <w:pPr>
+              <w:spacing w:after="40"/>
+            </w:pPr>
+            <w:r>
+              <w:rPr>
+                <w:b w:val="false"/>
+                <w:bCs w:val="false"/>
+              </w:rPr>
+              <w:t xml:space="preserve">T_max</w:t>
+            </w:r>
+          </w:p>
+        </w:tc>
+        <w:tc>
+          <w:tcPr>
+            <w:tcW w:type="dxa" w:w="3000"/>
+            <w:tcMar>
+              <w:top w:type="dxa" w:w="60"/>
+              <w:left w:type="dxa" w:w="80"/>
+              <w:bottom w:type="dxa" w:w="60"/>
+              <w:right w:type="dxa" w:w="80"/>
+            </w:tcMar>
+          </w:tcPr>
+          <w:p>
+            <w:pPr>
+              <w:spacing w:after="40"/>
+            </w:pPr>
+            <w:r>
+              <w:rPr>
+                <w:b w:val="false"/>
+                <w:bCs w:val="false"/>
+              </w:rPr>
+              <w:t xml:space="preserve">480.0 sol/seg</w:t>
+            </w:r>
+          </w:p>
+        </w:tc>
+        <w:tc>
+          <w:tcPr>
+            <w:tcW w:type="dxa" w:w="3560"/>
+            <w:tcMar>
+              <w:top w:type="dxa" w:w="60"/>
+              <w:left w:type="dxa" w:w="80"/>
+              <w:bottom w:type="dxa" w:w="60"/>
+              <w:right w:type="dxa" w:w="80"/>
+            </w:tcMar>
+          </w:tcPr>
+          <w:p>
+            <w:pPr>
+              <w:spacing w:after="40"/>
+            </w:pPr>
+            <w:r>
+              <w:rPr>
+                <w:b w:val="false"/>
+                <w:bCs w:val="false"/>
+              </w:rPr>
+              <w:t xml:space="preserve">477.97 sol/seg</w:t>
+            </w:r>
+          </w:p>
+        </w:tc>
+      </w:tr>
+      <w:tr>
+        <w:tc>
+          <w:tcPr>
+            <w:tcW w:type="dxa" w:w="2800"/>
+            <w:shd w:fill="F7F7F7" w:color="auto" w:val="clear"/>
+            <w:tcMar>
+              <w:top w:type="dxa" w:w="60"/>
+              <w:left w:type="dxa" w:w="80"/>
+              <w:bottom w:type="dxa" w:w="60"/>
+              <w:right w:type="dxa" w:w="80"/>
+            </w:tcMar>
+          </w:tcPr>
+          <w:p>
+            <w:pPr>
+              <w:spacing w:after="40"/>
+            </w:pPr>
+            <w:r>
+              <w:rPr>
+                <w:b w:val="false"/>
+                <w:bCs w:val="false"/>
+              </w:rPr>
+              <w:t xml:space="preserve">k</w:t>
+            </w:r>
+          </w:p>
+        </w:tc>
+        <w:tc>
+          <w:tcPr>
+            <w:tcW w:type="dxa" w:w="3000"/>
+            <w:shd w:fill="F7F7F7" w:color="auto" w:val="clear"/>
+            <w:tcMar>
+              <w:top w:type="dxa" w:w="60"/>
+              <w:left w:type="dxa" w:w="80"/>
+              <w:bottom w:type="dxa" w:w="60"/>
+              <w:right w:type="dxa" w:w="80"/>
+            </w:tcMar>
+          </w:tcPr>
+          <w:p>
+            <w:pPr>
+              <w:spacing w:after="40"/>
+            </w:pPr>
+            <w:r>
+              <w:rPr>
+                <w:b w:val="false"/>
+                <w:bCs w:val="false"/>
+              </w:rPr>
+              <w:t xml:space="preserve">0.03</w:t>
+            </w:r>
+          </w:p>
+        </w:tc>
+        <w:tc>
+          <w:tcPr>
+            <w:tcW w:type="dxa" w:w="3560"/>
+            <w:shd w:fill="F7F7F7" w:color="auto" w:val="clear"/>
+            <w:tcMar>
+              <w:top w:type="dxa" w:w="60"/>
+              <w:left w:type="dxa" w:w="80"/>
+              <w:bottom w:type="dxa" w:w="60"/>
+              <w:right w:type="dxa" w:w="80"/>
+            </w:tcMar>
+          </w:tcPr>
+          <w:p>
+            <w:pPr>
+              <w:spacing w:after="40"/>
+            </w:pPr>
+            <w:r>
+              <w:rPr>
+                <w:b w:val="false"/>
+                <w:bCs w:val="false"/>
+              </w:rPr>
+              <w:t xml:space="preserve">0.03044</w:t>
+            </w:r>
+          </w:p>
+        </w:tc>
+      </w:tr>
+      <w:tr>
+        <w:tc>
+          <w:tcPr>
+            <w:tcW w:type="dxa" w:w="2800"/>
+            <w:tcMar>
+              <w:top w:type="dxa" w:w="60"/>
+              <w:left w:type="dxa" w:w="80"/>
+              <w:bottom w:type="dxa" w:w="60"/>
+              <w:right w:type="dxa" w:w="80"/>
+            </w:tcMar>
+          </w:tcPr>
+          <w:p>
+            <w:pPr>
+              <w:spacing w:after="40"/>
+            </w:pPr>
+            <w:r>
+              <w:rPr>
+                <w:b w:val="false"/>
+                <w:bCs w:val="false"/>
+              </w:rPr>
+              <w:t xml:space="preserve">x0</w:t>
+            </w:r>
+          </w:p>
+        </w:tc>
+        <w:tc>
+          <w:tcPr>
+            <w:tcW w:type="dxa" w:w="3000"/>
+            <w:tcMar>
+              <w:top w:type="dxa" w:w="60"/>
+              <w:left w:type="dxa" w:w="80"/>
+              <w:bottom w:type="dxa" w:w="60"/>
+              <w:right w:type="dxa" w:w="80"/>
+            </w:tcMar>
+          </w:tcPr>
+          <w:p>
+            <w:pPr>
+              <w:spacing w:after="40"/>
+            </w:pPr>
+            <w:r>
+              <w:rPr>
+                <w:b w:val="false"/>
+                <w:bCs w:val="false"/>
+              </w:rPr>
+              <w:t xml:space="preserve">250 usuarios</w:t>
+            </w:r>
+          </w:p>
+        </w:tc>
+        <w:tc>
+          <w:tcPr>
+            <w:tcW w:type="dxa" w:w="3560"/>
+            <w:tcMar>
+              <w:top w:type="dxa" w:w="60"/>
+              <w:left w:type="dxa" w:w="80"/>
+              <w:bottom w:type="dxa" w:w="60"/>
+              <w:right w:type="dxa" w:w="80"/>
+            </w:tcMar>
+          </w:tcPr>
+          <w:p>
+            <w:pPr>
+              <w:spacing w:after="40"/>
+            </w:pPr>
+            <w:r>
+              <w:rPr>
+                <w:b w:val="false"/>
+                <w:bCs w:val="false"/>
+              </w:rPr>
+              <w:t xml:space="preserve">249.01 usuarios</w:t>
+            </w:r>
+          </w:p>
+        </w:tc>
+      </w:tr>
+    </w:tbl>
+    <w:p>
+      <w:pPr>
+        <w:spacing w:after="120"/>
+      </w:pPr>
+      <w:r>
+        <w:t xml:space="preserve">R² del ajuste: 0.9967 — el modelo logístico explica el 99.67% de la variabilidad de las observaciones sintéticas.</w:t>
+      </w:r>
+    </w:p>
+    <w:p>
+      <w:pPr>
+        <w:spacing w:after="40" w:before="100"/>
+        <w:jc w:val="center"/>
+      </w:pPr>
+      <w:r>
+        <w:drawing>
+          <wp:inline distT="0" distB="0" distL="0" distR="0">
+            <wp:extent cx="4572000" cy="2933700"/>
+            <wp:effectExtent t="0" r="0" b="0" l="0"/>
+            <wp:docPr id="1" name="" descr="" title=""/>
+            <wp:cNvGraphicFramePr>
+              <a:graphicFrameLocks xmlns:a="http://schemas.openxmlformats.org/drawingml/2006/main" noChangeAspect="1"/>
+            </wp:cNvGraphicFramePr>
+            <a:graphic xmlns:a="http://schemas.openxmlformats.org/drawingml/2006/main">
+              <a:graphicData uri="http://schemas.openxmlformats.org/drawingml/2006/picture">
+                <pic:pic xmlns:pic="http://schemas.openxmlformats.org/drawingml/2006/picture">
+                  <pic:nvPicPr>
+                    <pic:cNvPr id="0" name="" descr=""/>
+                    <pic:cNvPicPr>
+                      <a:picLocks noChangeAspect="1" noChangeArrowheads="1"/>
+                    </pic:cNvPicPr>
+                  </pic:nvPicPr>
+                  <pic:blipFill>
+                    <a:blip r:embed="rId7" cstate="none"/>
+                    <a:srcRect/>
+                    <a:stretch>
+                      <a:fillRect/>
+                    </a:stretch>
+                  </pic:blipFill>
+                  <pic:spPr bwMode="auto">
+                    <a:xfrm>
+                      <a:off x="0" y="0"/>
+                      <a:ext cx="4572000" cy="2933700"/>
+                    </a:xfrm>
+                    <a:prstGeom prst="rect">
+                      <a:avLst/>
+                    </a:prstGeom>
+                  </pic:spPr>
+                </pic:pic>
+              </a:graphicData>
+            </a:graphic>
+          </wp:inline>
+        </w:drawing>
+      </w:r>
+    </w:p>
+    <w:p>
+      <w:pPr>
+        <w:spacing w:after="160"/>
+        <w:jc w:val="center"/>
+      </w:pPr>
+      <w:r>
+        <w:rPr>
+          <w:i/>
+          <w:iCs/>
+          <w:sz w:val="18"/>
+          <w:szCs w:val="18"/>
+        </w:rPr>
+        <w:t xml:space="preserve">Figura 1. Observaciones sintéticas (con ruido del 5%) vs. curva logística calibrada de T(x).</w:t>
+      </w:r>
+    </w:p>
+    <w:p>
+      <w:pPr>
+        <w:pStyle w:val="Heading2"/>
+        <w:spacing w:after="110" w:before="220"/>
+      </w:pPr>
+      <w:r>
+        <w:t xml:space="preserve">3.4 Resultados — latencia L(x)</w:t>
+      </w:r>
+    </w:p>
+    <w:tbl>
+      <w:tblPr>
+        <w:tblW w:type="dxa" w:w="9360"/>
+        <w:tblBorders>
+          <w:top w:val="single" w:color="auto" w:sz="4"/>
+          <w:left w:val="single" w:color="auto" w:sz="4"/>
+          <w:bottom w:val="single" w:color="auto" w:sz="4"/>
+          <w:right w:val="single" w:color="auto" w:sz="4"/>
+          <w:insideH w:val="single" w:color="auto" w:sz="4"/>
+          <w:insideV w:val="single" w:color="auto" w:sz="4"/>
+        </w:tblBorders>
+      </w:tblPr>
+      <w:tblGrid>
+        <w:gridCol w:w="2800"/>
+        <w:gridCol w:w="3000"/>
+        <w:gridCol w:w="3560"/>
+      </w:tblGrid>
+      <w:tr>
+        <w:trPr>
+          <w:tblHeader/>
+        </w:trPr>
+        <w:tc>
+          <w:tcPr>
+            <w:tcW w:type="dxa" w:w="2800"/>
+            <w:shd w:fill="1F4E79" w:color="auto" w:val="clear"/>
+            <w:tcMar>
+              <w:top w:type="dxa" w:w="60"/>
+              <w:left w:type="dxa" w:w="80"/>
+              <w:bottom w:type="dxa" w:w="60"/>
+              <w:right w:type="dxa" w:w="80"/>
+            </w:tcMar>
+          </w:tcPr>
+          <w:p>
+            <w:pPr>
+              <w:spacing w:after="40"/>
+            </w:pPr>
+            <w:r>
+              <w:rPr>
+                <w:b/>
+                <w:bCs/>
+                <w:color w:val="FFFFFF"/>
+              </w:rPr>
+              <w:t xml:space="preserve">Parámetro</w:t>
+            </w:r>
+          </w:p>
+        </w:tc>
+        <w:tc>
+          <w:tcPr>
+            <w:tcW w:type="dxa" w:w="3000"/>
+            <w:shd w:fill="1F4E79" w:color="auto" w:val="clear"/>
+            <w:tcMar>
+              <w:top w:type="dxa" w:w="60"/>
+              <w:left w:type="dxa" w:w="80"/>
+              <w:bottom w:type="dxa" w:w="60"/>
+              <w:right w:type="dxa" w:w="80"/>
+            </w:tcMar>
+          </w:tcPr>
+          <w:p>
+            <w:pPr>
+              <w:spacing w:after="40"/>
+            </w:pPr>
+            <w:r>
+              <w:rPr>
+                <w:b/>
+                <w:bCs/>
+                <w:color w:val="FFFFFF"/>
+              </w:rPr>
+              <w:t xml:space="preserve">Valor base (simulation.py)</w:t>
+            </w:r>
+          </w:p>
+        </w:tc>
+        <w:tc>
+          <w:tcPr>
+            <w:tcW w:type="dxa" w:w="3560"/>
+            <w:shd w:fill="1F4E79" w:color="auto" w:val="clear"/>
+            <w:tcMar>
+              <w:top w:type="dxa" w:w="60"/>
+              <w:left w:type="dxa" w:w="80"/>
+              <w:bottom w:type="dxa" w:w="60"/>
+              <w:right w:type="dxa" w:w="80"/>
+            </w:tcMar>
+          </w:tcPr>
+          <w:p>
+            <w:pPr>
+              <w:spacing w:after="40"/>
+            </w:pPr>
+            <w:r>
+              <w:rPr>
+                <w:b/>
+                <w:bCs/>
+                <w:color w:val="FFFFFF"/>
+              </w:rPr>
+              <w:t xml:space="preserve">Valor calibrado (curve_fit)</w:t>
+            </w:r>
+          </w:p>
+        </w:tc>
+      </w:tr>
+      <w:tr>
+        <w:tc>
+          <w:tcPr>
+            <w:tcW w:type="dxa" w:w="2800"/>
+            <w:tcMar>
+              <w:top w:type="dxa" w:w="60"/>
+              <w:left w:type="dxa" w:w="80"/>
+              <w:bottom w:type="dxa" w:w="60"/>
+              <w:right w:type="dxa" w:w="80"/>
+            </w:tcMar>
+          </w:tcPr>
+          <w:p>
+            <w:pPr>
+              <w:spacing w:after="40"/>
+            </w:pPr>
+            <w:r>
+              <w:rPr>
+                <w:b w:val="false"/>
+                <w:bCs w:val="false"/>
+              </w:rPr>
+              <w:t xml:space="preserve">a</w:t>
+            </w:r>
+          </w:p>
+        </w:tc>
+        <w:tc>
+          <w:tcPr>
+            <w:tcW w:type="dxa" w:w="3000"/>
+            <w:tcMar>
+              <w:top w:type="dxa" w:w="60"/>
+              <w:left w:type="dxa" w:w="80"/>
+              <w:bottom w:type="dxa" w:w="60"/>
+              <w:right w:type="dxa" w:w="80"/>
+            </w:tcMar>
+          </w:tcPr>
+          <w:p>
+            <w:pPr>
+              <w:spacing w:after="40"/>
+            </w:pPr>
+            <w:r>
+              <w:rPr>
+                <w:b w:val="false"/>
+                <w:bCs w:val="false"/>
+              </w:rPr>
+              <w:t xml:space="preserve">8.0 ms</w:t>
+            </w:r>
+          </w:p>
+        </w:tc>
+        <w:tc>
+          <w:tcPr>
+            <w:tcW w:type="dxa" w:w="3560"/>
+            <w:tcMar>
+              <w:top w:type="dxa" w:w="60"/>
+              <w:left w:type="dxa" w:w="80"/>
+              <w:bottom w:type="dxa" w:w="60"/>
+              <w:right w:type="dxa" w:w="80"/>
+            </w:tcMar>
+          </w:tcPr>
+          <w:p>
+            <w:pPr>
+              <w:spacing w:after="40"/>
+            </w:pPr>
+            <w:r>
+              <w:rPr>
+                <w:b w:val="false"/>
+                <w:bCs w:val="false"/>
+              </w:rPr>
+              <w:t xml:space="preserve">7.782 ms</w:t>
+            </w:r>
+          </w:p>
+        </w:tc>
+      </w:tr>
+      <w:tr>
+        <w:tc>
+          <w:tcPr>
+            <w:tcW w:type="dxa" w:w="2800"/>
+            <w:shd w:fill="F7F7F7" w:color="auto" w:val="clear"/>
+            <w:tcMar>
+              <w:top w:type="dxa" w:w="60"/>
+              <w:left w:type="dxa" w:w="80"/>
+              <w:bottom w:type="dxa" w:w="60"/>
+              <w:right w:type="dxa" w:w="80"/>
+            </w:tcMar>
+          </w:tcPr>
+          <w:p>
+            <w:pPr>
+              <w:spacing w:after="40"/>
+            </w:pPr>
+            <w:r>
+              <w:rPr>
+                <w:b w:val="false"/>
+                <w:bCs w:val="false"/>
+              </w:rPr>
+              <w:t xml:space="preserve">b</w:t>
+            </w:r>
+          </w:p>
+        </w:tc>
+        <w:tc>
+          <w:tcPr>
+            <w:tcW w:type="dxa" w:w="3000"/>
+            <w:shd w:fill="F7F7F7" w:color="auto" w:val="clear"/>
+            <w:tcMar>
+              <w:top w:type="dxa" w:w="60"/>
+              <w:left w:type="dxa" w:w="80"/>
+              <w:bottom w:type="dxa" w:w="60"/>
+              <w:right w:type="dxa" w:w="80"/>
+            </w:tcMar>
+          </w:tcPr>
+          <w:p>
+            <w:pPr>
+              <w:spacing w:after="40"/>
+            </w:pPr>
+            <w:r>
+              <w:rPr>
+                <w:b w:val="false"/>
+                <w:bCs w:val="false"/>
+              </w:rPr>
+              <w:t xml:space="preserve">0.012</w:t>
+            </w:r>
+          </w:p>
+        </w:tc>
+        <w:tc>
+          <w:tcPr>
+            <w:tcW w:type="dxa" w:w="3560"/>
+            <w:shd w:fill="F7F7F7" w:color="auto" w:val="clear"/>
+            <w:tcMar>
+              <w:top w:type="dxa" w:w="60"/>
+              <w:left w:type="dxa" w:w="80"/>
+              <w:bottom w:type="dxa" w:w="60"/>
+              <w:right w:type="dxa" w:w="80"/>
+            </w:tcMar>
+          </w:tcPr>
+          <w:p>
+            <w:pPr>
+              <w:spacing w:after="40"/>
+            </w:pPr>
+            <w:r>
+              <w:rPr>
+                <w:b w:val="false"/>
+                <w:bCs w:val="false"/>
+              </w:rPr>
+              <w:t xml:space="preserve">0.01206</w:t>
+            </w:r>
+          </w:p>
+        </w:tc>
+      </w:tr>
+    </w:tbl>
+    <w:p>
+      <w:pPr>
+        <w:spacing w:after="120"/>
+      </w:pPr>
+      <w:r>
+        <w:t xml:space="preserve">R² del ajuste: 0.9985 — el modelo exponencial explica el 99.85% de la variabilidad de las observaciones sintéticas.</w:t>
+      </w:r>
+    </w:p>
+    <w:p>
+      <w:pPr>
+        <w:spacing w:after="40" w:before="100"/>
+        <w:jc w:val="center"/>
+      </w:pPr>
+      <w:r>
+        <w:drawing>
+          <wp:inline distT="0" distB="0" distL="0" distR="0">
+            <wp:extent cx="4572000" cy="2933700"/>
+            <wp:effectExtent t="0" r="0" b="0" l="0"/>
+            <wp:docPr id="1" name="" descr="" title=""/>
+            <wp:cNvGraphicFramePr>
+              <a:graphicFrameLocks xmlns:a="http://schemas.openxmlformats.org/drawingml/2006/main" noChangeAspect="1"/>
+            </wp:cNvGraphicFramePr>
+            <a:graphic xmlns:a="http://schemas.openxmlformats.org/drawingml/2006/main">
+              <a:graphicData uri="http://schemas.openxmlformats.org/drawingml/2006/picture">
+                <pic:pic xmlns:pic="http://schemas.openxmlformats.org/drawingml/2006/picture">
+                  <pic:nvPicPr>
+                    <pic:cNvPr id="0" name="" descr=""/>
+                    <pic:cNvPicPr>
+                      <a:picLocks noChangeAspect="1" noChangeArrowheads="1"/>
+                    </pic:cNvPicPr>
+                  </pic:nvPicPr>
+                  <pic:blipFill>
+                    <a:blip r:embed="rId8" cstate="none"/>
+                    <a:srcRect/>
+                    <a:stretch>
+                      <a:fillRect/>
+                    </a:stretch>
+                  </pic:blipFill>
+                  <pic:spPr bwMode="auto">
+                    <a:xfrm>
+                      <a:off x="0" y="0"/>
+                      <a:ext cx="4572000" cy="2933700"/>
+                    </a:xfrm>
+                    <a:prstGeom prst="rect">
+                      <a:avLst/>
+                    </a:prstGeom>
+                  </pic:spPr>
+                </pic:pic>
+              </a:graphicData>
+            </a:graphic>
+          </wp:inline>
+        </w:drawing>
+      </w:r>
+    </w:p>
+    <w:p>
+      <w:pPr>
+        <w:spacing w:after="160"/>
+        <w:jc w:val="center"/>
+      </w:pPr>
+      <w:r>
+        <w:rPr>
+          <w:i/>
+          <w:iCs/>
+          <w:sz w:val="18"/>
+          <w:szCs w:val="18"/>
+        </w:rPr>
+        <w:t xml:space="preserve">Figura 2. Observaciones sintéticas (con ruido del 5%) vs. curva exponencial calibrada de L(x).</w:t>
+      </w:r>
+    </w:p>
+    <w:p>
+      <w:pPr>
+        <w:pStyle w:val="Heading2"/>
+        <w:spacing w:after="110" w:before="220"/>
+      </w:pPr>
+      <w:r>
+        <w:t xml:space="preserve">3.5 Interpretación y validación del comportamiento esperado</w:t>
+      </w:r>
+    </w:p>
+    <w:p>
+      <w:pPr>
+        <w:pStyle w:val="ListParagraph"/>
+        <w:numPr>
+          <w:ilvl w:val="0"/>
+          <w:numId w:val="1"/>
+        </w:numPr>
+        <w:spacing w:after="50"/>
+      </w:pPr>
+      <w:r>
+        <w:t xml:space="preserve">T(x) muestra crecimiento inicial y estabilización cerca de T_max (~480 sol/seg) conforme x aumenta, consistente con la sección 6.3 del informe de Fase I.</w:t>
+      </w:r>
+    </w:p>
+    <w:p>
+      <w:pPr>
+        <w:pStyle w:val="ListParagraph"/>
+        <w:numPr>
+          <w:ilvl w:val="0"/>
+          <w:numId w:val="1"/>
+        </w:numPr>
+        <w:spacing w:after="50"/>
+      </w:pPr>
+      <w:r>
+        <w:t xml:space="preserve">L(x) se mantiene baja en carga ligera y crece de forma acelerada (no lineal) conforme x aumenta, también consistente con el comportamiento esperado.</w:t>
+      </w:r>
+    </w:p>
+    <w:p>
+      <w:pPr>
+        <w:pStyle w:val="ListParagraph"/>
+        <w:numPr>
+          <w:ilvl w:val="0"/>
+          <w:numId w:val="1"/>
+        </w:numPr>
+        <w:spacing w:after="50"/>
+      </w:pPr>
+      <w:r>
+        <w:t xml:space="preserve">Los parámetros calibrados quedan dentro de un 2% de los valores base en todos los casos, con R² &gt; 0.99 en ambos modelos: la metodología de ajuste queda validada.</w:t>
+      </w:r>
+    </w:p>
+    <w:p>
+      <w:pPr>
+        <w:pStyle w:val="Heading2"/>
+        <w:spacing w:after="110" w:before="220"/>
+      </w:pPr>
+      <w:r>
+        <w:t xml:space="preserve">3.6 Nota pendiente — parámetros de E(x)</w:t>
+      </w:r>
+    </w:p>
+    <w:p>
+      <w:pPr>
+        <w:spacing w:after="120"/>
+      </w:pPr>
+      <w:r>
+        <w:t xml:space="preserve">Esta tarea global (TG3), tal como está definida, calibra únicamente T_max, k, x0 (throughput) y a, b (latencia). Los parámetros de E(x) — E_max, x_crit, s — no se calibran por ajuste de curvas porque el informe de Fase I no define una fórmula explícita para la tasa de error (ver nota de diseño en la sección 2.3 de este documento). Quedan como valores justificados por criterio de ingeniería, no por ajuste estadístico; esto debe explicitarse en la Sección 4 del informe final.</w:t>
+      </w:r>
+    </w:p>
+    <w:p>
+      <w:pPr>
+        <w:pStyle w:val="Heading2"/>
+        <w:spacing w:after="110" w:before="220"/>
+      </w:pPr>
+      <w:r>
+        <w:t xml:space="preserve">3.7 Pruebas automatizadas — tests/test_calibration.py</w:t>
+      </w:r>
+    </w:p>
+    <w:tbl>
+      <w:tblPr>
+        <w:tblW w:type="dxa" w:w="9360"/>
+        <w:tblBorders>
+          <w:top w:val="single" w:color="auto" w:sz="4"/>
+          <w:left w:val="single" w:color="auto" w:sz="4"/>
+          <w:bottom w:val="single" w:color="auto" w:sz="4"/>
+          <w:right w:val="single" w:color="auto" w:sz="4"/>
+          <w:insideH w:val="single" w:color="auto" w:sz="4"/>
+          <w:insideV w:val="single" w:color="auto" w:sz="4"/>
+        </w:tblBorders>
+      </w:tblPr>
+      <w:tblGrid>
+        <w:gridCol w:w="4600"/>
+        <w:gridCol w:w="4760"/>
+      </w:tblGrid>
+      <w:tr>
+        <w:trPr>
+          <w:tblHeader/>
+        </w:trPr>
+        <w:tc>
+          <w:tcPr>
+            <w:tcW w:type="dxa" w:w="4600"/>
+            <w:shd w:fill="1F4E79" w:color="auto" w:val="clear"/>
+            <w:tcMar>
+              <w:top w:type="dxa" w:w="60"/>
+              <w:left w:type="dxa" w:w="80"/>
+              <w:bottom w:type="dxa" w:w="60"/>
+              <w:right w:type="dxa" w:w="80"/>
+            </w:tcMar>
+          </w:tcPr>
+          <w:p>
+            <w:pPr>
+              <w:spacing w:after="40"/>
+            </w:pPr>
+            <w:r>
+              <w:rPr>
+                <w:b/>
+                <w:bCs/>
+                <w:color w:val="FFFFFF"/>
+              </w:rPr>
+              <w:t xml:space="preserve">Prueba</w:t>
+            </w:r>
+          </w:p>
+        </w:tc>
+        <w:tc>
+          <w:tcPr>
+            <w:tcW w:type="dxa" w:w="4760"/>
+            <w:shd w:fill="1F4E79" w:color="auto" w:val="clear"/>
+            <w:tcMar>
+              <w:top w:type="dxa" w:w="60"/>
+              <w:left w:type="dxa" w:w="80"/>
+              <w:bottom w:type="dxa" w:w="60"/>
+              <w:right w:type="dxa" w:w="80"/>
+            </w:tcMar>
+          </w:tcPr>
+          <w:p>
+            <w:pPr>
+              <w:spacing w:after="40"/>
+            </w:pPr>
+            <w:r>
+              <w:rPr>
+                <w:b/>
+                <w:bCs/>
+                <w:color w:val="FFFFFF"/>
+              </w:rPr>
+              <w:t xml:space="preserve">Qué verifica</w:t>
+            </w:r>
+          </w:p>
+        </w:tc>
+      </w:tr>
+      <w:tr>
+        <w:tc>
+          <w:tcPr>
+            <w:tcW w:type="dxa" w:w="4600"/>
+            <w:tcMar>
+              <w:top w:type="dxa" w:w="60"/>
+              <w:left w:type="dxa" w:w="80"/>
+              <w:bottom w:type="dxa" w:w="60"/>
+              <w:right w:type="dxa" w:w="80"/>
+            </w:tcMar>
+          </w:tcPr>
+          <w:p>
+            <w:pPr>
+              <w:spacing w:after="40"/>
+            </w:pPr>
+            <w:r>
+              <w:rPr>
+                <w:b w:val="false"/>
+                <w:bCs w:val="false"/>
+              </w:rPr>
+              <w:t xml:space="preserve">test_calibracion_throughput_recupera_parametros_base</w:t>
+            </w:r>
+          </w:p>
+        </w:tc>
+        <w:tc>
+          <w:tcPr>
+            <w:tcW w:type="dxa" w:w="4760"/>
+            <w:tcMar>
+              <w:top w:type="dxa" w:w="60"/>
+              <w:left w:type="dxa" w:w="80"/>
+              <w:bottom w:type="dxa" w:w="60"/>
+              <w:right w:type="dxa" w:w="80"/>
+            </w:tcMar>
+          </w:tcPr>
+          <w:p>
+            <w:pPr>
+              <w:spacing w:after="40"/>
+            </w:pPr>
+            <w:r>
+              <w:rPr>
+                <w:b w:val="false"/>
+                <w:bCs w:val="false"/>
+              </w:rPr>
+              <w:t xml:space="preserve">T_max y x0 calibrados están a menos del 15% de los valores base.</w:t>
+            </w:r>
+          </w:p>
+        </w:tc>
+      </w:tr>
+      <w:tr>
+        <w:tc>
+          <w:tcPr>
+            <w:tcW w:type="dxa" w:w="4600"/>
+            <w:shd w:fill="F7F7F7" w:color="auto" w:val="clear"/>
+            <w:tcMar>
+              <w:top w:type="dxa" w:w="60"/>
+              <w:left w:type="dxa" w:w="80"/>
+              <w:bottom w:type="dxa" w:w="60"/>
+              <w:right w:type="dxa" w:w="80"/>
+            </w:tcMar>
+          </w:tcPr>
+          <w:p>
+            <w:pPr>
+              <w:spacing w:after="40"/>
+            </w:pPr>
+            <w:r>
+              <w:rPr>
+                <w:b w:val="false"/>
+                <w:bCs w:val="false"/>
+              </w:rPr>
+              <w:t xml:space="preserve">test_calibracion_throughput_tiene_buen_ajuste</w:t>
+            </w:r>
+          </w:p>
+        </w:tc>
+        <w:tc>
+          <w:tcPr>
+            <w:tcW w:type="dxa" w:w="4760"/>
+            <w:shd w:fill="F7F7F7" w:color="auto" w:val="clear"/>
+            <w:tcMar>
+              <w:top w:type="dxa" w:w="60"/>
+              <w:left w:type="dxa" w:w="80"/>
+              <w:bottom w:type="dxa" w:w="60"/>
+              <w:right w:type="dxa" w:w="80"/>
+            </w:tcMar>
+          </w:tcPr>
+          <w:p>
+            <w:pPr>
+              <w:spacing w:after="40"/>
+            </w:pPr>
+            <w:r>
+              <w:rPr>
+                <w:b w:val="false"/>
+                <w:bCs w:val="false"/>
+              </w:rPr>
+              <w:t xml:space="preserve">R² del ajuste de T(x) es mayor a 0.90.</w:t>
+            </w:r>
+          </w:p>
+        </w:tc>
+      </w:tr>
+      <w:tr>
+        <w:tc>
+          <w:tcPr>
+            <w:tcW w:type="dxa" w:w="4600"/>
+            <w:tcMar>
+              <w:top w:type="dxa" w:w="60"/>
+              <w:left w:type="dxa" w:w="80"/>
+              <w:bottom w:type="dxa" w:w="60"/>
+              <w:right w:type="dxa" w:w="80"/>
+            </w:tcMar>
+          </w:tcPr>
+          <w:p>
+            <w:pPr>
+              <w:spacing w:after="40"/>
+            </w:pPr>
+            <w:r>
+              <w:rPr>
+                <w:b w:val="false"/>
+                <w:bCs w:val="false"/>
+              </w:rPr>
+              <w:t xml:space="preserve">test_calibracion_latencia_recupera_parametros_base</w:t>
+            </w:r>
+          </w:p>
+        </w:tc>
+        <w:tc>
+          <w:tcPr>
+            <w:tcW w:type="dxa" w:w="4760"/>
+            <w:tcMar>
+              <w:top w:type="dxa" w:w="60"/>
+              <w:left w:type="dxa" w:w="80"/>
+              <w:bottom w:type="dxa" w:w="60"/>
+              <w:right w:type="dxa" w:w="80"/>
+            </w:tcMar>
+          </w:tcPr>
+          <w:p>
+            <w:pPr>
+              <w:spacing w:after="40"/>
+            </w:pPr>
+            <w:r>
+              <w:rPr>
+                <w:b w:val="false"/>
+                <w:bCs w:val="false"/>
+              </w:rPr>
+              <w:t xml:space="preserve">a y b calibrados están a menos del 15% de los valores base.</w:t>
+            </w:r>
+          </w:p>
+        </w:tc>
+      </w:tr>
+      <w:tr>
+        <w:tc>
+          <w:tcPr>
+            <w:tcW w:type="dxa" w:w="4600"/>
+            <w:shd w:fill="F7F7F7" w:color="auto" w:val="clear"/>
+            <w:tcMar>
+              <w:top w:type="dxa" w:w="60"/>
+              <w:left w:type="dxa" w:w="80"/>
+              <w:bottom w:type="dxa" w:w="60"/>
+              <w:right w:type="dxa" w:w="80"/>
+            </w:tcMar>
+          </w:tcPr>
+          <w:p>
+            <w:pPr>
+              <w:spacing w:after="40"/>
+            </w:pPr>
+            <w:r>
+              <w:rPr>
+                <w:b w:val="false"/>
+                <w:bCs w:val="false"/>
+              </w:rPr>
+              <w:t xml:space="preserve">test_calibracion_latencia_tiene_buen_ajuste</w:t>
+            </w:r>
+          </w:p>
+        </w:tc>
+        <w:tc>
+          <w:tcPr>
+            <w:tcW w:type="dxa" w:w="4760"/>
+            <w:shd w:fill="F7F7F7" w:color="auto" w:val="clear"/>
+            <w:tcMar>
+              <w:top w:type="dxa" w:w="60"/>
+              <w:left w:type="dxa" w:w="80"/>
+              <w:bottom w:type="dxa" w:w="60"/>
+              <w:right w:type="dxa" w:w="80"/>
+            </w:tcMar>
+          </w:tcPr>
+          <w:p>
+            <w:pPr>
+              <w:spacing w:after="40"/>
+            </w:pPr>
+            <w:r>
+              <w:rPr>
+                <w:b w:val="false"/>
+                <w:bCs w:val="false"/>
+              </w:rPr>
+              <w:t xml:space="preserve">R² del ajuste de L(x) es mayor a 0.90.</w:t>
+            </w:r>
+          </w:p>
+        </w:tc>
+      </w:tr>
+    </w:tbl>
+    <w:p>
+      <w:pPr>
+        <w:spacing w:after="120"/>
+      </w:pPr>
+      <w:r>
+        <w:t xml:space="preserve">Resultado de la ejecución en el entorno de desarrollo: 12 passed (8 de TG2 + 4 de TG3, pytest tests/ -v).</w:t>
+      </w:r>
+    </w:p>
+    <w:p>
+      <w:pPr>
+        <w:pStyle w:val="Heading2"/>
+        <w:spacing w:after="110" w:before="220"/>
+      </w:pPr>
+      <w:r>
+        <w:t xml:space="preserve">3.8 Archivos de esta tarea</w:t>
+      </w:r>
+    </w:p>
+    <w:p>
+      <w:pPr>
+        <w:shd w:fill="F2F2F2" w:color="auto" w:val="clear"/>
+        <w:spacing w:after="120" w:before="60"/>
+        <w:ind w:left="200"/>
+      </w:pPr>
+      <w:r>
+        <w:rPr>
+          <w:rFonts w:ascii="Consolas" w:cs="Consolas" w:eastAsia="Consolas" w:hAnsi="Consolas"/>
+          <w:sz w:val="17"/>
+          <w:szCs w:val="17"/>
+        </w:rPr>
+        <w:t xml:space="preserve">src/calibration.py · tests/test_calibration.py · assets/calibracion_throughput.png · assets/calibracion_latencia.png</w:t>
+      </w:r>
+    </w:p>
+    <w:p>
+      <w:pPr>
+        <w:spacing w:after="120"/>
+      </w:pPr>
+      <w:r>
+        <w:t xml:space="preserve">Commit sugerido: feat: calibrar parámetros de T(x) y L(x) mediante ajuste de curvas (scipy.optimize.curve_fit)</w:t>
+      </w:r>
+    </w:p>
+    <w:p>
+      <w:pPr>
+        <w:pStyle w:val="Heading1"/>
+        <w:spacing w:after="150" w:before="300"/>
+      </w:pPr>
+      <w:r>
         <w:t xml:space="preserve">Próximas secciones</w:t>
       </w:r>
     </w:p>
@@ -2696,7 +4069,7 @@
         <w:spacing w:after="120"/>
       </w:pPr>
       <w:r>
-        <w:t xml:space="preserve">Se agregarán conforme avance el equipo: TG3 (calibración de parámetros), TG4 (cálculo integral numérico), TG5 (visualización), TG6 (exportación de datos), TG7 (interfaz/dashboard), TG8 (pruebas del sistema completo).</w:t>
+        <w:t xml:space="preserve">Se agregarán conforme avance el equipo: TG4 (cálculo integral numérico), TG5 (visualización), TG6 (exportación de datos), TG7 (interfaz/dashboard), TG8 (pruebas del sistema completo).</w:t>
       </w:r>
     </w:p>
     <w:sectPr>

</xml_diff>

<commit_message>
docs: agregar sección de cálculo integral numérico (TG4) con validación y evidencia del equipo
</commit_message>
<xml_diff>
--- a/docs/documentacion_tecnica.docx
+++ b/docs/documentacion_tecnica.docx
@@ -4025,6 +4025,301 @@
     </w:p>
     <w:p>
       <w:pPr>
+        <w:pStyle w:val="Heading3"/>
+        <w:spacing w:after="80" w:before="160"/>
+      </w:pPr>
+      <w:r>
+        <w:t xml:space="preserve">Evidencia de ejecución del equipo</w:t>
+      </w:r>
+    </w:p>
+    <w:p>
+      <w:pPr>
+        <w:spacing w:after="120"/>
+      </w:pPr>
+      <w:r>
+        <w:t xml:space="preserve">Ejecutado por Jose Andrés Ortiz Marín en su máquina local (Windows, Python 3.14.4):</w:t>
+      </w:r>
+    </w:p>
+    <w:p>
+      <w:pPr>
+        <w:shd w:fill="F2F2F2" w:color="auto" w:val="clear"/>
+        <w:spacing w:after="0" w:before="60"/>
+        <w:ind w:left="200"/>
+      </w:pPr>
+      <w:r>
+        <w:rPr>
+          <w:rFonts w:ascii="Consolas" w:cs="Consolas" w:eastAsia="Consolas" w:hAnsi="Consolas"/>
+          <w:sz w:val="17"/>
+          <w:szCs w:val="17"/>
+        </w:rPr>
+        <w:t xml:space="preserve">=========================================== test session starts ===========================================</w:t>
+      </w:r>
+    </w:p>
+    <w:p>
+      <w:pPr>
+        <w:shd w:fill="F2F2F2" w:color="auto" w:val="clear"/>
+        <w:spacing w:after="0" w:before="0"/>
+        <w:ind w:left="200"/>
+      </w:pPr>
+      <w:r>
+        <w:rPr>
+          <w:rFonts w:ascii="Consolas" w:cs="Consolas" w:eastAsia="Consolas" w:hAnsi="Consolas"/>
+          <w:sz w:val="17"/>
+          <w:szCs w:val="17"/>
+        </w:rPr>
+        <w:t xml:space="preserve">platform win32 -- Python 3.14.4, pytest-9.1.1, pluggy-1.6.0</w:t>
+      </w:r>
+    </w:p>
+    <w:p>
+      <w:pPr>
+        <w:shd w:fill="F2F2F2" w:color="auto" w:val="clear"/>
+        <w:spacing w:after="0" w:before="0"/>
+        <w:ind w:left="200"/>
+      </w:pPr>
+      <w:r>
+        <w:rPr>
+          <w:rFonts w:ascii="Consolas" w:cs="Consolas" w:eastAsia="Consolas" w:hAnsi="Consolas"/>
+          <w:sz w:val="17"/>
+          <w:szCs w:val="17"/>
+        </w:rPr>
+        <w:t xml:space="preserve">rootdir: C:\Users\ortiz\OneDrive\Desktop\PruebasEstres</w:t>
+      </w:r>
+    </w:p>
+    <w:p>
+      <w:pPr>
+        <w:shd w:fill="F2F2F2" w:color="auto" w:val="clear"/>
+        <w:spacing w:after="0" w:before="0"/>
+        <w:ind w:left="200"/>
+      </w:pPr>
+      <w:r>
+        <w:rPr>
+          <w:rFonts w:ascii="Consolas" w:cs="Consolas" w:eastAsia="Consolas" w:hAnsi="Consolas"/>
+          <w:sz w:val="17"/>
+          <w:szCs w:val="17"/>
+        </w:rPr>
+        <w:t xml:space="preserve">collected 12 items</w:t>
+      </w:r>
+    </w:p>
+    <w:p>
+      <w:pPr>
+        <w:shd w:fill="F2F2F2" w:color="auto" w:val="clear"/>
+        <w:spacing w:after="0" w:before="0"/>
+        <w:ind w:left="200"/>
+      </w:pPr>
+      <w:r>
+        <w:rPr>
+          <w:rFonts w:ascii="Consolas" w:cs="Consolas" w:eastAsia="Consolas" w:hAnsi="Consolas"/>
+          <w:sz w:val="17"/>
+          <w:szCs w:val="17"/>
+        </w:rPr>
+        <w:t xml:space="preserve"> </w:t>
+      </w:r>
+    </w:p>
+    <w:p>
+      <w:pPr>
+        <w:shd w:fill="F2F2F2" w:color="auto" w:val="clear"/>
+        <w:spacing w:after="0" w:before="0"/>
+        <w:ind w:left="200"/>
+      </w:pPr>
+      <w:r>
+        <w:rPr>
+          <w:rFonts w:ascii="Consolas" w:cs="Consolas" w:eastAsia="Consolas" w:hAnsi="Consolas"/>
+          <w:sz w:val="17"/>
+          <w:szCs w:val="17"/>
+        </w:rPr>
+        <w:t xml:space="preserve">tests\test_calibration.py ....                                                                       [ 33%]</w:t>
+      </w:r>
+    </w:p>
+    <w:p>
+      <w:pPr>
+        <w:shd w:fill="F2F2F2" w:color="auto" w:val="clear"/>
+        <w:spacing w:after="0" w:before="0"/>
+        <w:ind w:left="200"/>
+      </w:pPr>
+      <w:r>
+        <w:rPr>
+          <w:rFonts w:ascii="Consolas" w:cs="Consolas" w:eastAsia="Consolas" w:hAnsi="Consolas"/>
+          <w:sz w:val="17"/>
+          <w:szCs w:val="17"/>
+        </w:rPr>
+        <w:t xml:space="preserve">tests\test_simulation.py ........                                                                    [100%]</w:t>
+      </w:r>
+    </w:p>
+    <w:p>
+      <w:pPr>
+        <w:shd w:fill="F2F2F2" w:color="auto" w:val="clear"/>
+        <w:spacing w:after="0" w:before="0"/>
+        <w:ind w:left="200"/>
+      </w:pPr>
+      <w:r>
+        <w:rPr>
+          <w:rFonts w:ascii="Consolas" w:cs="Consolas" w:eastAsia="Consolas" w:hAnsi="Consolas"/>
+          <w:sz w:val="17"/>
+          <w:szCs w:val="17"/>
+        </w:rPr>
+        <w:t xml:space="preserve"> </w:t>
+      </w:r>
+    </w:p>
+    <w:p>
+      <w:pPr>
+        <w:shd w:fill="F2F2F2" w:color="auto" w:val="clear"/>
+        <w:spacing w:after="120" w:before="0"/>
+        <w:ind w:left="200"/>
+      </w:pPr>
+      <w:r>
+        <w:rPr>
+          <w:rFonts w:ascii="Consolas" w:cs="Consolas" w:eastAsia="Consolas" w:hAnsi="Consolas"/>
+          <w:sz w:val="17"/>
+          <w:szCs w:val="17"/>
+        </w:rPr>
+        <w:t xml:space="preserve">=========================================== 12 passed in 12.43s ===========================================</w:t>
+      </w:r>
+    </w:p>
+    <w:p>
+      <w:pPr>
+        <w:shd w:fill="F2F2F2" w:color="auto" w:val="clear"/>
+        <w:spacing w:after="0" w:before="60"/>
+        <w:ind w:left="200"/>
+      </w:pPr>
+      <w:r>
+        <w:rPr>
+          <w:rFonts w:ascii="Consolas" w:cs="Consolas" w:eastAsia="Consolas" w:hAnsi="Consolas"/>
+          <w:sz w:val="17"/>
+          <w:szCs w:val="17"/>
+        </w:rPr>
+        <w:t xml:space="preserve">=== Calibración de T(x) — throughput ===</w:t>
+      </w:r>
+    </w:p>
+    <w:p>
+      <w:pPr>
+        <w:shd w:fill="F2F2F2" w:color="auto" w:val="clear"/>
+        <w:spacing w:after="0" w:before="0"/>
+        <w:ind w:left="200"/>
+      </w:pPr>
+      <w:r>
+        <w:rPr>
+          <w:rFonts w:ascii="Consolas" w:cs="Consolas" w:eastAsia="Consolas" w:hAnsi="Consolas"/>
+          <w:sz w:val="17"/>
+          <w:szCs w:val="17"/>
+        </w:rPr>
+        <w:t xml:space="preserve">  Valores base (simulation.py): T_max=480.0, k=0.03, x0=250.0</w:t>
+      </w:r>
+    </w:p>
+    <w:p>
+      <w:pPr>
+        <w:shd w:fill="F2F2F2" w:color="auto" w:val="clear"/>
+        <w:spacing w:after="0" w:before="0"/>
+        <w:ind w:left="200"/>
+      </w:pPr>
+      <w:r>
+        <w:rPr>
+          <w:rFonts w:ascii="Consolas" w:cs="Consolas" w:eastAsia="Consolas" w:hAnsi="Consolas"/>
+          <w:sz w:val="17"/>
+          <w:szCs w:val="17"/>
+        </w:rPr>
+        <w:t xml:space="preserve">  Valores ajustados (curve_fit): T_max=477.97, k=0.03044, x0=249.01</w:t>
+      </w:r>
+    </w:p>
+    <w:p>
+      <w:pPr>
+        <w:shd w:fill="F2F2F2" w:color="auto" w:val="clear"/>
+        <w:spacing w:after="0" w:before="0"/>
+        <w:ind w:left="200"/>
+      </w:pPr>
+      <w:r>
+        <w:rPr>
+          <w:rFonts w:ascii="Consolas" w:cs="Consolas" w:eastAsia="Consolas" w:hAnsi="Consolas"/>
+          <w:sz w:val="17"/>
+          <w:szCs w:val="17"/>
+        </w:rPr>
+        <w:t xml:space="preserve">  R² del ajuste: 0.9967</w:t>
+      </w:r>
+    </w:p>
+    <w:p>
+      <w:pPr>
+        <w:shd w:fill="F2F2F2" w:color="auto" w:val="clear"/>
+        <w:spacing w:after="0" w:before="0"/>
+        <w:ind w:left="200"/>
+      </w:pPr>
+      <w:r>
+        <w:rPr>
+          <w:rFonts w:ascii="Consolas" w:cs="Consolas" w:eastAsia="Consolas" w:hAnsi="Consolas"/>
+          <w:sz w:val="17"/>
+          <w:szCs w:val="17"/>
+        </w:rPr>
+        <w:t xml:space="preserve">=== Calibración de L(x) — latencia ===</w:t>
+      </w:r>
+    </w:p>
+    <w:p>
+      <w:pPr>
+        <w:shd w:fill="F2F2F2" w:color="auto" w:val="clear"/>
+        <w:spacing w:after="0" w:before="0"/>
+        <w:ind w:left="200"/>
+      </w:pPr>
+      <w:r>
+        <w:rPr>
+          <w:rFonts w:ascii="Consolas" w:cs="Consolas" w:eastAsia="Consolas" w:hAnsi="Consolas"/>
+          <w:sz w:val="17"/>
+          <w:szCs w:val="17"/>
+        </w:rPr>
+        <w:t xml:space="preserve">  Valores base (simulation.py): a=8.0, b=0.012</w:t>
+      </w:r>
+    </w:p>
+    <w:p>
+      <w:pPr>
+        <w:shd w:fill="F2F2F2" w:color="auto" w:val="clear"/>
+        <w:spacing w:after="0" w:before="0"/>
+        <w:ind w:left="200"/>
+      </w:pPr>
+      <w:r>
+        <w:rPr>
+          <w:rFonts w:ascii="Consolas" w:cs="Consolas" w:eastAsia="Consolas" w:hAnsi="Consolas"/>
+          <w:sz w:val="17"/>
+          <w:szCs w:val="17"/>
+        </w:rPr>
+        <w:t xml:space="preserve">  Valores ajustados (curve_fit): a=7.782, b=0.01206</w:t>
+      </w:r>
+    </w:p>
+    <w:p>
+      <w:pPr>
+        <w:shd w:fill="F2F2F2" w:color="auto" w:val="clear"/>
+        <w:spacing w:after="0" w:before="0"/>
+        <w:ind w:left="200"/>
+      </w:pPr>
+      <w:r>
+        <w:rPr>
+          <w:rFonts w:ascii="Consolas" w:cs="Consolas" w:eastAsia="Consolas" w:hAnsi="Consolas"/>
+          <w:sz w:val="17"/>
+          <w:szCs w:val="17"/>
+        </w:rPr>
+        <w:t xml:space="preserve">  R² del ajuste: 0.9985</w:t>
+      </w:r>
+    </w:p>
+    <w:p>
+      <w:pPr>
+        <w:shd w:fill="F2F2F2" w:color="auto" w:val="clear"/>
+        <w:spacing w:after="120" w:before="0"/>
+        <w:ind w:left="200"/>
+      </w:pPr>
+      <w:r>
+        <w:rPr>
+          <w:rFonts w:ascii="Consolas" w:cs="Consolas" w:eastAsia="Consolas" w:hAnsi="Consolas"/>
+          <w:sz w:val="17"/>
+          <w:szCs w:val="17"/>
+        </w:rPr>
+        <w:t xml:space="preserve">Gráficas guardadas en assets/calibracion_throughput.png y assets/calibracion_latencia.png</w:t>
+      </w:r>
+    </w:p>
+    <w:p>
+      <w:pPr>
+        <w:spacing w:after="120"/>
+      </w:pPr>
+      <w:r>
+        <w:t xml:space="preserve">Los valores calibrados en la máquina de Jose (Windows, Python 3.14) son idénticos, cifra por cifra, a los obtenidos en el entorno de desarrollo (Linux, Python 3.12). Esto se debe a la semilla aleatoria fija (SEMILLA_ALEATORIA = 42): confirma que el experimento es completamente reproducible entre sistemas operativos y versiones de Python, un requisito de rigor científico para este tipo de simulaciones.</w:t>
+      </w:r>
+    </w:p>
+    <w:p>
+      <w:pPr>
         <w:pStyle w:val="Heading2"/>
         <w:spacing w:after="110" w:before="220"/>
       </w:pPr>
@@ -4061,6 +4356,2540 @@
         <w:spacing w:after="150" w:before="300"/>
       </w:pPr>
       <w:r>
+        <w:t xml:space="preserve">4. Módulo de Cálculo Integral Numérico — src/integration.py (TG4)</w:t>
+      </w:r>
+    </w:p>
+    <w:p>
+      <w:pPr>
+        <w:spacing w:after="120"/>
+      </w:pPr>
+      <w:r>
+        <w:t xml:space="preserve">Responsable: Wilberth Guillermo Guillén Aguilar.</w:t>
+      </w:r>
+    </w:p>
+    <w:p>
+      <w:pPr>
+        <w:spacing w:after="120"/>
+      </w:pPr>
+      <w:r>
+        <w:t xml:space="preserve">Implementa la Regla del Trapecio compuesta y la Regla de Simpson 1/3 de forma manual, sin recurrir a np.trapz, scipy.integrate ni funciones equivalentes de librerías externas, tal como exige la TG4. Ambas se usan para calcular el Área Bajo la Curva (AUC) de T(x), L(x) y E(x), que representa el esfuerzo acumulado del servidor durante la ventana de estrés (sección 5.2 del informe de Fase I).</w:t>
+      </w:r>
+    </w:p>
+    <w:p>
+      <w:pPr>
+        <w:pStyle w:val="Heading2"/>
+        <w:spacing w:after="110" w:before="220"/>
+      </w:pPr>
+      <w:r>
+        <w:t xml:space="preserve">4.1 Funciones implementadas</w:t>
+      </w:r>
+    </w:p>
+    <w:tbl>
+      <w:tblPr>
+        <w:tblW w:type="dxa" w:w="9360"/>
+        <w:tblBorders>
+          <w:top w:val="single" w:color="auto" w:sz="4"/>
+          <w:left w:val="single" w:color="auto" w:sz="4"/>
+          <w:bottom w:val="single" w:color="auto" w:sz="4"/>
+          <w:right w:val="single" w:color="auto" w:sz="4"/>
+          <w:insideH w:val="single" w:color="auto" w:sz="4"/>
+          <w:insideV w:val="single" w:color="auto" w:sz="4"/>
+        </w:tblBorders>
+      </w:tblPr>
+      <w:tblGrid>
+        <w:gridCol w:w="2600"/>
+        <w:gridCol w:w="3800"/>
+        <w:gridCol w:w="2960"/>
+      </w:tblGrid>
+      <w:tr>
+        <w:trPr>
+          <w:tblHeader/>
+        </w:trPr>
+        <w:tc>
+          <w:tcPr>
+            <w:tcW w:type="dxa" w:w="2600"/>
+            <w:shd w:fill="1F4E79" w:color="auto" w:val="clear"/>
+            <w:tcMar>
+              <w:top w:type="dxa" w:w="60"/>
+              <w:left w:type="dxa" w:w="80"/>
+              <w:bottom w:type="dxa" w:w="60"/>
+              <w:right w:type="dxa" w:w="80"/>
+            </w:tcMar>
+          </w:tcPr>
+          <w:p>
+            <w:pPr>
+              <w:spacing w:after="40"/>
+            </w:pPr>
+            <w:r>
+              <w:rPr>
+                <w:b/>
+                <w:bCs/>
+                <w:color w:val="FFFFFF"/>
+              </w:rPr>
+              <w:t xml:space="preserve">Función</w:t>
+            </w:r>
+          </w:p>
+        </w:tc>
+        <w:tc>
+          <w:tcPr>
+            <w:tcW w:type="dxa" w:w="3800"/>
+            <w:shd w:fill="1F4E79" w:color="auto" w:val="clear"/>
+            <w:tcMar>
+              <w:top w:type="dxa" w:w="60"/>
+              <w:left w:type="dxa" w:w="80"/>
+              <w:bottom w:type="dxa" w:w="60"/>
+              <w:right w:type="dxa" w:w="80"/>
+            </w:tcMar>
+          </w:tcPr>
+          <w:p>
+            <w:pPr>
+              <w:spacing w:after="40"/>
+            </w:pPr>
+            <w:r>
+              <w:rPr>
+                <w:b/>
+                <w:bCs/>
+                <w:color w:val="FFFFFF"/>
+              </w:rPr>
+              <w:t xml:space="preserve">Fórmula</w:t>
+            </w:r>
+          </w:p>
+        </w:tc>
+        <w:tc>
+          <w:tcPr>
+            <w:tcW w:type="dxa" w:w="2960"/>
+            <w:shd w:fill="1F4E79" w:color="auto" w:val="clear"/>
+            <w:tcMar>
+              <w:top w:type="dxa" w:w="60"/>
+              <w:left w:type="dxa" w:w="80"/>
+              <w:bottom w:type="dxa" w:w="60"/>
+              <w:right w:type="dxa" w:w="80"/>
+            </w:tcMar>
+          </w:tcPr>
+          <w:p>
+            <w:pPr>
+              <w:spacing w:after="40"/>
+            </w:pPr>
+            <w:r>
+              <w:rPr>
+                <w:b/>
+                <w:bCs/>
+                <w:color w:val="FFFFFF"/>
+              </w:rPr>
+              <w:t xml:space="preserve">Retorno</w:t>
+            </w:r>
+          </w:p>
+        </w:tc>
+      </w:tr>
+      <w:tr>
+        <w:tc>
+          <w:tcPr>
+            <w:tcW w:type="dxa" w:w="2600"/>
+            <w:tcMar>
+              <w:top w:type="dxa" w:w="60"/>
+              <w:left w:type="dxa" w:w="80"/>
+              <w:bottom w:type="dxa" w:w="60"/>
+              <w:right w:type="dxa" w:w="80"/>
+            </w:tcMar>
+          </w:tcPr>
+          <w:p>
+            <w:pPr>
+              <w:spacing w:after="40"/>
+            </w:pPr>
+            <w:r>
+              <w:rPr>
+                <w:rFonts w:ascii="Consolas" w:cs="Consolas" w:eastAsia="Consolas" w:hAnsi="Consolas"/>
+                <w:b w:val="false"/>
+                <w:bCs w:val="false"/>
+                <w:sz w:val="19"/>
+                <w:szCs w:val="19"/>
+              </w:rPr>
+              <w:t xml:space="preserve">trapecio(x, y)</w:t>
+            </w:r>
+          </w:p>
+        </w:tc>
+        <w:tc>
+          <w:tcPr>
+            <w:tcW w:type="dxa" w:w="3800"/>
+            <w:tcMar>
+              <w:top w:type="dxa" w:w="60"/>
+              <w:left w:type="dxa" w:w="80"/>
+              <w:bottom w:type="dxa" w:w="60"/>
+              <w:right w:type="dxa" w:w="80"/>
+            </w:tcMar>
+          </w:tcPr>
+          <w:p>
+            <w:pPr>
+              <w:spacing w:after="40"/>
+            </w:pPr>
+            <w:r>
+              <w:rPr>
+                <w:b w:val="false"/>
+                <w:bCs w:val="false"/>
+              </w:rPr>
+              <w:t xml:space="preserve">Σ [(y_i+y_{i+1})/2] · (x_{i+1}-x_i)</w:t>
+            </w:r>
+          </w:p>
+        </w:tc>
+        <w:tc>
+          <w:tcPr>
+            <w:tcW w:type="dxa" w:w="2960"/>
+            <w:tcMar>
+              <w:top w:type="dxa" w:w="60"/>
+              <w:left w:type="dxa" w:w="80"/>
+              <w:bottom w:type="dxa" w:w="60"/>
+              <w:right w:type="dxa" w:w="80"/>
+            </w:tcMar>
+          </w:tcPr>
+          <w:p>
+            <w:pPr>
+              <w:spacing w:after="40"/>
+            </w:pPr>
+            <w:r>
+              <w:rPr>
+                <w:b w:val="false"/>
+                <w:bCs w:val="false"/>
+              </w:rPr>
+              <w:t xml:space="preserve">AUC aproximada (float).</w:t>
+            </w:r>
+          </w:p>
+        </w:tc>
+      </w:tr>
+      <w:tr>
+        <w:tc>
+          <w:tcPr>
+            <w:tcW w:type="dxa" w:w="2600"/>
+            <w:shd w:fill="F7F7F7" w:color="auto" w:val="clear"/>
+            <w:tcMar>
+              <w:top w:type="dxa" w:w="60"/>
+              <w:left w:type="dxa" w:w="80"/>
+              <w:bottom w:type="dxa" w:w="60"/>
+              <w:right w:type="dxa" w:w="80"/>
+            </w:tcMar>
+          </w:tcPr>
+          <w:p>
+            <w:pPr>
+              <w:spacing w:after="40"/>
+            </w:pPr>
+            <w:r>
+              <w:rPr>
+                <w:rFonts w:ascii="Consolas" w:cs="Consolas" w:eastAsia="Consolas" w:hAnsi="Consolas"/>
+                <w:b w:val="false"/>
+                <w:bCs w:val="false"/>
+                <w:sz w:val="19"/>
+                <w:szCs w:val="19"/>
+              </w:rPr>
+              <w:t xml:space="preserve">simpson_1_3(x, y)</w:t>
+            </w:r>
+          </w:p>
+        </w:tc>
+        <w:tc>
+          <w:tcPr>
+            <w:tcW w:type="dxa" w:w="3800"/>
+            <w:shd w:fill="F7F7F7" w:color="auto" w:val="clear"/>
+            <w:tcMar>
+              <w:top w:type="dxa" w:w="60"/>
+              <w:left w:type="dxa" w:w="80"/>
+              <w:bottom w:type="dxa" w:w="60"/>
+              <w:right w:type="dxa" w:w="80"/>
+            </w:tcMar>
+          </w:tcPr>
+          <w:p>
+            <w:pPr>
+              <w:spacing w:after="40"/>
+            </w:pPr>
+            <w:r>
+              <w:rPr>
+                <w:b w:val="false"/>
+                <w:bCs w:val="false"/>
+              </w:rPr>
+              <w:t xml:space="preserve">(h/3)[f0+4f1+2f2+...+4f_{n-1}+fn]</w:t>
+            </w:r>
+          </w:p>
+        </w:tc>
+        <w:tc>
+          <w:tcPr>
+            <w:tcW w:type="dxa" w:w="2960"/>
+            <w:shd w:fill="F7F7F7" w:color="auto" w:val="clear"/>
+            <w:tcMar>
+              <w:top w:type="dxa" w:w="60"/>
+              <w:left w:type="dxa" w:w="80"/>
+              <w:bottom w:type="dxa" w:w="60"/>
+              <w:right w:type="dxa" w:w="80"/>
+            </w:tcMar>
+          </w:tcPr>
+          <w:p>
+            <w:pPr>
+              <w:spacing w:after="40"/>
+            </w:pPr>
+            <w:r>
+              <w:rPr>
+                <w:b w:val="false"/>
+                <w:bCs w:val="false"/>
+              </w:rPr>
+              <w:t xml:space="preserve">AUC aproximada (float).</w:t>
+            </w:r>
+          </w:p>
+        </w:tc>
+      </w:tr>
+      <w:tr>
+        <w:tc>
+          <w:tcPr>
+            <w:tcW w:type="dxa" w:w="2600"/>
+            <w:tcMar>
+              <w:top w:type="dxa" w:w="60"/>
+              <w:left w:type="dxa" w:w="80"/>
+              <w:bottom w:type="dxa" w:w="60"/>
+              <w:right w:type="dxa" w:w="80"/>
+            </w:tcMar>
+          </w:tcPr>
+          <w:p>
+            <w:pPr>
+              <w:spacing w:after="40"/>
+            </w:pPr>
+            <w:r>
+              <w:rPr>
+                <w:rFonts w:ascii="Consolas" w:cs="Consolas" w:eastAsia="Consolas" w:hAnsi="Consolas"/>
+                <w:b w:val="false"/>
+                <w:bCs w:val="false"/>
+                <w:sz w:val="19"/>
+                <w:szCs w:val="19"/>
+              </w:rPr>
+              <w:t xml:space="preserve">calcular_auc(datos)</w:t>
+            </w:r>
+          </w:p>
+        </w:tc>
+        <w:tc>
+          <w:tcPr>
+            <w:tcW w:type="dxa" w:w="3800"/>
+            <w:tcMar>
+              <w:top w:type="dxa" w:w="60"/>
+              <w:left w:type="dxa" w:w="80"/>
+              <w:bottom w:type="dxa" w:w="60"/>
+              <w:right w:type="dxa" w:w="80"/>
+            </w:tcMar>
+          </w:tcPr>
+          <w:p>
+            <w:pPr>
+              <w:spacing w:after="40"/>
+            </w:pPr>
+            <w:r>
+              <w:rPr>
+                <w:b w:val="false"/>
+                <w:bCs w:val="false"/>
+              </w:rPr>
+              <w:t xml:space="preserve">Aplica ambas fórmulas a T, L y E</w:t>
+            </w:r>
+          </w:p>
+        </w:tc>
+        <w:tc>
+          <w:tcPr>
+            <w:tcW w:type="dxa" w:w="2960"/>
+            <w:tcMar>
+              <w:top w:type="dxa" w:w="60"/>
+              <w:left w:type="dxa" w:w="80"/>
+              <w:bottom w:type="dxa" w:w="60"/>
+              <w:right w:type="dxa" w:w="80"/>
+            </w:tcMar>
+          </w:tcPr>
+          <w:p>
+            <w:pPr>
+              <w:spacing w:after="40"/>
+            </w:pPr>
+            <w:r>
+              <w:rPr>
+                <w:b w:val="false"/>
+                <w:bCs w:val="false"/>
+              </w:rPr>
+              <w:t xml:space="preserve">DataFrame con AUC y diferencia %.</w:t>
+            </w:r>
+          </w:p>
+        </w:tc>
+      </w:tr>
+      <w:tr>
+        <w:tc>
+          <w:tcPr>
+            <w:tcW w:type="dxa" w:w="2600"/>
+            <w:shd w:fill="F7F7F7" w:color="auto" w:val="clear"/>
+            <w:tcMar>
+              <w:top w:type="dxa" w:w="60"/>
+              <w:left w:type="dxa" w:w="80"/>
+              <w:bottom w:type="dxa" w:w="60"/>
+              <w:right w:type="dxa" w:w="80"/>
+            </w:tcMar>
+          </w:tcPr>
+          <w:p>
+            <w:pPr>
+              <w:spacing w:after="40"/>
+            </w:pPr>
+            <w:r>
+              <w:rPr>
+                <w:rFonts w:ascii="Consolas" w:cs="Consolas" w:eastAsia="Consolas" w:hAnsi="Consolas"/>
+                <w:b w:val="false"/>
+                <w:bCs w:val="false"/>
+                <w:sz w:val="19"/>
+                <w:szCs w:val="19"/>
+              </w:rPr>
+              <w:t xml:space="preserve">validar_precision(n)</w:t>
+            </w:r>
+          </w:p>
+        </w:tc>
+        <w:tc>
+          <w:tcPr>
+            <w:tcW w:type="dxa" w:w="3800"/>
+            <w:shd w:fill="F7F7F7" w:color="auto" w:val="clear"/>
+            <w:tcMar>
+              <w:top w:type="dxa" w:w="60"/>
+              <w:left w:type="dxa" w:w="80"/>
+              <w:bottom w:type="dxa" w:w="60"/>
+              <w:right w:type="dxa" w:w="80"/>
+            </w:tcMar>
+          </w:tcPr>
+          <w:p>
+            <w:pPr>
+              <w:spacing w:after="40"/>
+            </w:pPr>
+            <w:r>
+              <w:rPr>
+                <w:b w:val="false"/>
+                <w:bCs w:val="false"/>
+              </w:rPr>
+              <w:t xml:space="preserve">Compara contra integrales exactas conocidas</w:t>
+            </w:r>
+          </w:p>
+        </w:tc>
+        <w:tc>
+          <w:tcPr>
+            <w:tcW w:type="dxa" w:w="2960"/>
+            <w:shd w:fill="F7F7F7" w:color="auto" w:val="clear"/>
+            <w:tcMar>
+              <w:top w:type="dxa" w:w="60"/>
+              <w:left w:type="dxa" w:w="80"/>
+              <w:bottom w:type="dxa" w:w="60"/>
+              <w:right w:type="dxa" w:w="80"/>
+            </w:tcMar>
+          </w:tcPr>
+          <w:p>
+            <w:pPr>
+              <w:spacing w:after="40"/>
+            </w:pPr>
+            <w:r>
+              <w:rPr>
+                <w:b w:val="false"/>
+                <w:bCs w:val="false"/>
+              </w:rPr>
+              <w:t xml:space="preserve">DataFrame con el error % de cada método.</w:t>
+            </w:r>
+          </w:p>
+        </w:tc>
+      </w:tr>
+    </w:tbl>
+    <w:p>
+      <w:pPr>
+        <w:pStyle w:val="Heading2"/>
+        <w:spacing w:after="110" w:before="220"/>
+      </w:pPr>
+      <w:r>
+        <w:t xml:space="preserve">4.2 Restricción importante: número de puntos</w:t>
+      </w:r>
+    </w:p>
+    <w:p>
+      <w:pPr>
+        <w:spacing w:after="120"/>
+      </w:pPr>
+      <w:r>
+        <w:t xml:space="preserve">La Regla de Simpson 1/3 requiere un número par de subintervalos (es decir, un número impar de puntos) y espaciado uniforme; el código valida esto y lanza un error claro si no se cumple. Por esa razón, las corridas de este módulo usan n=101 en vez del n=50 por defecto de simulation.py. Este requisito debe respetarse también al construir el dashboard (TG7): el panel de configuración debe forzar valores impares de n.</w:t>
+      </w:r>
+    </w:p>
+    <w:p>
+      <w:pPr>
+        <w:pStyle w:val="Heading2"/>
+        <w:spacing w:after="110" w:before="220"/>
+      </w:pPr>
+      <w:r>
+        <w:t xml:space="preserve">4.3 Validación con integrales de solución conocida</w:t>
+      </w:r>
+    </w:p>
+    <w:tbl>
+      <w:tblPr>
+        <w:tblW w:type="dxa" w:w="9360"/>
+        <w:tblBorders>
+          <w:top w:val="single" w:color="auto" w:sz="4"/>
+          <w:left w:val="single" w:color="auto" w:sz="4"/>
+          <w:bottom w:val="single" w:color="auto" w:sz="4"/>
+          <w:right w:val="single" w:color="auto" w:sz="4"/>
+          <w:insideH w:val="single" w:color="auto" w:sz="4"/>
+          <w:insideV w:val="single" w:color="auto" w:sz="4"/>
+        </w:tblBorders>
+      </w:tblPr>
+      <w:tblGrid>
+        <w:gridCol w:w="3200"/>
+        <w:gridCol w:w="2000"/>
+        <w:gridCol w:w="2100"/>
+        <w:gridCol w:w="2060"/>
+      </w:tblGrid>
+      <w:tr>
+        <w:trPr>
+          <w:tblHeader/>
+        </w:trPr>
+        <w:tc>
+          <w:tcPr>
+            <w:tcW w:type="dxa" w:w="3200"/>
+            <w:shd w:fill="1F4E79" w:color="auto" w:val="clear"/>
+            <w:tcMar>
+              <w:top w:type="dxa" w:w="60"/>
+              <w:left w:type="dxa" w:w="80"/>
+              <w:bottom w:type="dxa" w:w="60"/>
+              <w:right w:type="dxa" w:w="80"/>
+            </w:tcMar>
+          </w:tcPr>
+          <w:p>
+            <w:pPr>
+              <w:spacing w:after="40"/>
+            </w:pPr>
+            <w:r>
+              <w:rPr>
+                <w:b/>
+                <w:bCs/>
+                <w:color w:val="FFFFFF"/>
+              </w:rPr>
+              <w:t xml:space="preserve">Caso</w:t>
+            </w:r>
+          </w:p>
+        </w:tc>
+        <w:tc>
+          <w:tcPr>
+            <w:tcW w:type="dxa" w:w="2000"/>
+            <w:shd w:fill="1F4E79" w:color="auto" w:val="clear"/>
+            <w:tcMar>
+              <w:top w:type="dxa" w:w="60"/>
+              <w:left w:type="dxa" w:w="80"/>
+              <w:bottom w:type="dxa" w:w="60"/>
+              <w:right w:type="dxa" w:w="80"/>
+            </w:tcMar>
+          </w:tcPr>
+          <w:p>
+            <w:pPr>
+              <w:spacing w:after="40"/>
+            </w:pPr>
+            <w:r>
+              <w:rPr>
+                <w:b/>
+                <w:bCs/>
+                <w:color w:val="FFFFFF"/>
+              </w:rPr>
+              <w:t xml:space="preserve">Integral exacta</w:t>
+            </w:r>
+          </w:p>
+        </w:tc>
+        <w:tc>
+          <w:tcPr>
+            <w:tcW w:type="dxa" w:w="2100"/>
+            <w:shd w:fill="1F4E79" w:color="auto" w:val="clear"/>
+            <w:tcMar>
+              <w:top w:type="dxa" w:w="60"/>
+              <w:left w:type="dxa" w:w="80"/>
+              <w:bottom w:type="dxa" w:w="60"/>
+              <w:right w:type="dxa" w:w="80"/>
+            </w:tcMar>
+          </w:tcPr>
+          <w:p>
+            <w:pPr>
+              <w:spacing w:after="40"/>
+            </w:pPr>
+            <w:r>
+              <w:rPr>
+                <w:b/>
+                <w:bCs/>
+                <w:color w:val="FFFFFF"/>
+              </w:rPr>
+              <w:t xml:space="preserve">Error Trapecio</w:t>
+            </w:r>
+          </w:p>
+        </w:tc>
+        <w:tc>
+          <w:tcPr>
+            <w:tcW w:type="dxa" w:w="2060"/>
+            <w:shd w:fill="1F4E79" w:color="auto" w:val="clear"/>
+            <w:tcMar>
+              <w:top w:type="dxa" w:w="60"/>
+              <w:left w:type="dxa" w:w="80"/>
+              <w:bottom w:type="dxa" w:w="60"/>
+              <w:right w:type="dxa" w:w="80"/>
+            </w:tcMar>
+          </w:tcPr>
+          <w:p>
+            <w:pPr>
+              <w:spacing w:after="40"/>
+            </w:pPr>
+            <w:r>
+              <w:rPr>
+                <w:b/>
+                <w:bCs/>
+                <w:color w:val="FFFFFF"/>
+              </w:rPr>
+              <w:t xml:space="preserve">Error Simpson</w:t>
+            </w:r>
+          </w:p>
+        </w:tc>
+      </w:tr>
+      <w:tr>
+        <w:tc>
+          <w:tcPr>
+            <w:tcW w:type="dxa" w:w="3200"/>
+            <w:tcMar>
+              <w:top w:type="dxa" w:w="60"/>
+              <w:left w:type="dxa" w:w="80"/>
+              <w:bottom w:type="dxa" w:w="60"/>
+              <w:right w:type="dxa" w:w="80"/>
+            </w:tcMar>
+          </w:tcPr>
+          <w:p>
+            <w:pPr>
+              <w:spacing w:after="40"/>
+            </w:pPr>
+            <w:r>
+              <w:rPr>
+                <w:b w:val="false"/>
+                <w:bCs w:val="false"/>
+              </w:rPr>
+              <w:t xml:space="preserve">x³ en [0, 10]</w:t>
+            </w:r>
+          </w:p>
+        </w:tc>
+        <w:tc>
+          <w:tcPr>
+            <w:tcW w:type="dxa" w:w="2000"/>
+            <w:tcMar>
+              <w:top w:type="dxa" w:w="60"/>
+              <w:left w:type="dxa" w:w="80"/>
+              <w:bottom w:type="dxa" w:w="60"/>
+              <w:right w:type="dxa" w:w="80"/>
+            </w:tcMar>
+          </w:tcPr>
+          <w:p>
+            <w:pPr>
+              <w:spacing w:after="40"/>
+            </w:pPr>
+            <w:r>
+              <w:rPr>
+                <w:b w:val="false"/>
+                <w:bCs w:val="false"/>
+              </w:rPr>
+              <w:t xml:space="preserve">2500.000000</w:t>
+            </w:r>
+          </w:p>
+        </w:tc>
+        <w:tc>
+          <w:tcPr>
+            <w:tcW w:type="dxa" w:w="2100"/>
+            <w:tcMar>
+              <w:top w:type="dxa" w:w="60"/>
+              <w:left w:type="dxa" w:w="80"/>
+              <w:bottom w:type="dxa" w:w="60"/>
+              <w:right w:type="dxa" w:w="80"/>
+            </w:tcMar>
+          </w:tcPr>
+          <w:p>
+            <w:pPr>
+              <w:spacing w:after="40"/>
+            </w:pPr>
+            <w:r>
+              <w:rPr>
+                <w:b w:val="false"/>
+                <w:bCs w:val="false"/>
+              </w:rPr>
+              <w:t xml:space="preserve">0.010000%</w:t>
+            </w:r>
+          </w:p>
+        </w:tc>
+        <w:tc>
+          <w:tcPr>
+            <w:tcW w:type="dxa" w:w="2060"/>
+            <w:tcMar>
+              <w:top w:type="dxa" w:w="60"/>
+              <w:left w:type="dxa" w:w="80"/>
+              <w:bottom w:type="dxa" w:w="60"/>
+              <w:right w:type="dxa" w:w="80"/>
+            </w:tcMar>
+          </w:tcPr>
+          <w:p>
+            <w:pPr>
+              <w:spacing w:after="40"/>
+            </w:pPr>
+            <w:r>
+              <w:rPr>
+                <w:b w:val="false"/>
+                <w:bCs w:val="false"/>
+              </w:rPr>
+              <w:t xml:space="preserve">0.000000%</w:t>
+            </w:r>
+          </w:p>
+        </w:tc>
+      </w:tr>
+      <w:tr>
+        <w:tc>
+          <w:tcPr>
+            <w:tcW w:type="dxa" w:w="3200"/>
+            <w:shd w:fill="F7F7F7" w:color="auto" w:val="clear"/>
+            <w:tcMar>
+              <w:top w:type="dxa" w:w="60"/>
+              <w:left w:type="dxa" w:w="80"/>
+              <w:bottom w:type="dxa" w:w="60"/>
+              <w:right w:type="dxa" w:w="80"/>
+            </w:tcMar>
+          </w:tcPr>
+          <w:p>
+            <w:pPr>
+              <w:spacing w:after="40"/>
+            </w:pPr>
+            <w:r>
+              <w:rPr>
+                <w:rFonts w:ascii="Consolas" w:cs="Consolas" w:eastAsia="Consolas" w:hAnsi="Consolas"/>
+                <w:b w:val="false"/>
+                <w:bCs w:val="false"/>
+                <w:sz w:val="19"/>
+                <w:szCs w:val="19"/>
+              </w:rPr>
+              <w:t xml:space="preserve">sin(x) en [0, π]</w:t>
+            </w:r>
+          </w:p>
+        </w:tc>
+        <w:tc>
+          <w:tcPr>
+            <w:tcW w:type="dxa" w:w="2000"/>
+            <w:shd w:fill="F7F7F7" w:color="auto" w:val="clear"/>
+            <w:tcMar>
+              <w:top w:type="dxa" w:w="60"/>
+              <w:left w:type="dxa" w:w="80"/>
+              <w:bottom w:type="dxa" w:w="60"/>
+              <w:right w:type="dxa" w:w="80"/>
+            </w:tcMar>
+          </w:tcPr>
+          <w:p>
+            <w:pPr>
+              <w:spacing w:after="40"/>
+            </w:pPr>
+            <w:r>
+              <w:rPr>
+                <w:b w:val="false"/>
+                <w:bCs w:val="false"/>
+              </w:rPr>
+              <w:t xml:space="preserve">2.000000</w:t>
+            </w:r>
+          </w:p>
+        </w:tc>
+        <w:tc>
+          <w:tcPr>
+            <w:tcW w:type="dxa" w:w="2100"/>
+            <w:shd w:fill="F7F7F7" w:color="auto" w:val="clear"/>
+            <w:tcMar>
+              <w:top w:type="dxa" w:w="60"/>
+              <w:left w:type="dxa" w:w="80"/>
+              <w:bottom w:type="dxa" w:w="60"/>
+              <w:right w:type="dxa" w:w="80"/>
+            </w:tcMar>
+          </w:tcPr>
+          <w:p>
+            <w:pPr>
+              <w:spacing w:after="40"/>
+            </w:pPr>
+            <w:r>
+              <w:rPr>
+                <w:b w:val="false"/>
+                <w:bCs w:val="false"/>
+              </w:rPr>
+              <w:t xml:space="preserve">0.008225%</w:t>
+            </w:r>
+          </w:p>
+        </w:tc>
+        <w:tc>
+          <w:tcPr>
+            <w:tcW w:type="dxa" w:w="2060"/>
+            <w:shd w:fill="F7F7F7" w:color="auto" w:val="clear"/>
+            <w:tcMar>
+              <w:top w:type="dxa" w:w="60"/>
+              <w:left w:type="dxa" w:w="80"/>
+              <w:bottom w:type="dxa" w:w="60"/>
+              <w:right w:type="dxa" w:w="80"/>
+            </w:tcMar>
+          </w:tcPr>
+          <w:p>
+            <w:pPr>
+              <w:spacing w:after="40"/>
+            </w:pPr>
+            <w:r>
+              <w:rPr>
+                <w:b w:val="false"/>
+                <w:bCs w:val="false"/>
+              </w:rPr>
+              <w:t xml:space="preserve">0.000001%</w:t>
+            </w:r>
+          </w:p>
+        </w:tc>
+      </w:tr>
+    </w:tbl>
+    <w:p>
+      <w:pPr>
+        <w:spacing w:after="120"/>
+      </w:pPr>
+      <w:r>
+        <w:t xml:space="preserve">Simpson 1/3 es exacta (error prácticamente nulo) para el caso cúbico, lo cual confirma numéricamente una propiedad teórica del método: es exacto para cualquier polinomio de grado ≤ 3. En el caso no polinómico (seno), Simpson también supera ampliamente a Trapecio, consistente con su mayor orden de precisión (O(h⁴) frente a O(h²)). Ambos métodos quedan validados.</w:t>
+      </w:r>
+    </w:p>
+    <w:p>
+      <w:pPr>
+        <w:pStyle w:val="Heading2"/>
+        <w:spacing w:after="110" w:before="220"/>
+      </w:pPr>
+      <w:r>
+        <w:t xml:space="preserve">4.4 AUC de T(x), L(x), E(x) — datos simulados</w:t>
+      </w:r>
+    </w:p>
+    <w:tbl>
+      <w:tblPr>
+        <w:tblW w:type="dxa" w:w="9360"/>
+        <w:tblBorders>
+          <w:top w:val="single" w:color="auto" w:sz="4"/>
+          <w:left w:val="single" w:color="auto" w:sz="4"/>
+          <w:bottom w:val="single" w:color="auto" w:sz="4"/>
+          <w:right w:val="single" w:color="auto" w:sz="4"/>
+          <w:insideH w:val="single" w:color="auto" w:sz="4"/>
+          <w:insideV w:val="single" w:color="auto" w:sz="4"/>
+        </w:tblBorders>
+      </w:tblPr>
+      <w:tblGrid>
+        <w:gridCol w:w="1400"/>
+        <w:gridCol w:w="2600"/>
+        <w:gridCol w:w="1900"/>
+        <w:gridCol w:w="1900"/>
+        <w:gridCol w:w="1560"/>
+      </w:tblGrid>
+      <w:tr>
+        <w:trPr>
+          <w:tblHeader/>
+        </w:trPr>
+        <w:tc>
+          <w:tcPr>
+            <w:tcW w:type="dxa" w:w="1400"/>
+            <w:shd w:fill="1F4E79" w:color="auto" w:val="clear"/>
+            <w:tcMar>
+              <w:top w:type="dxa" w:w="60"/>
+              <w:left w:type="dxa" w:w="80"/>
+              <w:bottom w:type="dxa" w:w="60"/>
+              <w:right w:type="dxa" w:w="80"/>
+            </w:tcMar>
+          </w:tcPr>
+          <w:p>
+            <w:pPr>
+              <w:spacing w:after="40"/>
+            </w:pPr>
+            <w:r>
+              <w:rPr>
+                <w:b/>
+                <w:bCs/>
+                <w:color w:val="FFFFFF"/>
+              </w:rPr>
+              <w:t xml:space="preserve">Variable</w:t>
+            </w:r>
+          </w:p>
+        </w:tc>
+        <w:tc>
+          <w:tcPr>
+            <w:tcW w:type="dxa" w:w="2600"/>
+            <w:shd w:fill="1F4E79" w:color="auto" w:val="clear"/>
+            <w:tcMar>
+              <w:top w:type="dxa" w:w="60"/>
+              <w:left w:type="dxa" w:w="80"/>
+              <w:bottom w:type="dxa" w:w="60"/>
+              <w:right w:type="dxa" w:w="80"/>
+            </w:tcMar>
+          </w:tcPr>
+          <w:p>
+            <w:pPr>
+              <w:spacing w:after="40"/>
+            </w:pPr>
+            <w:r>
+              <w:rPr>
+                <w:b/>
+                <w:bCs/>
+                <w:color w:val="FFFFFF"/>
+              </w:rPr>
+              <w:t xml:space="preserve">Unidad</w:t>
+            </w:r>
+          </w:p>
+        </w:tc>
+        <w:tc>
+          <w:tcPr>
+            <w:tcW w:type="dxa" w:w="1900"/>
+            <w:shd w:fill="1F4E79" w:color="auto" w:val="clear"/>
+            <w:tcMar>
+              <w:top w:type="dxa" w:w="60"/>
+              <w:left w:type="dxa" w:w="80"/>
+              <w:bottom w:type="dxa" w:w="60"/>
+              <w:right w:type="dxa" w:w="80"/>
+            </w:tcMar>
+          </w:tcPr>
+          <w:p>
+            <w:pPr>
+              <w:spacing w:after="40"/>
+            </w:pPr>
+            <w:r>
+              <w:rPr>
+                <w:b/>
+                <w:bCs/>
+                <w:color w:val="FFFFFF"/>
+              </w:rPr>
+              <w:t xml:space="preserve">AUC Trapecio</w:t>
+            </w:r>
+          </w:p>
+        </w:tc>
+        <w:tc>
+          <w:tcPr>
+            <w:tcW w:type="dxa" w:w="1900"/>
+            <w:shd w:fill="1F4E79" w:color="auto" w:val="clear"/>
+            <w:tcMar>
+              <w:top w:type="dxa" w:w="60"/>
+              <w:left w:type="dxa" w:w="80"/>
+              <w:bottom w:type="dxa" w:w="60"/>
+              <w:right w:type="dxa" w:w="80"/>
+            </w:tcMar>
+          </w:tcPr>
+          <w:p>
+            <w:pPr>
+              <w:spacing w:after="40"/>
+            </w:pPr>
+            <w:r>
+              <w:rPr>
+                <w:b/>
+                <w:bCs/>
+                <w:color w:val="FFFFFF"/>
+              </w:rPr>
+              <w:t xml:space="preserve">AUC Simpson</w:t>
+            </w:r>
+          </w:p>
+        </w:tc>
+        <w:tc>
+          <w:tcPr>
+            <w:tcW w:type="dxa" w:w="1560"/>
+            <w:shd w:fill="1F4E79" w:color="auto" w:val="clear"/>
+            <w:tcMar>
+              <w:top w:type="dxa" w:w="60"/>
+              <w:left w:type="dxa" w:w="80"/>
+              <w:bottom w:type="dxa" w:w="60"/>
+              <w:right w:type="dxa" w:w="80"/>
+            </w:tcMar>
+          </w:tcPr>
+          <w:p>
+            <w:pPr>
+              <w:spacing w:after="40"/>
+            </w:pPr>
+            <w:r>
+              <w:rPr>
+                <w:b/>
+                <w:bCs/>
+                <w:color w:val="FFFFFF"/>
+              </w:rPr>
+              <w:t xml:space="preserve">Diferencia %</w:t>
+            </w:r>
+          </w:p>
+        </w:tc>
+      </w:tr>
+      <w:tr>
+        <w:tc>
+          <w:tcPr>
+            <w:tcW w:type="dxa" w:w="1400"/>
+            <w:tcMar>
+              <w:top w:type="dxa" w:w="60"/>
+              <w:left w:type="dxa" w:w="80"/>
+              <w:bottom w:type="dxa" w:w="60"/>
+              <w:right w:type="dxa" w:w="80"/>
+            </w:tcMar>
+          </w:tcPr>
+          <w:p>
+            <w:pPr>
+              <w:spacing w:after="40"/>
+            </w:pPr>
+            <w:r>
+              <w:rPr>
+                <w:b w:val="false"/>
+                <w:bCs w:val="false"/>
+              </w:rPr>
+              <w:t xml:space="preserve">T</w:t>
+            </w:r>
+          </w:p>
+        </w:tc>
+        <w:tc>
+          <w:tcPr>
+            <w:tcW w:type="dxa" w:w="2600"/>
+            <w:tcMar>
+              <w:top w:type="dxa" w:w="60"/>
+              <w:left w:type="dxa" w:w="80"/>
+              <w:bottom w:type="dxa" w:w="60"/>
+              <w:right w:type="dxa" w:w="80"/>
+            </w:tcMar>
+          </w:tcPr>
+          <w:p>
+            <w:pPr>
+              <w:spacing w:after="40"/>
+            </w:pPr>
+            <w:r>
+              <w:rPr>
+                <w:b w:val="false"/>
+                <w:bCs w:val="false"/>
+              </w:rPr>
+              <w:t xml:space="preserve">sol/seg · usuarios</w:t>
+            </w:r>
+          </w:p>
+        </w:tc>
+        <w:tc>
+          <w:tcPr>
+            <w:tcW w:type="dxa" w:w="1900"/>
+            <w:tcMar>
+              <w:top w:type="dxa" w:w="60"/>
+              <w:left w:type="dxa" w:w="80"/>
+              <w:bottom w:type="dxa" w:w="60"/>
+              <w:right w:type="dxa" w:w="80"/>
+            </w:tcMar>
+          </w:tcPr>
+          <w:p>
+            <w:pPr>
+              <w:spacing w:after="40"/>
+            </w:pPr>
+            <w:r>
+              <w:rPr>
+                <w:b w:val="false"/>
+                <w:bCs w:val="false"/>
+              </w:rPr>
+              <w:t xml:space="preserve">119,996.9004</w:t>
+            </w:r>
+          </w:p>
+        </w:tc>
+        <w:tc>
+          <w:tcPr>
+            <w:tcW w:type="dxa" w:w="1900"/>
+            <w:tcMar>
+              <w:top w:type="dxa" w:w="60"/>
+              <w:left w:type="dxa" w:w="80"/>
+              <w:bottom w:type="dxa" w:w="60"/>
+              <w:right w:type="dxa" w:w="80"/>
+            </w:tcMar>
+          </w:tcPr>
+          <w:p>
+            <w:pPr>
+              <w:spacing w:after="40"/>
+            </w:pPr>
+            <w:r>
+              <w:rPr>
+                <w:b w:val="false"/>
+                <w:bCs w:val="false"/>
+              </w:rPr>
+              <w:t xml:space="preserve">119,996.9060</w:t>
+            </w:r>
+          </w:p>
+        </w:tc>
+        <w:tc>
+          <w:tcPr>
+            <w:tcW w:type="dxa" w:w="1560"/>
+            <w:tcMar>
+              <w:top w:type="dxa" w:w="60"/>
+              <w:left w:type="dxa" w:w="80"/>
+              <w:bottom w:type="dxa" w:w="60"/>
+              <w:right w:type="dxa" w:w="80"/>
+            </w:tcMar>
+          </w:tcPr>
+          <w:p>
+            <w:pPr>
+              <w:spacing w:after="40"/>
+            </w:pPr>
+            <w:r>
+              <w:rPr>
+                <w:b w:val="false"/>
+                <w:bCs w:val="false"/>
+              </w:rPr>
+              <w:t xml:space="preserve">0.0000%</w:t>
+            </w:r>
+          </w:p>
+        </w:tc>
+      </w:tr>
+      <w:tr>
+        <w:tc>
+          <w:tcPr>
+            <w:tcW w:type="dxa" w:w="1400"/>
+            <w:shd w:fill="F7F7F7" w:color="auto" w:val="clear"/>
+            <w:tcMar>
+              <w:top w:type="dxa" w:w="60"/>
+              <w:left w:type="dxa" w:w="80"/>
+              <w:bottom w:type="dxa" w:w="60"/>
+              <w:right w:type="dxa" w:w="80"/>
+            </w:tcMar>
+          </w:tcPr>
+          <w:p>
+            <w:pPr>
+              <w:spacing w:after="40"/>
+            </w:pPr>
+            <w:r>
+              <w:rPr>
+                <w:b w:val="false"/>
+                <w:bCs w:val="false"/>
+              </w:rPr>
+              <w:t xml:space="preserve">L</w:t>
+            </w:r>
+          </w:p>
+        </w:tc>
+        <w:tc>
+          <w:tcPr>
+            <w:tcW w:type="dxa" w:w="2600"/>
+            <w:shd w:fill="F7F7F7" w:color="auto" w:val="clear"/>
+            <w:tcMar>
+              <w:top w:type="dxa" w:w="60"/>
+              <w:left w:type="dxa" w:w="80"/>
+              <w:bottom w:type="dxa" w:w="60"/>
+              <w:right w:type="dxa" w:w="80"/>
+            </w:tcMar>
+          </w:tcPr>
+          <w:p>
+            <w:pPr>
+              <w:spacing w:after="40"/>
+            </w:pPr>
+            <w:r>
+              <w:rPr>
+                <w:b w:val="false"/>
+                <w:bCs w:val="false"/>
+              </w:rPr>
+              <w:t xml:space="preserve">ms · usuarios</w:t>
+            </w:r>
+          </w:p>
+        </w:tc>
+        <w:tc>
+          <w:tcPr>
+            <w:tcW w:type="dxa" w:w="1900"/>
+            <w:shd w:fill="F7F7F7" w:color="auto" w:val="clear"/>
+            <w:tcMar>
+              <w:top w:type="dxa" w:w="60"/>
+              <w:left w:type="dxa" w:w="80"/>
+              <w:bottom w:type="dxa" w:w="60"/>
+              <w:right w:type="dxa" w:w="80"/>
+            </w:tcMar>
+          </w:tcPr>
+          <w:p>
+            <w:pPr>
+              <w:spacing w:after="40"/>
+            </w:pPr>
+            <w:r>
+              <w:rPr>
+                <w:b w:val="false"/>
+                <w:bCs w:val="false"/>
+              </w:rPr>
+              <w:t xml:space="preserve">268,278.1340</w:t>
+            </w:r>
+          </w:p>
+        </w:tc>
+        <w:tc>
+          <w:tcPr>
+            <w:tcW w:type="dxa" w:w="1900"/>
+            <w:shd w:fill="F7F7F7" w:color="auto" w:val="clear"/>
+            <w:tcMar>
+              <w:top w:type="dxa" w:w="60"/>
+              <w:left w:type="dxa" w:w="80"/>
+              <w:bottom w:type="dxa" w:w="60"/>
+              <w:right w:type="dxa" w:w="80"/>
+            </w:tcMar>
+          </w:tcPr>
+          <w:p>
+            <w:pPr>
+              <w:spacing w:after="40"/>
+            </w:pPr>
+            <w:r>
+              <w:rPr>
+                <w:b w:val="false"/>
+                <w:bCs w:val="false"/>
+              </w:rPr>
+              <w:t xml:space="preserve">268,200.8822</w:t>
+            </w:r>
+          </w:p>
+        </w:tc>
+        <w:tc>
+          <w:tcPr>
+            <w:tcW w:type="dxa" w:w="1560"/>
+            <w:shd w:fill="F7F7F7" w:color="auto" w:val="clear"/>
+            <w:tcMar>
+              <w:top w:type="dxa" w:w="60"/>
+              <w:left w:type="dxa" w:w="80"/>
+              <w:bottom w:type="dxa" w:w="60"/>
+              <w:right w:type="dxa" w:w="80"/>
+            </w:tcMar>
+          </w:tcPr>
+          <w:p>
+            <w:pPr>
+              <w:spacing w:after="40"/>
+            </w:pPr>
+            <w:r>
+              <w:rPr>
+                <w:b w:val="false"/>
+                <w:bCs w:val="false"/>
+              </w:rPr>
+              <w:t xml:space="preserve">0.0288%</w:t>
+            </w:r>
+          </w:p>
+        </w:tc>
+      </w:tr>
+      <w:tr>
+        <w:tc>
+          <w:tcPr>
+            <w:tcW w:type="dxa" w:w="1400"/>
+            <w:tcMar>
+              <w:top w:type="dxa" w:w="60"/>
+              <w:left w:type="dxa" w:w="80"/>
+              <w:bottom w:type="dxa" w:w="60"/>
+              <w:right w:type="dxa" w:w="80"/>
+            </w:tcMar>
+          </w:tcPr>
+          <w:p>
+            <w:pPr>
+              <w:spacing w:after="40"/>
+            </w:pPr>
+            <w:r>
+              <w:rPr>
+                <w:b w:val="false"/>
+                <w:bCs w:val="false"/>
+              </w:rPr>
+              <w:t xml:space="preserve">E</w:t>
+            </w:r>
+          </w:p>
+        </w:tc>
+        <w:tc>
+          <w:tcPr>
+            <w:tcW w:type="dxa" w:w="2600"/>
+            <w:tcMar>
+              <w:top w:type="dxa" w:w="60"/>
+              <w:left w:type="dxa" w:w="80"/>
+              <w:bottom w:type="dxa" w:w="60"/>
+              <w:right w:type="dxa" w:w="80"/>
+            </w:tcMar>
+          </w:tcPr>
+          <w:p>
+            <w:pPr>
+              <w:spacing w:after="40"/>
+            </w:pPr>
+            <w:r>
+              <w:rPr>
+                <w:b w:val="false"/>
+                <w:bCs w:val="false"/>
+              </w:rPr>
+              <w:t xml:space="preserve">% · usuarios</w:t>
+            </w:r>
+          </w:p>
+        </w:tc>
+        <w:tc>
+          <w:tcPr>
+            <w:tcW w:type="dxa" w:w="1900"/>
+            <w:tcMar>
+              <w:top w:type="dxa" w:w="60"/>
+              <w:left w:type="dxa" w:w="80"/>
+              <w:bottom w:type="dxa" w:w="60"/>
+              <w:right w:type="dxa" w:w="80"/>
+            </w:tcMar>
+          </w:tcPr>
+          <w:p>
+            <w:pPr>
+              <w:spacing w:after="40"/>
+            </w:pPr>
+            <w:r>
+              <w:rPr>
+                <w:b w:val="false"/>
+                <w:bCs w:val="false"/>
+              </w:rPr>
+              <w:t xml:space="preserve">8,036.4764</w:t>
+            </w:r>
+          </w:p>
+        </w:tc>
+        <w:tc>
+          <w:tcPr>
+            <w:tcW w:type="dxa" w:w="1900"/>
+            <w:tcMar>
+              <w:top w:type="dxa" w:w="60"/>
+              <w:left w:type="dxa" w:w="80"/>
+              <w:bottom w:type="dxa" w:w="60"/>
+              <w:right w:type="dxa" w:w="80"/>
+            </w:tcMar>
+          </w:tcPr>
+          <w:p>
+            <w:pPr>
+              <w:spacing w:after="40"/>
+            </w:pPr>
+            <w:r>
+              <w:rPr>
+                <w:b w:val="false"/>
+                <w:bCs w:val="false"/>
+              </w:rPr>
+              <w:t xml:space="preserve">8,036.3005</w:t>
+            </w:r>
+          </w:p>
+        </w:tc>
+        <w:tc>
+          <w:tcPr>
+            <w:tcW w:type="dxa" w:w="1560"/>
+            <w:tcMar>
+              <w:top w:type="dxa" w:w="60"/>
+              <w:left w:type="dxa" w:w="80"/>
+              <w:bottom w:type="dxa" w:w="60"/>
+              <w:right w:type="dxa" w:w="80"/>
+            </w:tcMar>
+          </w:tcPr>
+          <w:p>
+            <w:pPr>
+              <w:spacing w:after="40"/>
+            </w:pPr>
+            <w:r>
+              <w:rPr>
+                <w:b w:val="false"/>
+                <w:bCs w:val="false"/>
+              </w:rPr>
+              <w:t xml:space="preserve">0.0022%</w:t>
+            </w:r>
+          </w:p>
+        </w:tc>
+      </w:tr>
+    </w:tbl>
+    <w:p>
+      <w:pPr>
+        <w:spacing w:after="120"/>
+      </w:pPr>
+      <w:r>
+        <w:t xml:space="preserve">La diferencia entre ambos métodos es menor al 0.03% en las tres variables: sobre los datos simulados (curvas suaves, sin discontinuidades bruscas), Trapecio y Simpson 1/3 son prácticamente equivalentes. Esto confirma la robustez numérica del cálculo de AUC, que servirá como base del análisis de esfuerzo acumulado en la Sección 5 del informe final.</w:t>
+      </w:r>
+    </w:p>
+    <w:p>
+      <w:pPr>
+        <w:pStyle w:val="Heading2"/>
+        <w:spacing w:after="110" w:before="220"/>
+      </w:pPr>
+      <w:r>
+        <w:t xml:space="preserve">4.5 Pruebas automatizadas — tests/test_integration.py</w:t>
+      </w:r>
+    </w:p>
+    <w:tbl>
+      <w:tblPr>
+        <w:tblW w:type="dxa" w:w="9360"/>
+        <w:tblBorders>
+          <w:top w:val="single" w:color="auto" w:sz="4"/>
+          <w:left w:val="single" w:color="auto" w:sz="4"/>
+          <w:bottom w:val="single" w:color="auto" w:sz="4"/>
+          <w:right w:val="single" w:color="auto" w:sz="4"/>
+          <w:insideH w:val="single" w:color="auto" w:sz="4"/>
+          <w:insideV w:val="single" w:color="auto" w:sz="4"/>
+        </w:tblBorders>
+      </w:tblPr>
+      <w:tblGrid>
+        <w:gridCol w:w="4600"/>
+        <w:gridCol w:w="4760"/>
+      </w:tblGrid>
+      <w:tr>
+        <w:trPr>
+          <w:tblHeader/>
+        </w:trPr>
+        <w:tc>
+          <w:tcPr>
+            <w:tcW w:type="dxa" w:w="4600"/>
+            <w:shd w:fill="1F4E79" w:color="auto" w:val="clear"/>
+            <w:tcMar>
+              <w:top w:type="dxa" w:w="60"/>
+              <w:left w:type="dxa" w:w="80"/>
+              <w:bottom w:type="dxa" w:w="60"/>
+              <w:right w:type="dxa" w:w="80"/>
+            </w:tcMar>
+          </w:tcPr>
+          <w:p>
+            <w:pPr>
+              <w:spacing w:after="40"/>
+            </w:pPr>
+            <w:r>
+              <w:rPr>
+                <w:b/>
+                <w:bCs/>
+                <w:color w:val="FFFFFF"/>
+              </w:rPr>
+              <w:t xml:space="preserve">Prueba</w:t>
+            </w:r>
+          </w:p>
+        </w:tc>
+        <w:tc>
+          <w:tcPr>
+            <w:tcW w:type="dxa" w:w="4760"/>
+            <w:shd w:fill="1F4E79" w:color="auto" w:val="clear"/>
+            <w:tcMar>
+              <w:top w:type="dxa" w:w="60"/>
+              <w:left w:type="dxa" w:w="80"/>
+              <w:bottom w:type="dxa" w:w="60"/>
+              <w:right w:type="dxa" w:w="80"/>
+            </w:tcMar>
+          </w:tcPr>
+          <w:p>
+            <w:pPr>
+              <w:spacing w:after="40"/>
+            </w:pPr>
+            <w:r>
+              <w:rPr>
+                <w:b/>
+                <w:bCs/>
+                <w:color w:val="FFFFFF"/>
+              </w:rPr>
+              <w:t xml:space="preserve">Qué verifica</w:t>
+            </w:r>
+          </w:p>
+        </w:tc>
+      </w:tr>
+      <w:tr>
+        <w:tc>
+          <w:tcPr>
+            <w:tcW w:type="dxa" w:w="4600"/>
+            <w:tcMar>
+              <w:top w:type="dxa" w:w="60"/>
+              <w:left w:type="dxa" w:w="80"/>
+              <w:bottom w:type="dxa" w:w="60"/>
+              <w:right w:type="dxa" w:w="80"/>
+            </w:tcMar>
+          </w:tcPr>
+          <w:p>
+            <w:pPr>
+              <w:spacing w:after="40"/>
+            </w:pPr>
+            <w:r>
+              <w:rPr>
+                <w:b w:val="false"/>
+                <w:bCs w:val="false"/>
+              </w:rPr>
+              <w:t xml:space="preserve">test_trapecio_es_exacto_para_funcion_lineal</w:t>
+            </w:r>
+          </w:p>
+        </w:tc>
+        <w:tc>
+          <w:tcPr>
+            <w:tcW w:type="dxa" w:w="4760"/>
+            <w:tcMar>
+              <w:top w:type="dxa" w:w="60"/>
+              <w:left w:type="dxa" w:w="80"/>
+              <w:bottom w:type="dxa" w:w="60"/>
+              <w:right w:type="dxa" w:w="80"/>
+            </w:tcMar>
+          </w:tcPr>
+          <w:p>
+            <w:pPr>
+              <w:spacing w:after="40"/>
+            </w:pPr>
+            <w:r>
+              <w:rPr>
+                <w:b w:val="false"/>
+                <w:bCs w:val="false"/>
+              </w:rPr>
+              <w:t xml:space="preserve">Trapecio es exacto (error ~0) para una función lineal.</w:t>
+            </w:r>
+          </w:p>
+        </w:tc>
+      </w:tr>
+      <w:tr>
+        <w:tc>
+          <w:tcPr>
+            <w:tcW w:type="dxa" w:w="4600"/>
+            <w:shd w:fill="F7F7F7" w:color="auto" w:val="clear"/>
+            <w:tcMar>
+              <w:top w:type="dxa" w:w="60"/>
+              <w:left w:type="dxa" w:w="80"/>
+              <w:bottom w:type="dxa" w:w="60"/>
+              <w:right w:type="dxa" w:w="80"/>
+            </w:tcMar>
+          </w:tcPr>
+          <w:p>
+            <w:pPr>
+              <w:spacing w:after="40"/>
+            </w:pPr>
+            <w:r>
+              <w:rPr>
+                <w:b w:val="false"/>
+                <w:bCs w:val="false"/>
+              </w:rPr>
+              <w:t xml:space="preserve">test_trapecio_valida_longitudes</w:t>
+            </w:r>
+          </w:p>
+        </w:tc>
+        <w:tc>
+          <w:tcPr>
+            <w:tcW w:type="dxa" w:w="4760"/>
+            <w:shd w:fill="F7F7F7" w:color="auto" w:val="clear"/>
+            <w:tcMar>
+              <w:top w:type="dxa" w:w="60"/>
+              <w:left w:type="dxa" w:w="80"/>
+              <w:bottom w:type="dxa" w:w="60"/>
+              <w:right w:type="dxa" w:w="80"/>
+            </w:tcMar>
+          </w:tcPr>
+          <w:p>
+            <w:pPr>
+              <w:spacing w:after="40"/>
+            </w:pPr>
+            <w:r>
+              <w:rPr>
+                <w:b w:val="false"/>
+                <w:bCs w:val="false"/>
+              </w:rPr>
+              <w:t xml:space="preserve">Se lanza ValueError si x e y no tienen la misma longitud.</w:t>
+            </w:r>
+          </w:p>
+        </w:tc>
+      </w:tr>
+      <w:tr>
+        <w:tc>
+          <w:tcPr>
+            <w:tcW w:type="dxa" w:w="4600"/>
+            <w:tcMar>
+              <w:top w:type="dxa" w:w="60"/>
+              <w:left w:type="dxa" w:w="80"/>
+              <w:bottom w:type="dxa" w:w="60"/>
+              <w:right w:type="dxa" w:w="80"/>
+            </w:tcMar>
+          </w:tcPr>
+          <w:p>
+            <w:pPr>
+              <w:spacing w:after="40"/>
+            </w:pPr>
+            <w:r>
+              <w:rPr>
+                <w:b w:val="false"/>
+                <w:bCs w:val="false"/>
+              </w:rPr>
+              <w:t xml:space="preserve">test_trapecio_valida_minimo_de_puntos</w:t>
+            </w:r>
+          </w:p>
+        </w:tc>
+        <w:tc>
+          <w:tcPr>
+            <w:tcW w:type="dxa" w:w="4760"/>
+            <w:tcMar>
+              <w:top w:type="dxa" w:w="60"/>
+              <w:left w:type="dxa" w:w="80"/>
+              <w:bottom w:type="dxa" w:w="60"/>
+              <w:right w:type="dxa" w:w="80"/>
+            </w:tcMar>
+          </w:tcPr>
+          <w:p>
+            <w:pPr>
+              <w:spacing w:after="40"/>
+            </w:pPr>
+            <w:r>
+              <w:rPr>
+                <w:b w:val="false"/>
+                <w:bCs w:val="false"/>
+              </w:rPr>
+              <w:t xml:space="preserve">Se lanza ValueError con menos de 2 puntos.</w:t>
+            </w:r>
+          </w:p>
+        </w:tc>
+      </w:tr>
+      <w:tr>
+        <w:tc>
+          <w:tcPr>
+            <w:tcW w:type="dxa" w:w="4600"/>
+            <w:shd w:fill="F7F7F7" w:color="auto" w:val="clear"/>
+            <w:tcMar>
+              <w:top w:type="dxa" w:w="60"/>
+              <w:left w:type="dxa" w:w="80"/>
+              <w:bottom w:type="dxa" w:w="60"/>
+              <w:right w:type="dxa" w:w="80"/>
+            </w:tcMar>
+          </w:tcPr>
+          <w:p>
+            <w:pPr>
+              <w:spacing w:after="40"/>
+            </w:pPr>
+            <w:r>
+              <w:rPr>
+                <w:b w:val="false"/>
+                <w:bCs w:val="false"/>
+              </w:rPr>
+              <w:t xml:space="preserve">test_simpson_es_exacto_para_funcion_cubica</w:t>
+            </w:r>
+          </w:p>
+        </w:tc>
+        <w:tc>
+          <w:tcPr>
+            <w:tcW w:type="dxa" w:w="4760"/>
+            <w:shd w:fill="F7F7F7" w:color="auto" w:val="clear"/>
+            <w:tcMar>
+              <w:top w:type="dxa" w:w="60"/>
+              <w:left w:type="dxa" w:w="80"/>
+              <w:bottom w:type="dxa" w:w="60"/>
+              <w:right w:type="dxa" w:w="80"/>
+            </w:tcMar>
+          </w:tcPr>
+          <w:p>
+            <w:pPr>
+              <w:spacing w:after="40"/>
+            </w:pPr>
+            <w:r>
+              <w:rPr>
+                <w:b w:val="false"/>
+                <w:bCs w:val="false"/>
+              </w:rPr>
+              <w:t xml:space="preserve">Simpson 1/3 es exacto (error ~0) para una función cúbica.</w:t>
+            </w:r>
+          </w:p>
+        </w:tc>
+      </w:tr>
+      <w:tr>
+        <w:tc>
+          <w:tcPr>
+            <w:tcW w:type="dxa" w:w="4600"/>
+            <w:tcMar>
+              <w:top w:type="dxa" w:w="60"/>
+              <w:left w:type="dxa" w:w="80"/>
+              <w:bottom w:type="dxa" w:w="60"/>
+              <w:right w:type="dxa" w:w="80"/>
+            </w:tcMar>
+          </w:tcPr>
+          <w:p>
+            <w:pPr>
+              <w:spacing w:after="40"/>
+            </w:pPr>
+            <w:r>
+              <w:rPr>
+                <w:b w:val="false"/>
+                <w:bCs w:val="false"/>
+              </w:rPr>
+              <w:t xml:space="preserve">test_simpson_requiere_numero_par_de_subintervalos</w:t>
+            </w:r>
+          </w:p>
+        </w:tc>
+        <w:tc>
+          <w:tcPr>
+            <w:tcW w:type="dxa" w:w="4760"/>
+            <w:tcMar>
+              <w:top w:type="dxa" w:w="60"/>
+              <w:left w:type="dxa" w:w="80"/>
+              <w:bottom w:type="dxa" w:w="60"/>
+              <w:right w:type="dxa" w:w="80"/>
+            </w:tcMar>
+          </w:tcPr>
+          <w:p>
+            <w:pPr>
+              <w:spacing w:after="40"/>
+            </w:pPr>
+            <w:r>
+              <w:rPr>
+                <w:b w:val="false"/>
+                <w:bCs w:val="false"/>
+              </w:rPr>
+              <w:t xml:space="preserve">Se lanza ValueError con número impar de subintervalos.</w:t>
+            </w:r>
+          </w:p>
+        </w:tc>
+      </w:tr>
+      <w:tr>
+        <w:tc>
+          <w:tcPr>
+            <w:tcW w:type="dxa" w:w="4600"/>
+            <w:shd w:fill="F7F7F7" w:color="auto" w:val="clear"/>
+            <w:tcMar>
+              <w:top w:type="dxa" w:w="60"/>
+              <w:left w:type="dxa" w:w="80"/>
+              <w:bottom w:type="dxa" w:w="60"/>
+              <w:right w:type="dxa" w:w="80"/>
+            </w:tcMar>
+          </w:tcPr>
+          <w:p>
+            <w:pPr>
+              <w:spacing w:after="40"/>
+            </w:pPr>
+            <w:r>
+              <w:rPr>
+                <w:b w:val="false"/>
+                <w:bCs w:val="false"/>
+              </w:rPr>
+              <w:t xml:space="preserve">test_simpson_requiere_puntos_equiespaciados</w:t>
+            </w:r>
+          </w:p>
+        </w:tc>
+        <w:tc>
+          <w:tcPr>
+            <w:tcW w:type="dxa" w:w="4760"/>
+            <w:shd w:fill="F7F7F7" w:color="auto" w:val="clear"/>
+            <w:tcMar>
+              <w:top w:type="dxa" w:w="60"/>
+              <w:left w:type="dxa" w:w="80"/>
+              <w:bottom w:type="dxa" w:w="60"/>
+              <w:right w:type="dxa" w:w="80"/>
+            </w:tcMar>
+          </w:tcPr>
+          <w:p>
+            <w:pPr>
+              <w:spacing w:after="40"/>
+            </w:pPr>
+            <w:r>
+              <w:rPr>
+                <w:b w:val="false"/>
+                <w:bCs w:val="false"/>
+              </w:rPr>
+              <w:t xml:space="preserve">Se lanza ValueError con espaciado irregular.</w:t>
+            </w:r>
+          </w:p>
+        </w:tc>
+      </w:tr>
+      <w:tr>
+        <w:tc>
+          <w:tcPr>
+            <w:tcW w:type="dxa" w:w="4600"/>
+            <w:tcMar>
+              <w:top w:type="dxa" w:w="60"/>
+              <w:left w:type="dxa" w:w="80"/>
+              <w:bottom w:type="dxa" w:w="60"/>
+              <w:right w:type="dxa" w:w="80"/>
+            </w:tcMar>
+          </w:tcPr>
+          <w:p>
+            <w:pPr>
+              <w:spacing w:after="40"/>
+            </w:pPr>
+            <w:r>
+              <w:rPr>
+                <w:b w:val="false"/>
+                <w:bCs w:val="false"/>
+              </w:rPr>
+              <w:t xml:space="preserve">test_simpson_es_mas_preciso_que_trapecio_en_funcion_no_polinomica</w:t>
+            </w:r>
+          </w:p>
+        </w:tc>
+        <w:tc>
+          <w:tcPr>
+            <w:tcW w:type="dxa" w:w="4760"/>
+            <w:tcMar>
+              <w:top w:type="dxa" w:w="60"/>
+              <w:left w:type="dxa" w:w="80"/>
+              <w:bottom w:type="dxa" w:w="60"/>
+              <w:right w:type="dxa" w:w="80"/>
+            </w:tcMar>
+          </w:tcPr>
+          <w:p>
+            <w:pPr>
+              <w:spacing w:after="40"/>
+            </w:pPr>
+            <w:r>
+              <w:rPr>
+                <w:b w:val="false"/>
+                <w:bCs w:val="false"/>
+              </w:rPr>
+              <w:t xml:space="preserve">El error de Simpson es menor al de Trapecio en sin(x).</w:t>
+            </w:r>
+          </w:p>
+        </w:tc>
+      </w:tr>
+      <w:tr>
+        <w:tc>
+          <w:tcPr>
+            <w:tcW w:type="dxa" w:w="4600"/>
+            <w:shd w:fill="F7F7F7" w:color="auto" w:val="clear"/>
+            <w:tcMar>
+              <w:top w:type="dxa" w:w="60"/>
+              <w:left w:type="dxa" w:w="80"/>
+              <w:bottom w:type="dxa" w:w="60"/>
+              <w:right w:type="dxa" w:w="80"/>
+            </w:tcMar>
+          </w:tcPr>
+          <w:p>
+            <w:pPr>
+              <w:spacing w:after="40"/>
+            </w:pPr>
+            <w:r>
+              <w:rPr>
+                <w:b w:val="false"/>
+                <w:bCs w:val="false"/>
+              </w:rPr>
+              <w:t xml:space="preserve">test_calcular_auc_estructura_y_columnas</w:t>
+            </w:r>
+          </w:p>
+        </w:tc>
+        <w:tc>
+          <w:tcPr>
+            <w:tcW w:type="dxa" w:w="4760"/>
+            <w:shd w:fill="F7F7F7" w:color="auto" w:val="clear"/>
+            <w:tcMar>
+              <w:top w:type="dxa" w:w="60"/>
+              <w:left w:type="dxa" w:w="80"/>
+              <w:bottom w:type="dxa" w:w="60"/>
+              <w:right w:type="dxa" w:w="80"/>
+            </w:tcMar>
+          </w:tcPr>
+          <w:p>
+            <w:pPr>
+              <w:spacing w:after="40"/>
+            </w:pPr>
+            <w:r>
+              <w:rPr>
+                <w:b w:val="false"/>
+                <w:bCs w:val="false"/>
+              </w:rPr>
+              <w:t xml:space="preserve">El DataFrame de AUC tiene las columnas y valores no negativos esperados.</w:t>
+            </w:r>
+          </w:p>
+        </w:tc>
+      </w:tr>
+      <w:tr>
+        <w:tc>
+          <w:tcPr>
+            <w:tcW w:type="dxa" w:w="4600"/>
+            <w:tcMar>
+              <w:top w:type="dxa" w:w="60"/>
+              <w:left w:type="dxa" w:w="80"/>
+              <w:bottom w:type="dxa" w:w="60"/>
+              <w:right w:type="dxa" w:w="80"/>
+            </w:tcMar>
+          </w:tcPr>
+          <w:p>
+            <w:pPr>
+              <w:spacing w:after="40"/>
+            </w:pPr>
+            <w:r>
+              <w:rPr>
+                <w:b w:val="false"/>
+                <w:bCs w:val="false"/>
+              </w:rPr>
+              <w:t xml:space="preserve">test_calcular_auc_diferencia_porcentual_es_pequena</w:t>
+            </w:r>
+          </w:p>
+        </w:tc>
+        <w:tc>
+          <w:tcPr>
+            <w:tcW w:type="dxa" w:w="4760"/>
+            <w:tcMar>
+              <w:top w:type="dxa" w:w="60"/>
+              <w:left w:type="dxa" w:w="80"/>
+              <w:bottom w:type="dxa" w:w="60"/>
+              <w:right w:type="dxa" w:w="80"/>
+            </w:tcMar>
+          </w:tcPr>
+          <w:p>
+            <w:pPr>
+              <w:spacing w:after="40"/>
+            </w:pPr>
+            <w:r>
+              <w:rPr>
+                <w:b w:val="false"/>
+                <w:bCs w:val="false"/>
+              </w:rPr>
+              <w:t xml:space="preserve">La diferencia % entre métodos es menor al 1% con n=101.</w:t>
+            </w:r>
+          </w:p>
+        </w:tc>
+      </w:tr>
+      <w:tr>
+        <w:tc>
+          <w:tcPr>
+            <w:tcW w:type="dxa" w:w="4600"/>
+            <w:shd w:fill="F7F7F7" w:color="auto" w:val="clear"/>
+            <w:tcMar>
+              <w:top w:type="dxa" w:w="60"/>
+              <w:left w:type="dxa" w:w="80"/>
+              <w:bottom w:type="dxa" w:w="60"/>
+              <w:right w:type="dxa" w:w="80"/>
+            </w:tcMar>
+          </w:tcPr>
+          <w:p>
+            <w:pPr>
+              <w:spacing w:after="40"/>
+            </w:pPr>
+            <w:r>
+              <w:rPr>
+                <w:b w:val="false"/>
+                <w:bCs w:val="false"/>
+              </w:rPr>
+              <w:t xml:space="preserve">test_validar_precision_simpson_tiene_error_casi_nulo_en_cubica</w:t>
+            </w:r>
+          </w:p>
+        </w:tc>
+        <w:tc>
+          <w:tcPr>
+            <w:tcW w:type="dxa" w:w="4760"/>
+            <w:shd w:fill="F7F7F7" w:color="auto" w:val="clear"/>
+            <w:tcMar>
+              <w:top w:type="dxa" w:w="60"/>
+              <w:left w:type="dxa" w:w="80"/>
+              <w:bottom w:type="dxa" w:w="60"/>
+              <w:right w:type="dxa" w:w="80"/>
+            </w:tcMar>
+          </w:tcPr>
+          <w:p>
+            <w:pPr>
+              <w:spacing w:after="40"/>
+            </w:pPr>
+            <w:r>
+              <w:rPr>
+                <w:b w:val="false"/>
+                <w:bCs w:val="false"/>
+              </w:rPr>
+              <w:t xml:space="preserve">El error de Simpson en el caso cúbico es menor a 1e-6%.</w:t>
+            </w:r>
+          </w:p>
+        </w:tc>
+      </w:tr>
+      <w:tr>
+        <w:tc>
+          <w:tcPr>
+            <w:tcW w:type="dxa" w:w="4600"/>
+            <w:tcMar>
+              <w:top w:type="dxa" w:w="60"/>
+              <w:left w:type="dxa" w:w="80"/>
+              <w:bottom w:type="dxa" w:w="60"/>
+              <w:right w:type="dxa" w:w="80"/>
+            </w:tcMar>
+          </w:tcPr>
+          <w:p>
+            <w:pPr>
+              <w:spacing w:after="40"/>
+            </w:pPr>
+            <w:r>
+              <w:rPr>
+                <w:b w:val="false"/>
+                <w:bCs w:val="false"/>
+              </w:rPr>
+              <w:t xml:space="preserve">test_validar_precision_simpson_supera_a_trapecio_en_seno</w:t>
+            </w:r>
+          </w:p>
+        </w:tc>
+        <w:tc>
+          <w:tcPr>
+            <w:tcW w:type="dxa" w:w="4760"/>
+            <w:tcMar>
+              <w:top w:type="dxa" w:w="60"/>
+              <w:left w:type="dxa" w:w="80"/>
+              <w:bottom w:type="dxa" w:w="60"/>
+              <w:right w:type="dxa" w:w="80"/>
+            </w:tcMar>
+          </w:tcPr>
+          <w:p>
+            <w:pPr>
+              <w:spacing w:after="40"/>
+            </w:pPr>
+            <w:r>
+              <w:rPr>
+                <w:b w:val="false"/>
+                <w:bCs w:val="false"/>
+              </w:rPr>
+              <w:t xml:space="preserve">El error de Simpson es menor al de Trapecio en el caso seno.</w:t>
+            </w:r>
+          </w:p>
+        </w:tc>
+      </w:tr>
+    </w:tbl>
+    <w:p>
+      <w:pPr>
+        <w:spacing w:after="120"/>
+      </w:pPr>
+      <w:r>
+        <w:t xml:space="preserve">Resultado de la ejecución en el entorno de desarrollo: 11 passed (pytest tests/test_integration.py -v); 23 passed sobre el proyecto completo (pytest tests/ -v).</w:t>
+      </w:r>
+    </w:p>
+    <w:p>
+      <w:pPr>
+        <w:pStyle w:val="Heading3"/>
+        <w:spacing w:after="80" w:before="160"/>
+      </w:pPr>
+      <w:r>
+        <w:t xml:space="preserve">Evidencia de ejecución del equipo</w:t>
+      </w:r>
+    </w:p>
+    <w:p>
+      <w:pPr>
+        <w:spacing w:after="120"/>
+      </w:pPr>
+      <w:r>
+        <w:t xml:space="preserve">Ejecutado por Jose Andrés Ortiz Marín en su máquina local (Windows, Python 3.14.4):</w:t>
+      </w:r>
+    </w:p>
+    <w:p>
+      <w:pPr>
+        <w:shd w:fill="F2F2F2" w:color="auto" w:val="clear"/>
+        <w:spacing w:after="0" w:before="60"/>
+        <w:ind w:left="200"/>
+      </w:pPr>
+      <w:r>
+        <w:rPr>
+          <w:rFonts w:ascii="Consolas" w:cs="Consolas" w:eastAsia="Consolas" w:hAnsi="Consolas"/>
+          <w:sz w:val="17"/>
+          <w:szCs w:val="17"/>
+        </w:rPr>
+        <w:t xml:space="preserve">=========================================== test session starts ===========================================</w:t>
+      </w:r>
+    </w:p>
+    <w:p>
+      <w:pPr>
+        <w:shd w:fill="F2F2F2" w:color="auto" w:val="clear"/>
+        <w:spacing w:after="0" w:before="0"/>
+        <w:ind w:left="200"/>
+      </w:pPr>
+      <w:r>
+        <w:rPr>
+          <w:rFonts w:ascii="Consolas" w:cs="Consolas" w:eastAsia="Consolas" w:hAnsi="Consolas"/>
+          <w:sz w:val="17"/>
+          <w:szCs w:val="17"/>
+        </w:rPr>
+        <w:t xml:space="preserve">platform win32 -- Python 3.14.4, pytest-9.1.1, pluggy-1.6.0 -- C:\Users\ortiz\OneDrive\Desktop\PruebasEstres\venv\Scripts\python.exe</w:t>
+      </w:r>
+    </w:p>
+    <w:p>
+      <w:pPr>
+        <w:shd w:fill="F2F2F2" w:color="auto" w:val="clear"/>
+        <w:spacing w:after="0" w:before="0"/>
+        <w:ind w:left="200"/>
+      </w:pPr>
+      <w:r>
+        <w:rPr>
+          <w:rFonts w:ascii="Consolas" w:cs="Consolas" w:eastAsia="Consolas" w:hAnsi="Consolas"/>
+          <w:sz w:val="17"/>
+          <w:szCs w:val="17"/>
+        </w:rPr>
+        <w:t xml:space="preserve">cachedir: .pytest_cache</w:t>
+      </w:r>
+    </w:p>
+    <w:p>
+      <w:pPr>
+        <w:shd w:fill="F2F2F2" w:color="auto" w:val="clear"/>
+        <w:spacing w:after="0" w:before="0"/>
+        <w:ind w:left="200"/>
+      </w:pPr>
+      <w:r>
+        <w:rPr>
+          <w:rFonts w:ascii="Consolas" w:cs="Consolas" w:eastAsia="Consolas" w:hAnsi="Consolas"/>
+          <w:sz w:val="17"/>
+          <w:szCs w:val="17"/>
+        </w:rPr>
+        <w:t xml:space="preserve">rootdir: C:\Users\ortiz\OneDrive\Desktop\PruebasEstres</w:t>
+      </w:r>
+    </w:p>
+    <w:p>
+      <w:pPr>
+        <w:shd w:fill="F2F2F2" w:color="auto" w:val="clear"/>
+        <w:spacing w:after="0" w:before="0"/>
+        <w:ind w:left="200"/>
+      </w:pPr>
+      <w:r>
+        <w:rPr>
+          <w:rFonts w:ascii="Consolas" w:cs="Consolas" w:eastAsia="Consolas" w:hAnsi="Consolas"/>
+          <w:sz w:val="17"/>
+          <w:szCs w:val="17"/>
+        </w:rPr>
+        <w:t xml:space="preserve">collected 11 items</w:t>
+      </w:r>
+    </w:p>
+    <w:p>
+      <w:pPr>
+        <w:shd w:fill="F2F2F2" w:color="auto" w:val="clear"/>
+        <w:spacing w:after="0" w:before="0"/>
+        <w:ind w:left="200"/>
+      </w:pPr>
+      <w:r>
+        <w:rPr>
+          <w:rFonts w:ascii="Consolas" w:cs="Consolas" w:eastAsia="Consolas" w:hAnsi="Consolas"/>
+          <w:sz w:val="17"/>
+          <w:szCs w:val="17"/>
+        </w:rPr>
+        <w:t xml:space="preserve"> </w:t>
+      </w:r>
+    </w:p>
+    <w:p>
+      <w:pPr>
+        <w:shd w:fill="F2F2F2" w:color="auto" w:val="clear"/>
+        <w:spacing w:after="0" w:before="0"/>
+        <w:ind w:left="200"/>
+      </w:pPr>
+      <w:r>
+        <w:rPr>
+          <w:rFonts w:ascii="Consolas" w:cs="Consolas" w:eastAsia="Consolas" w:hAnsi="Consolas"/>
+          <w:sz w:val="17"/>
+          <w:szCs w:val="17"/>
+        </w:rPr>
+        <w:t xml:space="preserve">tests/test_integration.py::test_trapecio_es_exacto_para_funcion_lineal PASSED                        [  9%]</w:t>
+      </w:r>
+    </w:p>
+    <w:p>
+      <w:pPr>
+        <w:shd w:fill="F2F2F2" w:color="auto" w:val="clear"/>
+        <w:spacing w:after="0" w:before="0"/>
+        <w:ind w:left="200"/>
+      </w:pPr>
+      <w:r>
+        <w:rPr>
+          <w:rFonts w:ascii="Consolas" w:cs="Consolas" w:eastAsia="Consolas" w:hAnsi="Consolas"/>
+          <w:sz w:val="17"/>
+          <w:szCs w:val="17"/>
+        </w:rPr>
+        <w:t xml:space="preserve">tests/test_integration.py::test_trapecio_valida_longitudes PASSED                                    [ 18%]</w:t>
+      </w:r>
+    </w:p>
+    <w:p>
+      <w:pPr>
+        <w:shd w:fill="F2F2F2" w:color="auto" w:val="clear"/>
+        <w:spacing w:after="0" w:before="0"/>
+        <w:ind w:left="200"/>
+      </w:pPr>
+      <w:r>
+        <w:rPr>
+          <w:rFonts w:ascii="Consolas" w:cs="Consolas" w:eastAsia="Consolas" w:hAnsi="Consolas"/>
+          <w:sz w:val="17"/>
+          <w:szCs w:val="17"/>
+        </w:rPr>
+        <w:t xml:space="preserve">tests/test_integration.py::test_trapecio_valida_minimo_de_puntos PASSED                              [ 27%]</w:t>
+      </w:r>
+    </w:p>
+    <w:p>
+      <w:pPr>
+        <w:shd w:fill="F2F2F2" w:color="auto" w:val="clear"/>
+        <w:spacing w:after="0" w:before="0"/>
+        <w:ind w:left="200"/>
+      </w:pPr>
+      <w:r>
+        <w:rPr>
+          <w:rFonts w:ascii="Consolas" w:cs="Consolas" w:eastAsia="Consolas" w:hAnsi="Consolas"/>
+          <w:sz w:val="17"/>
+          <w:szCs w:val="17"/>
+        </w:rPr>
+        <w:t xml:space="preserve">tests/test_integration.py::test_simpson_es_exacto_para_funcion_cubica PASSED                         [ 36%]</w:t>
+      </w:r>
+    </w:p>
+    <w:p>
+      <w:pPr>
+        <w:shd w:fill="F2F2F2" w:color="auto" w:val="clear"/>
+        <w:spacing w:after="0" w:before="0"/>
+        <w:ind w:left="200"/>
+      </w:pPr>
+      <w:r>
+        <w:rPr>
+          <w:rFonts w:ascii="Consolas" w:cs="Consolas" w:eastAsia="Consolas" w:hAnsi="Consolas"/>
+          <w:sz w:val="17"/>
+          <w:szCs w:val="17"/>
+        </w:rPr>
+        <w:t xml:space="preserve">tests/test_integration.py::test_simpson_requiere_numero_par_de_subintervalos PASSED                  [ 45%]</w:t>
+      </w:r>
+    </w:p>
+    <w:p>
+      <w:pPr>
+        <w:shd w:fill="F2F2F2" w:color="auto" w:val="clear"/>
+        <w:spacing w:after="0" w:before="0"/>
+        <w:ind w:left="200"/>
+      </w:pPr>
+      <w:r>
+        <w:rPr>
+          <w:rFonts w:ascii="Consolas" w:cs="Consolas" w:eastAsia="Consolas" w:hAnsi="Consolas"/>
+          <w:sz w:val="17"/>
+          <w:szCs w:val="17"/>
+        </w:rPr>
+        <w:t xml:space="preserve">tests/test_integration.py::test_simpson_requiere_puntos_equiespaciados PASSED                        [ 54%]</w:t>
+      </w:r>
+    </w:p>
+    <w:p>
+      <w:pPr>
+        <w:shd w:fill="F2F2F2" w:color="auto" w:val="clear"/>
+        <w:spacing w:after="0" w:before="0"/>
+        <w:ind w:left="200"/>
+      </w:pPr>
+      <w:r>
+        <w:rPr>
+          <w:rFonts w:ascii="Consolas" w:cs="Consolas" w:eastAsia="Consolas" w:hAnsi="Consolas"/>
+          <w:sz w:val="17"/>
+          <w:szCs w:val="17"/>
+        </w:rPr>
+        <w:t xml:space="preserve">tests/test_integration.py::test_simpson_es_mas_preciso_que_trapecio_en_funcion_no_polinomica PASSED  [ 63%]</w:t>
+      </w:r>
+    </w:p>
+    <w:p>
+      <w:pPr>
+        <w:shd w:fill="F2F2F2" w:color="auto" w:val="clear"/>
+        <w:spacing w:after="0" w:before="0"/>
+        <w:ind w:left="200"/>
+      </w:pPr>
+      <w:r>
+        <w:rPr>
+          <w:rFonts w:ascii="Consolas" w:cs="Consolas" w:eastAsia="Consolas" w:hAnsi="Consolas"/>
+          <w:sz w:val="17"/>
+          <w:szCs w:val="17"/>
+        </w:rPr>
+        <w:t xml:space="preserve">tests/test_integration.py::test_calcular_auc_estructura_y_columnas PASSED                            [ 72%]</w:t>
+      </w:r>
+    </w:p>
+    <w:p>
+      <w:pPr>
+        <w:shd w:fill="F2F2F2" w:color="auto" w:val="clear"/>
+        <w:spacing w:after="0" w:before="0"/>
+        <w:ind w:left="200"/>
+      </w:pPr>
+      <w:r>
+        <w:rPr>
+          <w:rFonts w:ascii="Consolas" w:cs="Consolas" w:eastAsia="Consolas" w:hAnsi="Consolas"/>
+          <w:sz w:val="17"/>
+          <w:szCs w:val="17"/>
+        </w:rPr>
+        <w:t xml:space="preserve">tests/test_integration.py::test_calcular_auc_diferencia_porcentual_es_pequena PASSED                 [ 81%]</w:t>
+      </w:r>
+    </w:p>
+    <w:p>
+      <w:pPr>
+        <w:shd w:fill="F2F2F2" w:color="auto" w:val="clear"/>
+        <w:spacing w:after="0" w:before="0"/>
+        <w:ind w:left="200"/>
+      </w:pPr>
+      <w:r>
+        <w:rPr>
+          <w:rFonts w:ascii="Consolas" w:cs="Consolas" w:eastAsia="Consolas" w:hAnsi="Consolas"/>
+          <w:sz w:val="17"/>
+          <w:szCs w:val="17"/>
+        </w:rPr>
+        <w:t xml:space="preserve">tests/test_integration.py::test_validar_precision_simpson_tiene_error_casi_nulo_en_cubica PASSED     [ 90%]</w:t>
+      </w:r>
+    </w:p>
+    <w:p>
+      <w:pPr>
+        <w:shd w:fill="F2F2F2" w:color="auto" w:val="clear"/>
+        <w:spacing w:after="0" w:before="0"/>
+        <w:ind w:left="200"/>
+      </w:pPr>
+      <w:r>
+        <w:rPr>
+          <w:rFonts w:ascii="Consolas" w:cs="Consolas" w:eastAsia="Consolas" w:hAnsi="Consolas"/>
+          <w:sz w:val="17"/>
+          <w:szCs w:val="17"/>
+        </w:rPr>
+        <w:t xml:space="preserve">tests/test_integration.py::test_validar_precision_simpson_supera_a_trapecio_en_seno PASSED           [100%]</w:t>
+      </w:r>
+    </w:p>
+    <w:p>
+      <w:pPr>
+        <w:shd w:fill="F2F2F2" w:color="auto" w:val="clear"/>
+        <w:spacing w:after="0" w:before="0"/>
+        <w:ind w:left="200"/>
+      </w:pPr>
+      <w:r>
+        <w:rPr>
+          <w:rFonts w:ascii="Consolas" w:cs="Consolas" w:eastAsia="Consolas" w:hAnsi="Consolas"/>
+          <w:sz w:val="17"/>
+          <w:szCs w:val="17"/>
+        </w:rPr>
+        <w:t xml:space="preserve"> </w:t>
+      </w:r>
+    </w:p>
+    <w:p>
+      <w:pPr>
+        <w:shd w:fill="F2F2F2" w:color="auto" w:val="clear"/>
+        <w:spacing w:after="120" w:before="0"/>
+        <w:ind w:left="200"/>
+      </w:pPr>
+      <w:r>
+        <w:rPr>
+          <w:rFonts w:ascii="Consolas" w:cs="Consolas" w:eastAsia="Consolas" w:hAnsi="Consolas"/>
+          <w:sz w:val="17"/>
+          <w:szCs w:val="17"/>
+        </w:rPr>
+        <w:t xml:space="preserve">=========================================== 11 passed in 0.84s ============================================</w:t>
+      </w:r>
+    </w:p>
+    <w:p>
+      <w:pPr>
+        <w:shd w:fill="F2F2F2" w:color="auto" w:val="clear"/>
+        <w:spacing w:after="0" w:before="60"/>
+        <w:ind w:left="200"/>
+      </w:pPr>
+      <w:r>
+        <w:rPr>
+          <w:rFonts w:ascii="Consolas" w:cs="Consolas" w:eastAsia="Consolas" w:hAnsi="Consolas"/>
+          <w:sz w:val="17"/>
+          <w:szCs w:val="17"/>
+        </w:rPr>
+        <w:t xml:space="preserve">=========================================== test session starts ===========================================</w:t>
+      </w:r>
+    </w:p>
+    <w:p>
+      <w:pPr>
+        <w:shd w:fill="F2F2F2" w:color="auto" w:val="clear"/>
+        <w:spacing w:after="0" w:before="0"/>
+        <w:ind w:left="200"/>
+      </w:pPr>
+      <w:r>
+        <w:rPr>
+          <w:rFonts w:ascii="Consolas" w:cs="Consolas" w:eastAsia="Consolas" w:hAnsi="Consolas"/>
+          <w:sz w:val="17"/>
+          <w:szCs w:val="17"/>
+        </w:rPr>
+        <w:t xml:space="preserve">platform win32 -- Python 3.14.4, pytest-9.1.1, pluggy-1.6.0</w:t>
+      </w:r>
+    </w:p>
+    <w:p>
+      <w:pPr>
+        <w:shd w:fill="F2F2F2" w:color="auto" w:val="clear"/>
+        <w:spacing w:after="0" w:before="0"/>
+        <w:ind w:left="200"/>
+      </w:pPr>
+      <w:r>
+        <w:rPr>
+          <w:rFonts w:ascii="Consolas" w:cs="Consolas" w:eastAsia="Consolas" w:hAnsi="Consolas"/>
+          <w:sz w:val="17"/>
+          <w:szCs w:val="17"/>
+        </w:rPr>
+        <w:t xml:space="preserve">collected 23 items</w:t>
+      </w:r>
+    </w:p>
+    <w:p>
+      <w:pPr>
+        <w:shd w:fill="F2F2F2" w:color="auto" w:val="clear"/>
+        <w:spacing w:after="0" w:before="0"/>
+        <w:ind w:left="200"/>
+      </w:pPr>
+      <w:r>
+        <w:rPr>
+          <w:rFonts w:ascii="Consolas" w:cs="Consolas" w:eastAsia="Consolas" w:hAnsi="Consolas"/>
+          <w:sz w:val="17"/>
+          <w:szCs w:val="17"/>
+        </w:rPr>
+        <w:t xml:space="preserve"> </w:t>
+      </w:r>
+    </w:p>
+    <w:p>
+      <w:pPr>
+        <w:shd w:fill="F2F2F2" w:color="auto" w:val="clear"/>
+        <w:spacing w:after="0" w:before="0"/>
+        <w:ind w:left="200"/>
+      </w:pPr>
+      <w:r>
+        <w:rPr>
+          <w:rFonts w:ascii="Consolas" w:cs="Consolas" w:eastAsia="Consolas" w:hAnsi="Consolas"/>
+          <w:sz w:val="17"/>
+          <w:szCs w:val="17"/>
+        </w:rPr>
+        <w:t xml:space="preserve">tests/test_calibration.py ....  tests/test_integration.py ...........  tests/test_simulation.py ........</w:t>
+      </w:r>
+    </w:p>
+    <w:p>
+      <w:pPr>
+        <w:shd w:fill="F2F2F2" w:color="auto" w:val="clear"/>
+        <w:spacing w:after="0" w:before="0"/>
+        <w:ind w:left="200"/>
+      </w:pPr>
+      <w:r>
+        <w:rPr>
+          <w:rFonts w:ascii="Consolas" w:cs="Consolas" w:eastAsia="Consolas" w:hAnsi="Consolas"/>
+          <w:sz w:val="17"/>
+          <w:szCs w:val="17"/>
+        </w:rPr>
+        <w:t xml:space="preserve"> </w:t>
+      </w:r>
+    </w:p>
+    <w:p>
+      <w:pPr>
+        <w:shd w:fill="F2F2F2" w:color="auto" w:val="clear"/>
+        <w:spacing w:after="120" w:before="0"/>
+        <w:ind w:left="200"/>
+      </w:pPr>
+      <w:r>
+        <w:rPr>
+          <w:rFonts w:ascii="Consolas" w:cs="Consolas" w:eastAsia="Consolas" w:hAnsi="Consolas"/>
+          <w:sz w:val="17"/>
+          <w:szCs w:val="17"/>
+        </w:rPr>
+        <w:t xml:space="preserve">=========================================== 23 passed in 1.21s ============================================</w:t>
+      </w:r>
+    </w:p>
+    <w:p>
+      <w:pPr>
+        <w:shd w:fill="F2F2F2" w:color="auto" w:val="clear"/>
+        <w:spacing w:after="0" w:before="60"/>
+        <w:ind w:left="200"/>
+      </w:pPr>
+      <w:r>
+        <w:rPr>
+          <w:rFonts w:ascii="Consolas" w:cs="Consolas" w:eastAsia="Consolas" w:hAnsi="Consolas"/>
+          <w:sz w:val="17"/>
+          <w:szCs w:val="17"/>
+        </w:rPr>
+        <w:t xml:space="preserve">=== Validación con integrales de solución conocida ===</w:t>
+      </w:r>
+    </w:p>
+    <w:p>
+      <w:pPr>
+        <w:shd w:fill="F2F2F2" w:color="auto" w:val="clear"/>
+        <w:spacing w:after="0" w:before="0"/>
+        <w:ind w:left="200"/>
+      </w:pPr>
+      <w:r>
+        <w:rPr>
+          <w:rFonts w:ascii="Consolas" w:cs="Consolas" w:eastAsia="Consolas" w:hAnsi="Consolas"/>
+          <w:sz w:val="17"/>
+          <w:szCs w:val="17"/>
+        </w:rPr>
+        <w:t xml:space="preserve">                caso  integral_exacta  auc_trapecio  error_trapecio_%  auc_simpson  error_simpson_%</w:t>
+      </w:r>
+    </w:p>
+    <w:p>
+      <w:pPr>
+        <w:shd w:fill="F2F2F2" w:color="auto" w:val="clear"/>
+        <w:spacing w:after="0" w:before="0"/>
+        <w:ind w:left="200"/>
+      </w:pPr>
+      <w:r>
+        <w:rPr>
+          <w:rFonts w:ascii="Consolas" w:cs="Consolas" w:eastAsia="Consolas" w:hAnsi="Consolas"/>
+          <w:sz w:val="17"/>
+          <w:szCs w:val="17"/>
+        </w:rPr>
+        <w:t xml:space="preserve">cubica_x^3_en_[0,10]     2,500.000000  2,500.250000          0.010000 2,500.000000         0.000000</w:t>
+      </w:r>
+    </w:p>
+    <w:p>
+      <w:pPr>
+        <w:shd w:fill="F2F2F2" w:color="auto" w:val="clear"/>
+        <w:spacing w:after="0" w:before="0"/>
+        <w:ind w:left="200"/>
+      </w:pPr>
+      <w:r>
+        <w:rPr>
+          <w:rFonts w:ascii="Consolas" w:cs="Consolas" w:eastAsia="Consolas" w:hAnsi="Consolas"/>
+          <w:sz w:val="17"/>
+          <w:szCs w:val="17"/>
+        </w:rPr>
+        <w:t xml:space="preserve">      seno_en_[0,pi]         2.000000      1.999836          0.008225     2.000000         0.000001</w:t>
+      </w:r>
+    </w:p>
+    <w:p>
+      <w:pPr>
+        <w:shd w:fill="F2F2F2" w:color="auto" w:val="clear"/>
+        <w:spacing w:after="0" w:before="0"/>
+        <w:ind w:left="200"/>
+      </w:pPr>
+      <w:r>
+        <w:rPr>
+          <w:rFonts w:ascii="Consolas" w:cs="Consolas" w:eastAsia="Consolas" w:hAnsi="Consolas"/>
+          <w:sz w:val="17"/>
+          <w:szCs w:val="17"/>
+        </w:rPr>
+        <w:t xml:space="preserve"> </w:t>
+      </w:r>
+    </w:p>
+    <w:p>
+      <w:pPr>
+        <w:shd w:fill="F2F2F2" w:color="auto" w:val="clear"/>
+        <w:spacing w:after="0" w:before="0"/>
+        <w:ind w:left="200"/>
+      </w:pPr>
+      <w:r>
+        <w:rPr>
+          <w:rFonts w:ascii="Consolas" w:cs="Consolas" w:eastAsia="Consolas" w:hAnsi="Consolas"/>
+          <w:sz w:val="17"/>
+          <w:szCs w:val="17"/>
+        </w:rPr>
+        <w:t xml:space="preserve">=== AUC de T(x), L(x), E(x) — datos simulados (TG2) ===</w:t>
+      </w:r>
+    </w:p>
+    <w:p>
+      <w:pPr>
+        <w:shd w:fill="F2F2F2" w:color="auto" w:val="clear"/>
+        <w:spacing w:after="0" w:before="0"/>
+        <w:ind w:left="200"/>
+      </w:pPr>
+      <w:r>
+        <w:rPr>
+          <w:rFonts w:ascii="Consolas" w:cs="Consolas" w:eastAsia="Consolas" w:hAnsi="Consolas"/>
+          <w:sz w:val="17"/>
+          <w:szCs w:val="17"/>
+        </w:rPr>
+        <w:t xml:space="preserve">variable             unidad  auc_trapecio  auc_simpson  diferencia_%</w:t>
+      </w:r>
+    </w:p>
+    <w:p>
+      <w:pPr>
+        <w:shd w:fill="F2F2F2" w:color="auto" w:val="clear"/>
+        <w:spacing w:after="0" w:before="0"/>
+        <w:ind w:left="200"/>
+      </w:pPr>
+      <w:r>
+        <w:rPr>
+          <w:rFonts w:ascii="Consolas" w:cs="Consolas" w:eastAsia="Consolas" w:hAnsi="Consolas"/>
+          <w:sz w:val="17"/>
+          <w:szCs w:val="17"/>
+        </w:rPr>
+        <w:t xml:space="preserve">       T sol/seg · usuarios  119,996.9004 119,996.9060        0.0000</w:t>
+      </w:r>
+    </w:p>
+    <w:p>
+      <w:pPr>
+        <w:shd w:fill="F2F2F2" w:color="auto" w:val="clear"/>
+        <w:spacing w:after="0" w:before="0"/>
+        <w:ind w:left="200"/>
+      </w:pPr>
+      <w:r>
+        <w:rPr>
+          <w:rFonts w:ascii="Consolas" w:cs="Consolas" w:eastAsia="Consolas" w:hAnsi="Consolas"/>
+          <w:sz w:val="17"/>
+          <w:szCs w:val="17"/>
+        </w:rPr>
+        <w:t xml:space="preserve">       L      ms · usuarios  268,278.1340 268,200.8822        0.0288</w:t>
+      </w:r>
+    </w:p>
+    <w:p>
+      <w:pPr>
+        <w:shd w:fill="F2F2F2" w:color="auto" w:val="clear"/>
+        <w:spacing w:after="120" w:before="0"/>
+        <w:ind w:left="200"/>
+      </w:pPr>
+      <w:r>
+        <w:rPr>
+          <w:rFonts w:ascii="Consolas" w:cs="Consolas" w:eastAsia="Consolas" w:hAnsi="Consolas"/>
+          <w:sz w:val="17"/>
+          <w:szCs w:val="17"/>
+        </w:rPr>
+        <w:t xml:space="preserve">       E       % · usuarios    8,036.4764   8,036.3005        0.0022</w:t>
+      </w:r>
+    </w:p>
+    <w:p>
+      <w:pPr>
+        <w:spacing w:after="120"/>
+      </w:pPr>
+      <w:r>
+        <w:t xml:space="preserve">Los resultados de Jose son idénticos, cifra por cifra, a los del entorno de desarrollo. A diferencia de TG3 (que depende de una semilla aleatoria), este módulo es completamente determinístico — no usa números aleatorios — por lo que la coincidencia exacta era el resultado esperado, y confirma que la implementación manual de ambas reglas de integración es correcta y portable entre Windows y Linux.</w:t>
+      </w:r>
+    </w:p>
+    <w:p>
+      <w:pPr>
+        <w:pStyle w:val="Heading2"/>
+        <w:spacing w:after="110" w:before="220"/>
+      </w:pPr>
+      <w:r>
+        <w:t xml:space="preserve">4.6 Archivos de esta tarea</w:t>
+      </w:r>
+    </w:p>
+    <w:p>
+      <w:pPr>
+        <w:shd w:fill="F2F2F2" w:color="auto" w:val="clear"/>
+        <w:spacing w:after="120" w:before="60"/>
+        <w:ind w:left="200"/>
+      </w:pPr>
+      <w:r>
+        <w:rPr>
+          <w:rFonts w:ascii="Consolas" w:cs="Consolas" w:eastAsia="Consolas" w:hAnsi="Consolas"/>
+          <w:sz w:val="17"/>
+          <w:szCs w:val="17"/>
+        </w:rPr>
+        <w:t xml:space="preserve">src/integration.py · tests/test_integration.py</w:t>
+      </w:r>
+    </w:p>
+    <w:p>
+      <w:pPr>
+        <w:spacing w:after="120"/>
+      </w:pPr>
+      <w:r>
+        <w:t xml:space="preserve">Commit aplicado: feat: implementar Regla del Trapecio y Simpson 1/3 desde cero, con validación y cálculo de AUC</w:t>
+      </w:r>
+    </w:p>
+    <w:p>
+      <w:pPr>
+        <w:pStyle w:val="Heading1"/>
+        <w:spacing w:after="150" w:before="300"/>
+      </w:pPr>
+      <w:r>
         <w:t xml:space="preserve">Próximas secciones</w:t>
       </w:r>
     </w:p>
@@ -4069,7 +6898,7 @@
         <w:spacing w:after="120"/>
       </w:pPr>
       <w:r>
-        <w:t xml:space="preserve">Se agregarán conforme avance el equipo: TG4 (cálculo integral numérico), TG5 (visualización), TG6 (exportación de datos), TG7 (interfaz/dashboard), TG8 (pruebas del sistema completo).</w:t>
+        <w:t xml:space="preserve">Se agregarán conforme avance el equipo: TG5 (visualización), TG6 (exportación de datos), TG7 (interfaz/dashboard), TG8 (pruebas del sistema completo).</w:t>
       </w:r>
     </w:p>
     <w:sectPr>

</xml_diff>

<commit_message>
docs: agregar sección de visualización (TG5) con gráficas, tabla comparativa y evidencia del equipo
</commit_message>
<xml_diff>
--- a/docs/documentacion_tecnica.docx
+++ b/docs/documentacion_tecnica.docx
@@ -6890,6 +6890,1492 @@
         <w:spacing w:after="150" w:before="300"/>
       </w:pPr>
       <w:r>
+        <w:t xml:space="preserve">5. Módulo de Visualización — src/visualization.py (TG5)</w:t>
+      </w:r>
+    </w:p>
+    <w:p>
+      <w:pPr>
+        <w:spacing w:after="120"/>
+      </w:pPr>
+      <w:r>
+        <w:t xml:space="preserve">Responsable: Jose Andrés Ortiz Marín.</w:t>
+      </w:r>
+    </w:p>
+    <w:p>
+      <w:pPr>
+        <w:spacing w:after="120"/>
+      </w:pPr>
+      <w:r>
+        <w:t xml:space="preserve">Genera las gráficas de T(x), L(x) y E(x) con el área bajo la curva sombreada (fill_between), representando visualmente el AUC calculado en integration.py, y la tabla comparativa entre la Regla del Trapecio y la Regla de Simpson 1/3.</w:t>
+      </w:r>
+    </w:p>
+    <w:p>
+      <w:pPr>
+        <w:pStyle w:val="Heading2"/>
+        <w:spacing w:after="110" w:before="220"/>
+      </w:pPr>
+      <w:r>
+        <w:t xml:space="preserve">5.1 Funciones implementadas</w:t>
+      </w:r>
+    </w:p>
+    <w:tbl>
+      <w:tblPr>
+        <w:tblW w:type="dxa" w:w="9360"/>
+        <w:tblBorders>
+          <w:top w:val="single" w:color="auto" w:sz="4"/>
+          <w:left w:val="single" w:color="auto" w:sz="4"/>
+          <w:bottom w:val="single" w:color="auto" w:sz="4"/>
+          <w:right w:val="single" w:color="auto" w:sz="4"/>
+          <w:insideH w:val="single" w:color="auto" w:sz="4"/>
+          <w:insideV w:val="single" w:color="auto" w:sz="4"/>
+        </w:tblBorders>
+      </w:tblPr>
+      <w:tblGrid>
+        <w:gridCol w:w="3000"/>
+        <w:gridCol w:w="4000"/>
+        <w:gridCol w:w="2360"/>
+      </w:tblGrid>
+      <w:tr>
+        <w:trPr>
+          <w:tblHeader/>
+        </w:trPr>
+        <w:tc>
+          <w:tcPr>
+            <w:tcW w:type="dxa" w:w="3000"/>
+            <w:shd w:fill="1F4E79" w:color="auto" w:val="clear"/>
+            <w:tcMar>
+              <w:top w:type="dxa" w:w="60"/>
+              <w:left w:type="dxa" w:w="80"/>
+              <w:bottom w:type="dxa" w:w="60"/>
+              <w:right w:type="dxa" w:w="80"/>
+            </w:tcMar>
+          </w:tcPr>
+          <w:p>
+            <w:pPr>
+              <w:spacing w:after="40"/>
+            </w:pPr>
+            <w:r>
+              <w:rPr>
+                <w:b/>
+                <w:bCs/>
+                <w:color w:val="FFFFFF"/>
+              </w:rPr>
+              <w:t xml:space="preserve">Función</w:t>
+            </w:r>
+          </w:p>
+        </w:tc>
+        <w:tc>
+          <w:tcPr>
+            <w:tcW w:type="dxa" w:w="4000"/>
+            <w:shd w:fill="1F4E79" w:color="auto" w:val="clear"/>
+            <w:tcMar>
+              <w:top w:type="dxa" w:w="60"/>
+              <w:left w:type="dxa" w:w="80"/>
+              <w:bottom w:type="dxa" w:w="60"/>
+              <w:right w:type="dxa" w:w="80"/>
+            </w:tcMar>
+          </w:tcPr>
+          <w:p>
+            <w:pPr>
+              <w:spacing w:after="40"/>
+            </w:pPr>
+            <w:r>
+              <w:rPr>
+                <w:b/>
+                <w:bCs/>
+                <w:color w:val="FFFFFF"/>
+              </w:rPr>
+              <w:t xml:space="preserve">Propósito</w:t>
+            </w:r>
+          </w:p>
+        </w:tc>
+        <w:tc>
+          <w:tcPr>
+            <w:tcW w:type="dxa" w:w="2360"/>
+            <w:shd w:fill="1F4E79" w:color="auto" w:val="clear"/>
+            <w:tcMar>
+              <w:top w:type="dxa" w:w="60"/>
+              <w:left w:type="dxa" w:w="80"/>
+              <w:bottom w:type="dxa" w:w="60"/>
+              <w:right w:type="dxa" w:w="80"/>
+            </w:tcMar>
+          </w:tcPr>
+          <w:p>
+            <w:pPr>
+              <w:spacing w:after="40"/>
+            </w:pPr>
+            <w:r>
+              <w:rPr>
+                <w:b/>
+                <w:bCs/>
+                <w:color w:val="FFFFFF"/>
+              </w:rPr>
+              <w:t xml:space="preserve">Retorno</w:t>
+            </w:r>
+          </w:p>
+        </w:tc>
+      </w:tr>
+      <w:tr>
+        <w:tc>
+          <w:tcPr>
+            <w:tcW w:type="dxa" w:w="3000"/>
+            <w:tcMar>
+              <w:top w:type="dxa" w:w="60"/>
+              <w:left w:type="dxa" w:w="80"/>
+              <w:bottom w:type="dxa" w:w="60"/>
+              <w:right w:type="dxa" w:w="80"/>
+            </w:tcMar>
+          </w:tcPr>
+          <w:p>
+            <w:pPr>
+              <w:spacing w:after="40"/>
+            </w:pPr>
+            <w:r>
+              <w:rPr>
+                <w:rFonts w:ascii="Consolas" w:cs="Consolas" w:eastAsia="Consolas" w:hAnsi="Consolas"/>
+                <w:b w:val="false"/>
+                <w:bCs w:val="false"/>
+                <w:sz w:val="19"/>
+                <w:szCs w:val="19"/>
+              </w:rPr>
+              <w:t xml:space="preserve">graficar_variable(x, y, titulo, ylabel, color)</w:t>
+            </w:r>
+          </w:p>
+        </w:tc>
+        <w:tc>
+          <w:tcPr>
+            <w:tcW w:type="dxa" w:w="4000"/>
+            <w:tcMar>
+              <w:top w:type="dxa" w:w="60"/>
+              <w:left w:type="dxa" w:w="80"/>
+              <w:bottom w:type="dxa" w:w="60"/>
+              <w:right w:type="dxa" w:w="80"/>
+            </w:tcMar>
+          </w:tcPr>
+          <w:p>
+            <w:pPr>
+              <w:spacing w:after="40"/>
+            </w:pPr>
+            <w:r>
+              <w:rPr>
+                <w:b w:val="false"/>
+                <w:bCs w:val="false"/>
+              </w:rPr>
+              <w:t xml:space="preserve">Grafica una curva y sombrea el área bajo ella (fill_between).</w:t>
+            </w:r>
+          </w:p>
+        </w:tc>
+        <w:tc>
+          <w:tcPr>
+            <w:tcW w:type="dxa" w:w="2360"/>
+            <w:tcMar>
+              <w:top w:type="dxa" w:w="60"/>
+              <w:left w:type="dxa" w:w="80"/>
+              <w:bottom w:type="dxa" w:w="60"/>
+              <w:right w:type="dxa" w:w="80"/>
+            </w:tcMar>
+          </w:tcPr>
+          <w:p>
+            <w:pPr>
+              <w:spacing w:after="40"/>
+            </w:pPr>
+            <w:r>
+              <w:rPr>
+                <w:b w:val="false"/>
+                <w:bCs w:val="false"/>
+              </w:rPr>
+              <w:t xml:space="preserve">Figure de Matplotlib.</w:t>
+            </w:r>
+          </w:p>
+        </w:tc>
+      </w:tr>
+      <w:tr>
+        <w:tc>
+          <w:tcPr>
+            <w:tcW w:type="dxa" w:w="3000"/>
+            <w:shd w:fill="F7F7F7" w:color="auto" w:val="clear"/>
+            <w:tcMar>
+              <w:top w:type="dxa" w:w="60"/>
+              <w:left w:type="dxa" w:w="80"/>
+              <w:bottom w:type="dxa" w:w="60"/>
+              <w:right w:type="dxa" w:w="80"/>
+            </w:tcMar>
+          </w:tcPr>
+          <w:p>
+            <w:pPr>
+              <w:spacing w:after="40"/>
+            </w:pPr>
+            <w:r>
+              <w:rPr>
+                <w:rFonts w:ascii="Consolas" w:cs="Consolas" w:eastAsia="Consolas" w:hAnsi="Consolas"/>
+                <w:b w:val="false"/>
+                <w:bCs w:val="false"/>
+                <w:sz w:val="19"/>
+                <w:szCs w:val="19"/>
+              </w:rPr>
+              <w:t xml:space="preserve">graficar_todas_las_variables(datos)</w:t>
+            </w:r>
+          </w:p>
+        </w:tc>
+        <w:tc>
+          <w:tcPr>
+            <w:tcW w:type="dxa" w:w="4000"/>
+            <w:shd w:fill="F7F7F7" w:color="auto" w:val="clear"/>
+            <w:tcMar>
+              <w:top w:type="dxa" w:w="60"/>
+              <w:left w:type="dxa" w:w="80"/>
+              <w:bottom w:type="dxa" w:w="60"/>
+              <w:right w:type="dxa" w:w="80"/>
+            </w:tcMar>
+          </w:tcPr>
+          <w:p>
+            <w:pPr>
+              <w:spacing w:after="40"/>
+            </w:pPr>
+            <w:r>
+              <w:rPr>
+                <w:b w:val="false"/>
+                <w:bCs w:val="false"/>
+              </w:rPr>
+              <w:t xml:space="preserve">Genera las 3 gráficas (T, L, E) a partir del DataFrame de simulación.</w:t>
+            </w:r>
+          </w:p>
+        </w:tc>
+        <w:tc>
+          <w:tcPr>
+            <w:tcW w:type="dxa" w:w="2360"/>
+            <w:shd w:fill="F7F7F7" w:color="auto" w:val="clear"/>
+            <w:tcMar>
+              <w:top w:type="dxa" w:w="60"/>
+              <w:left w:type="dxa" w:w="80"/>
+              <w:bottom w:type="dxa" w:w="60"/>
+              <w:right w:type="dxa" w:w="80"/>
+            </w:tcMar>
+          </w:tcPr>
+          <w:p>
+            <w:pPr>
+              <w:spacing w:after="40"/>
+            </w:pPr>
+            <w:r>
+              <w:rPr>
+                <w:b w:val="false"/>
+                <w:bCs w:val="false"/>
+              </w:rPr>
+              <w:t xml:space="preserve">dict {'T','L','E': Figure}.</w:t>
+            </w:r>
+          </w:p>
+        </w:tc>
+      </w:tr>
+      <w:tr>
+        <w:tc>
+          <w:tcPr>
+            <w:tcW w:type="dxa" w:w="3000"/>
+            <w:tcMar>
+              <w:top w:type="dxa" w:w="60"/>
+              <w:left w:type="dxa" w:w="80"/>
+              <w:bottom w:type="dxa" w:w="60"/>
+              <w:right w:type="dxa" w:w="80"/>
+            </w:tcMar>
+          </w:tcPr>
+          <w:p>
+            <w:pPr>
+              <w:spacing w:after="40"/>
+            </w:pPr>
+            <w:r>
+              <w:rPr>
+                <w:rFonts w:ascii="Consolas" w:cs="Consolas" w:eastAsia="Consolas" w:hAnsi="Consolas"/>
+                <w:b w:val="false"/>
+                <w:bCs w:val="false"/>
+                <w:sz w:val="19"/>
+                <w:szCs w:val="19"/>
+              </w:rPr>
+              <w:t xml:space="preserve">tabla_comparativa_auc(resultados_auc)</w:t>
+            </w:r>
+          </w:p>
+        </w:tc>
+        <w:tc>
+          <w:tcPr>
+            <w:tcW w:type="dxa" w:w="4000"/>
+            <w:tcMar>
+              <w:top w:type="dxa" w:w="60"/>
+              <w:left w:type="dxa" w:w="80"/>
+              <w:bottom w:type="dxa" w:w="60"/>
+              <w:right w:type="dxa" w:w="80"/>
+            </w:tcMar>
+          </w:tcPr>
+          <w:p>
+            <w:pPr>
+              <w:spacing w:after="40"/>
+            </w:pPr>
+            <w:r>
+              <w:rPr>
+                <w:b w:val="false"/>
+                <w:bCs w:val="false"/>
+              </w:rPr>
+              <w:t xml:space="preserve">Renderiza la comparación Trapecio vs. Simpson 1/3 como tabla.</w:t>
+            </w:r>
+          </w:p>
+        </w:tc>
+        <w:tc>
+          <w:tcPr>
+            <w:tcW w:type="dxa" w:w="2360"/>
+            <w:tcMar>
+              <w:top w:type="dxa" w:w="60"/>
+              <w:left w:type="dxa" w:w="80"/>
+              <w:bottom w:type="dxa" w:w="60"/>
+              <w:right w:type="dxa" w:w="80"/>
+            </w:tcMar>
+          </w:tcPr>
+          <w:p>
+            <w:pPr>
+              <w:spacing w:after="40"/>
+            </w:pPr>
+            <w:r>
+              <w:rPr>
+                <w:b w:val="false"/>
+                <w:bCs w:val="false"/>
+              </w:rPr>
+              <w:t xml:space="preserve">Figure de Matplotlib.</w:t>
+            </w:r>
+          </w:p>
+        </w:tc>
+      </w:tr>
+      <w:tr>
+        <w:tc>
+          <w:tcPr>
+            <w:tcW w:type="dxa" w:w="3000"/>
+            <w:shd w:fill="F7F7F7" w:color="auto" w:val="clear"/>
+            <w:tcMar>
+              <w:top w:type="dxa" w:w="60"/>
+              <w:left w:type="dxa" w:w="80"/>
+              <w:bottom w:type="dxa" w:w="60"/>
+              <w:right w:type="dxa" w:w="80"/>
+            </w:tcMar>
+          </w:tcPr>
+          <w:p>
+            <w:pPr>
+              <w:spacing w:after="40"/>
+            </w:pPr>
+            <w:r>
+              <w:rPr>
+                <w:rFonts w:ascii="Consolas" w:cs="Consolas" w:eastAsia="Consolas" w:hAnsi="Consolas"/>
+                <w:b w:val="false"/>
+                <w:bCs w:val="false"/>
+                <w:sz w:val="19"/>
+                <w:szCs w:val="19"/>
+              </w:rPr>
+              <w:t xml:space="preserve">guardar_figura(fig, ruta, dpi)</w:t>
+            </w:r>
+          </w:p>
+        </w:tc>
+        <w:tc>
+          <w:tcPr>
+            <w:tcW w:type="dxa" w:w="4000"/>
+            <w:shd w:fill="F7F7F7" w:color="auto" w:val="clear"/>
+            <w:tcMar>
+              <w:top w:type="dxa" w:w="60"/>
+              <w:left w:type="dxa" w:w="80"/>
+              <w:bottom w:type="dxa" w:w="60"/>
+              <w:right w:type="dxa" w:w="80"/>
+            </w:tcMar>
+          </w:tcPr>
+          <w:p>
+            <w:pPr>
+              <w:spacing w:after="40"/>
+            </w:pPr>
+            <w:r>
+              <w:rPr>
+                <w:b w:val="false"/>
+                <w:bCs w:val="false"/>
+              </w:rPr>
+              <w:t xml:space="preserve">Guarda cualquier Figure como imagen PNG.</w:t>
+            </w:r>
+          </w:p>
+        </w:tc>
+        <w:tc>
+          <w:tcPr>
+            <w:tcW w:type="dxa" w:w="2360"/>
+            <w:shd w:fill="F7F7F7" w:color="auto" w:val="clear"/>
+            <w:tcMar>
+              <w:top w:type="dxa" w:w="60"/>
+              <w:left w:type="dxa" w:w="80"/>
+              <w:bottom w:type="dxa" w:w="60"/>
+              <w:right w:type="dxa" w:w="80"/>
+            </w:tcMar>
+          </w:tcPr>
+          <w:p>
+            <w:pPr>
+              <w:spacing w:after="40"/>
+            </w:pPr>
+            <w:r>
+              <w:rPr>
+                <w:b w:val="false"/>
+                <w:bCs w:val="false"/>
+              </w:rPr>
+              <w:t xml:space="preserve">—</w:t>
+            </w:r>
+          </w:p>
+        </w:tc>
+      </w:tr>
+    </w:tbl>
+    <w:p>
+      <w:pPr>
+        <w:pStyle w:val="Heading2"/>
+        <w:spacing w:after="110" w:before="220"/>
+      </w:pPr>
+      <w:r>
+        <w:t xml:space="preserve">5.2 Nota de diseño — integración con el dashboard (TG7)</w:t>
+      </w:r>
+    </w:p>
+    <w:p>
+      <w:pPr>
+        <w:spacing w:after="120"/>
+      </w:pPr>
+      <w:r>
+        <w:t xml:space="preserve">El último punto de esta tarea pide integrar las gráficas y la tabla dentro del dashboard, pero el dashboard todavía no existe (TG7, a cargo de Wilberth). Por eso las funciones devuelven objetos Figure de Matplotlib en lugar de llamar a plt.show(): quedan listas para insertarse sin modificaciones dentro del dashboard usando matplotlib.backends.backend_tkagg.FigureCanvasTkAgg. La integración física ocurrirá en TG7; este módulo ya deja la pieza lista.</w:t>
+      </w:r>
+    </w:p>
+    <w:p>
+      <w:pPr>
+        <w:pStyle w:val="Heading2"/>
+        <w:spacing w:after="110" w:before="220"/>
+      </w:pPr>
+      <w:r>
+        <w:t xml:space="preserve">5.3 Gráficas generadas</w:t>
+      </w:r>
+    </w:p>
+    <w:p>
+      <w:pPr>
+        <w:spacing w:after="40" w:before="100"/>
+        <w:jc w:val="center"/>
+      </w:pPr>
+      <w:r>
+        <w:drawing>
+          <wp:inline distT="0" distB="0" distL="0" distR="0">
+            <wp:extent cx="4095750" cy="2609850"/>
+            <wp:effectExtent t="0" r="0" b="0" l="0"/>
+            <wp:docPr id="1" name="" descr="" title=""/>
+            <wp:cNvGraphicFramePr>
+              <a:graphicFrameLocks xmlns:a="http://schemas.openxmlformats.org/drawingml/2006/main" noChangeAspect="1"/>
+            </wp:cNvGraphicFramePr>
+            <a:graphic xmlns:a="http://schemas.openxmlformats.org/drawingml/2006/main">
+              <a:graphicData uri="http://schemas.openxmlformats.org/drawingml/2006/picture">
+                <pic:pic xmlns:pic="http://schemas.openxmlformats.org/drawingml/2006/picture">
+                  <pic:nvPicPr>
+                    <pic:cNvPr id="0" name="" descr=""/>
+                    <pic:cNvPicPr>
+                      <a:picLocks noChangeAspect="1" noChangeArrowheads="1"/>
+                    </pic:cNvPicPr>
+                  </pic:nvPicPr>
+                  <pic:blipFill>
+                    <a:blip r:embed="rId9" cstate="none"/>
+                    <a:srcRect/>
+                    <a:stretch>
+                      <a:fillRect/>
+                    </a:stretch>
+                  </pic:blipFill>
+                  <pic:spPr bwMode="auto">
+                    <a:xfrm>
+                      <a:off x="0" y="0"/>
+                      <a:ext cx="4095750" cy="2609850"/>
+                    </a:xfrm>
+                    <a:prstGeom prst="rect">
+                      <a:avLst/>
+                    </a:prstGeom>
+                  </pic:spPr>
+                </pic:pic>
+              </a:graphicData>
+            </a:graphic>
+          </wp:inline>
+        </w:drawing>
+      </w:r>
+    </w:p>
+    <w:p>
+      <w:pPr>
+        <w:spacing w:after="160"/>
+        <w:jc w:val="center"/>
+      </w:pPr>
+      <w:r>
+        <w:rPr>
+          <w:i/>
+          <w:iCs/>
+          <w:sz w:val="18"/>
+          <w:szCs w:val="18"/>
+        </w:rPr>
+        <w:t xml:space="preserve">Figura 3. Throughput T(x) con el área bajo la curva (AUC) sombreada.</w:t>
+      </w:r>
+    </w:p>
+    <w:p>
+      <w:pPr>
+        <w:spacing w:after="40" w:before="100"/>
+        <w:jc w:val="center"/>
+      </w:pPr>
+      <w:r>
+        <w:drawing>
+          <wp:inline distT="0" distB="0" distL="0" distR="0">
+            <wp:extent cx="4095750" cy="2609850"/>
+            <wp:effectExtent t="0" r="0" b="0" l="0"/>
+            <wp:docPr id="1" name="" descr="" title=""/>
+            <wp:cNvGraphicFramePr>
+              <a:graphicFrameLocks xmlns:a="http://schemas.openxmlformats.org/drawingml/2006/main" noChangeAspect="1"/>
+            </wp:cNvGraphicFramePr>
+            <a:graphic xmlns:a="http://schemas.openxmlformats.org/drawingml/2006/main">
+              <a:graphicData uri="http://schemas.openxmlformats.org/drawingml/2006/picture">
+                <pic:pic xmlns:pic="http://schemas.openxmlformats.org/drawingml/2006/picture">
+                  <pic:nvPicPr>
+                    <pic:cNvPr id="0" name="" descr=""/>
+                    <pic:cNvPicPr>
+                      <a:picLocks noChangeAspect="1" noChangeArrowheads="1"/>
+                    </pic:cNvPicPr>
+                  </pic:nvPicPr>
+                  <pic:blipFill>
+                    <a:blip r:embed="rId10" cstate="none"/>
+                    <a:srcRect/>
+                    <a:stretch>
+                      <a:fillRect/>
+                    </a:stretch>
+                  </pic:blipFill>
+                  <pic:spPr bwMode="auto">
+                    <a:xfrm>
+                      <a:off x="0" y="0"/>
+                      <a:ext cx="4095750" cy="2609850"/>
+                    </a:xfrm>
+                    <a:prstGeom prst="rect">
+                      <a:avLst/>
+                    </a:prstGeom>
+                  </pic:spPr>
+                </pic:pic>
+              </a:graphicData>
+            </a:graphic>
+          </wp:inline>
+        </w:drawing>
+      </w:r>
+    </w:p>
+    <w:p>
+      <w:pPr>
+        <w:spacing w:after="160"/>
+        <w:jc w:val="center"/>
+      </w:pPr>
+      <w:r>
+        <w:rPr>
+          <w:i/>
+          <w:iCs/>
+          <w:sz w:val="18"/>
+          <w:szCs w:val="18"/>
+        </w:rPr>
+        <w:t xml:space="preserve">Figura 4. Latencia L(x) con el área bajo la curva (AUC) sombreada.</w:t>
+      </w:r>
+    </w:p>
+    <w:p>
+      <w:pPr>
+        <w:spacing w:after="40" w:before="100"/>
+        <w:jc w:val="center"/>
+      </w:pPr>
+      <w:r>
+        <w:drawing>
+          <wp:inline distT="0" distB="0" distL="0" distR="0">
+            <wp:extent cx="4095750" cy="2609850"/>
+            <wp:effectExtent t="0" r="0" b="0" l="0"/>
+            <wp:docPr id="1" name="" descr="" title=""/>
+            <wp:cNvGraphicFramePr>
+              <a:graphicFrameLocks xmlns:a="http://schemas.openxmlformats.org/drawingml/2006/main" noChangeAspect="1"/>
+            </wp:cNvGraphicFramePr>
+            <a:graphic xmlns:a="http://schemas.openxmlformats.org/drawingml/2006/main">
+              <a:graphicData uri="http://schemas.openxmlformats.org/drawingml/2006/picture">
+                <pic:pic xmlns:pic="http://schemas.openxmlformats.org/drawingml/2006/picture">
+                  <pic:nvPicPr>
+                    <pic:cNvPr id="0" name="" descr=""/>
+                    <pic:cNvPicPr>
+                      <a:picLocks noChangeAspect="1" noChangeArrowheads="1"/>
+                    </pic:cNvPicPr>
+                  </pic:nvPicPr>
+                  <pic:blipFill>
+                    <a:blip r:embed="rId11" cstate="none"/>
+                    <a:srcRect/>
+                    <a:stretch>
+                      <a:fillRect/>
+                    </a:stretch>
+                  </pic:blipFill>
+                  <pic:spPr bwMode="auto">
+                    <a:xfrm>
+                      <a:off x="0" y="0"/>
+                      <a:ext cx="4095750" cy="2609850"/>
+                    </a:xfrm>
+                    <a:prstGeom prst="rect">
+                      <a:avLst/>
+                    </a:prstGeom>
+                  </pic:spPr>
+                </pic:pic>
+              </a:graphicData>
+            </a:graphic>
+          </wp:inline>
+        </w:drawing>
+      </w:r>
+    </w:p>
+    <w:p>
+      <w:pPr>
+        <w:spacing w:after="160"/>
+        <w:jc w:val="center"/>
+      </w:pPr>
+      <w:r>
+        <w:rPr>
+          <w:i/>
+          <w:iCs/>
+          <w:sz w:val="18"/>
+          <w:szCs w:val="18"/>
+        </w:rPr>
+        <w:t xml:space="preserve">Figura 5. Tasa de error E(x) con el área bajo la curva (AUC) sombreada.</w:t>
+      </w:r>
+    </w:p>
+    <w:p>
+      <w:pPr>
+        <w:pStyle w:val="Heading2"/>
+        <w:spacing w:after="110" w:before="220"/>
+      </w:pPr>
+      <w:r>
+        <w:t xml:space="preserve">5.4 Tabla comparativa AUC — Trapecio vs. Simpson 1/3</w:t>
+      </w:r>
+    </w:p>
+    <w:p>
+      <w:pPr>
+        <w:spacing w:after="40" w:before="100"/>
+        <w:jc w:val="center"/>
+      </w:pPr>
+      <w:r>
+        <w:drawing>
+          <wp:inline distT="0" distB="0" distL="0" distR="0">
+            <wp:extent cx="4381500" cy="1352550"/>
+            <wp:effectExtent t="0" r="0" b="0" l="0"/>
+            <wp:docPr id="1" name="" descr="" title=""/>
+            <wp:cNvGraphicFramePr>
+              <a:graphicFrameLocks xmlns:a="http://schemas.openxmlformats.org/drawingml/2006/main" noChangeAspect="1"/>
+            </wp:cNvGraphicFramePr>
+            <a:graphic xmlns:a="http://schemas.openxmlformats.org/drawingml/2006/main">
+              <a:graphicData uri="http://schemas.openxmlformats.org/drawingml/2006/picture">
+                <pic:pic xmlns:pic="http://schemas.openxmlformats.org/drawingml/2006/picture">
+                  <pic:nvPicPr>
+                    <pic:cNvPr id="0" name="" descr=""/>
+                    <pic:cNvPicPr>
+                      <a:picLocks noChangeAspect="1" noChangeArrowheads="1"/>
+                    </pic:cNvPicPr>
+                  </pic:nvPicPr>
+                  <pic:blipFill>
+                    <a:blip r:embed="rId12" cstate="none"/>
+                    <a:srcRect/>
+                    <a:stretch>
+                      <a:fillRect/>
+                    </a:stretch>
+                  </pic:blipFill>
+                  <pic:spPr bwMode="auto">
+                    <a:xfrm>
+                      <a:off x="0" y="0"/>
+                      <a:ext cx="4381500" cy="1352550"/>
+                    </a:xfrm>
+                    <a:prstGeom prst="rect">
+                      <a:avLst/>
+                    </a:prstGeom>
+                  </pic:spPr>
+                </pic:pic>
+              </a:graphicData>
+            </a:graphic>
+          </wp:inline>
+        </w:drawing>
+      </w:r>
+    </w:p>
+    <w:p>
+      <w:pPr>
+        <w:spacing w:after="160"/>
+        <w:jc w:val="center"/>
+      </w:pPr>
+      <w:r>
+        <w:rPr>
+          <w:i/>
+          <w:iCs/>
+          <w:sz w:val="18"/>
+          <w:szCs w:val="18"/>
+        </w:rPr>
+        <w:t xml:space="preserve">Figura 6. Tabla comparativa generada por tabla_comparativa_auc(), consistente con los valores calculados en TG4.</w:t>
+      </w:r>
+    </w:p>
+    <w:p>
+      <w:pPr>
+        <w:pStyle w:val="Heading2"/>
+        <w:spacing w:after="110" w:before="220"/>
+      </w:pPr>
+      <w:r>
+        <w:t xml:space="preserve">5.5 Pruebas automatizadas — tests/test_visualization.py</w:t>
+      </w:r>
+    </w:p>
+    <w:tbl>
+      <w:tblPr>
+        <w:tblW w:type="dxa" w:w="9360"/>
+        <w:tblBorders>
+          <w:top w:val="single" w:color="auto" w:sz="4"/>
+          <w:left w:val="single" w:color="auto" w:sz="4"/>
+          <w:bottom w:val="single" w:color="auto" w:sz="4"/>
+          <w:right w:val="single" w:color="auto" w:sz="4"/>
+          <w:insideH w:val="single" w:color="auto" w:sz="4"/>
+          <w:insideV w:val="single" w:color="auto" w:sz="4"/>
+        </w:tblBorders>
+      </w:tblPr>
+      <w:tblGrid>
+        <w:gridCol w:w="4600"/>
+        <w:gridCol w:w="4760"/>
+      </w:tblGrid>
+      <w:tr>
+        <w:trPr>
+          <w:tblHeader/>
+        </w:trPr>
+        <w:tc>
+          <w:tcPr>
+            <w:tcW w:type="dxa" w:w="4600"/>
+            <w:shd w:fill="1F4E79" w:color="auto" w:val="clear"/>
+            <w:tcMar>
+              <w:top w:type="dxa" w:w="60"/>
+              <w:left w:type="dxa" w:w="80"/>
+              <w:bottom w:type="dxa" w:w="60"/>
+              <w:right w:type="dxa" w:w="80"/>
+            </w:tcMar>
+          </w:tcPr>
+          <w:p>
+            <w:pPr>
+              <w:spacing w:after="40"/>
+            </w:pPr>
+            <w:r>
+              <w:rPr>
+                <w:b/>
+                <w:bCs/>
+                <w:color w:val="FFFFFF"/>
+              </w:rPr>
+              <w:t xml:space="preserve">Prueba</w:t>
+            </w:r>
+          </w:p>
+        </w:tc>
+        <w:tc>
+          <w:tcPr>
+            <w:tcW w:type="dxa" w:w="4760"/>
+            <w:shd w:fill="1F4E79" w:color="auto" w:val="clear"/>
+            <w:tcMar>
+              <w:top w:type="dxa" w:w="60"/>
+              <w:left w:type="dxa" w:w="80"/>
+              <w:bottom w:type="dxa" w:w="60"/>
+              <w:right w:type="dxa" w:w="80"/>
+            </w:tcMar>
+          </w:tcPr>
+          <w:p>
+            <w:pPr>
+              <w:spacing w:after="40"/>
+            </w:pPr>
+            <w:r>
+              <w:rPr>
+                <w:b/>
+                <w:bCs/>
+                <w:color w:val="FFFFFF"/>
+              </w:rPr>
+              <w:t xml:space="preserve">Qué verifica</w:t>
+            </w:r>
+          </w:p>
+        </w:tc>
+      </w:tr>
+      <w:tr>
+        <w:tc>
+          <w:tcPr>
+            <w:tcW w:type="dxa" w:w="4600"/>
+            <w:tcMar>
+              <w:top w:type="dxa" w:w="60"/>
+              <w:left w:type="dxa" w:w="80"/>
+              <w:bottom w:type="dxa" w:w="60"/>
+              <w:right w:type="dxa" w:w="80"/>
+            </w:tcMar>
+          </w:tcPr>
+          <w:p>
+            <w:pPr>
+              <w:spacing w:after="40"/>
+            </w:pPr>
+            <w:r>
+              <w:rPr>
+                <w:b w:val="false"/>
+                <w:bCs w:val="false"/>
+              </w:rPr>
+              <w:t xml:space="preserve">test_graficar_variable_retorna_figura</w:t>
+            </w:r>
+          </w:p>
+        </w:tc>
+        <w:tc>
+          <w:tcPr>
+            <w:tcW w:type="dxa" w:w="4760"/>
+            <w:tcMar>
+              <w:top w:type="dxa" w:w="60"/>
+              <w:left w:type="dxa" w:w="80"/>
+              <w:bottom w:type="dxa" w:w="60"/>
+              <w:right w:type="dxa" w:w="80"/>
+            </w:tcMar>
+          </w:tcPr>
+          <w:p>
+            <w:pPr>
+              <w:spacing w:after="40"/>
+            </w:pPr>
+            <w:r>
+              <w:rPr>
+                <w:b w:val="false"/>
+                <w:bCs w:val="false"/>
+              </w:rPr>
+              <w:t xml:space="preserve">graficar_variable() retorna un objeto Figure.</w:t>
+            </w:r>
+          </w:p>
+        </w:tc>
+      </w:tr>
+      <w:tr>
+        <w:tc>
+          <w:tcPr>
+            <w:tcW w:type="dxa" w:w="4600"/>
+            <w:shd w:fill="F7F7F7" w:color="auto" w:val="clear"/>
+            <w:tcMar>
+              <w:top w:type="dxa" w:w="60"/>
+              <w:left w:type="dxa" w:w="80"/>
+              <w:bottom w:type="dxa" w:w="60"/>
+              <w:right w:type="dxa" w:w="80"/>
+            </w:tcMar>
+          </w:tcPr>
+          <w:p>
+            <w:pPr>
+              <w:spacing w:after="40"/>
+            </w:pPr>
+            <w:r>
+              <w:rPr>
+                <w:b w:val="false"/>
+                <w:bCs w:val="false"/>
+              </w:rPr>
+              <w:t xml:space="preserve">test_graficar_variable_sombrea_area_bajo_la_curva</w:t>
+            </w:r>
+          </w:p>
+        </w:tc>
+        <w:tc>
+          <w:tcPr>
+            <w:tcW w:type="dxa" w:w="4760"/>
+            <w:shd w:fill="F7F7F7" w:color="auto" w:val="clear"/>
+            <w:tcMar>
+              <w:top w:type="dxa" w:w="60"/>
+              <w:left w:type="dxa" w:w="80"/>
+              <w:bottom w:type="dxa" w:w="60"/>
+              <w:right w:type="dxa" w:w="80"/>
+            </w:tcMar>
+          </w:tcPr>
+          <w:p>
+            <w:pPr>
+              <w:spacing w:after="40"/>
+            </w:pPr>
+            <w:r>
+              <w:rPr>
+                <w:b w:val="false"/>
+                <w:bCs w:val="false"/>
+              </w:rPr>
+              <w:t xml:space="preserve">fill_between agrega una colección (el área sombreada) al eje.</w:t>
+            </w:r>
+          </w:p>
+        </w:tc>
+      </w:tr>
+      <w:tr>
+        <w:tc>
+          <w:tcPr>
+            <w:tcW w:type="dxa" w:w="4600"/>
+            <w:tcMar>
+              <w:top w:type="dxa" w:w="60"/>
+              <w:left w:type="dxa" w:w="80"/>
+              <w:bottom w:type="dxa" w:w="60"/>
+              <w:right w:type="dxa" w:w="80"/>
+            </w:tcMar>
+          </w:tcPr>
+          <w:p>
+            <w:pPr>
+              <w:spacing w:after="40"/>
+            </w:pPr>
+            <w:r>
+              <w:rPr>
+                <w:b w:val="false"/>
+                <w:bCs w:val="false"/>
+              </w:rPr>
+              <w:t xml:space="preserve">test_graficar_variable_titulo_y_etiquetas_correctos</w:t>
+            </w:r>
+          </w:p>
+        </w:tc>
+        <w:tc>
+          <w:tcPr>
+            <w:tcW w:type="dxa" w:w="4760"/>
+            <w:tcMar>
+              <w:top w:type="dxa" w:w="60"/>
+              <w:left w:type="dxa" w:w="80"/>
+              <w:bottom w:type="dxa" w:w="60"/>
+              <w:right w:type="dxa" w:w="80"/>
+            </w:tcMar>
+          </w:tcPr>
+          <w:p>
+            <w:pPr>
+              <w:spacing w:after="40"/>
+            </w:pPr>
+            <w:r>
+              <w:rPr>
+                <w:b w:val="false"/>
+                <w:bCs w:val="false"/>
+              </w:rPr>
+              <w:t xml:space="preserve">El título y las etiquetas de los ejes se asignan correctamente.</w:t>
+            </w:r>
+          </w:p>
+        </w:tc>
+      </w:tr>
+      <w:tr>
+        <w:tc>
+          <w:tcPr>
+            <w:tcW w:type="dxa" w:w="4600"/>
+            <w:shd w:fill="F7F7F7" w:color="auto" w:val="clear"/>
+            <w:tcMar>
+              <w:top w:type="dxa" w:w="60"/>
+              <w:left w:type="dxa" w:w="80"/>
+              <w:bottom w:type="dxa" w:w="60"/>
+              <w:right w:type="dxa" w:w="80"/>
+            </w:tcMar>
+          </w:tcPr>
+          <w:p>
+            <w:pPr>
+              <w:spacing w:after="40"/>
+            </w:pPr>
+            <w:r>
+              <w:rPr>
+                <w:b w:val="false"/>
+                <w:bCs w:val="false"/>
+              </w:rPr>
+              <w:t xml:space="preserve">test_graficar_todas_las_variables_retorna_las_tres_figuras</w:t>
+            </w:r>
+          </w:p>
+        </w:tc>
+        <w:tc>
+          <w:tcPr>
+            <w:tcW w:type="dxa" w:w="4760"/>
+            <w:shd w:fill="F7F7F7" w:color="auto" w:val="clear"/>
+            <w:tcMar>
+              <w:top w:type="dxa" w:w="60"/>
+              <w:left w:type="dxa" w:w="80"/>
+              <w:bottom w:type="dxa" w:w="60"/>
+              <w:right w:type="dxa" w:w="80"/>
+            </w:tcMar>
+          </w:tcPr>
+          <w:p>
+            <w:pPr>
+              <w:spacing w:after="40"/>
+            </w:pPr>
+            <w:r>
+              <w:rPr>
+                <w:b w:val="false"/>
+                <w:bCs w:val="false"/>
+              </w:rPr>
+              <w:t xml:space="preserve">Se generan las 3 figuras (T, L, E) en un diccionario.</w:t>
+            </w:r>
+          </w:p>
+        </w:tc>
+      </w:tr>
+      <w:tr>
+        <w:tc>
+          <w:tcPr>
+            <w:tcW w:type="dxa" w:w="4600"/>
+            <w:tcMar>
+              <w:top w:type="dxa" w:w="60"/>
+              <w:left w:type="dxa" w:w="80"/>
+              <w:bottom w:type="dxa" w:w="60"/>
+              <w:right w:type="dxa" w:w="80"/>
+            </w:tcMar>
+          </w:tcPr>
+          <w:p>
+            <w:pPr>
+              <w:spacing w:after="40"/>
+            </w:pPr>
+            <w:r>
+              <w:rPr>
+                <w:b w:val="false"/>
+                <w:bCs w:val="false"/>
+              </w:rPr>
+              <w:t xml:space="preserve">test_tabla_comparativa_auc_retorna_figura_con_tabla</w:t>
+            </w:r>
+          </w:p>
+        </w:tc>
+        <w:tc>
+          <w:tcPr>
+            <w:tcW w:type="dxa" w:w="4760"/>
+            <w:tcMar>
+              <w:top w:type="dxa" w:w="60"/>
+              <w:left w:type="dxa" w:w="80"/>
+              <w:bottom w:type="dxa" w:w="60"/>
+              <w:right w:type="dxa" w:w="80"/>
+            </w:tcMar>
+          </w:tcPr>
+          <w:p>
+            <w:pPr>
+              <w:spacing w:after="40"/>
+            </w:pPr>
+            <w:r>
+              <w:rPr>
+                <w:b w:val="false"/>
+                <w:bCs w:val="false"/>
+              </w:rPr>
+              <w:t xml:space="preserve">tabla_comparativa_auc() retorna una Figure con una tabla.</w:t>
+            </w:r>
+          </w:p>
+        </w:tc>
+      </w:tr>
+      <w:tr>
+        <w:tc>
+          <w:tcPr>
+            <w:tcW w:type="dxa" w:w="4600"/>
+            <w:shd w:fill="F7F7F7" w:color="auto" w:val="clear"/>
+            <w:tcMar>
+              <w:top w:type="dxa" w:w="60"/>
+              <w:left w:type="dxa" w:w="80"/>
+              <w:bottom w:type="dxa" w:w="60"/>
+              <w:right w:type="dxa" w:w="80"/>
+            </w:tcMar>
+          </w:tcPr>
+          <w:p>
+            <w:pPr>
+              <w:spacing w:after="40"/>
+            </w:pPr>
+            <w:r>
+              <w:rPr>
+                <w:b w:val="false"/>
+                <w:bCs w:val="false"/>
+              </w:rPr>
+              <w:t xml:space="preserve">test_tabla_comparativa_auc_tiene_una_fila_por_variable</w:t>
+            </w:r>
+          </w:p>
+        </w:tc>
+        <w:tc>
+          <w:tcPr>
+            <w:tcW w:type="dxa" w:w="4760"/>
+            <w:shd w:fill="F7F7F7" w:color="auto" w:val="clear"/>
+            <w:tcMar>
+              <w:top w:type="dxa" w:w="60"/>
+              <w:left w:type="dxa" w:w="80"/>
+              <w:bottom w:type="dxa" w:w="60"/>
+              <w:right w:type="dxa" w:w="80"/>
+            </w:tcMar>
+          </w:tcPr>
+          <w:p>
+            <w:pPr>
+              <w:spacing w:after="40"/>
+            </w:pPr>
+            <w:r>
+              <w:rPr>
+                <w:b w:val="false"/>
+                <w:bCs w:val="false"/>
+              </w:rPr>
+              <w:t xml:space="preserve">La tabla tiene una fila por variable, más el encabezado.</w:t>
+            </w:r>
+          </w:p>
+        </w:tc>
+      </w:tr>
+      <w:tr>
+        <w:tc>
+          <w:tcPr>
+            <w:tcW w:type="dxa" w:w="4600"/>
+            <w:tcMar>
+              <w:top w:type="dxa" w:w="60"/>
+              <w:left w:type="dxa" w:w="80"/>
+              <w:bottom w:type="dxa" w:w="60"/>
+              <w:right w:type="dxa" w:w="80"/>
+            </w:tcMar>
+          </w:tcPr>
+          <w:p>
+            <w:pPr>
+              <w:spacing w:after="40"/>
+            </w:pPr>
+            <w:r>
+              <w:rPr>
+                <w:b w:val="false"/>
+                <w:bCs w:val="false"/>
+              </w:rPr>
+              <w:t xml:space="preserve">test_guardar_figura_crea_archivo</w:t>
+            </w:r>
+          </w:p>
+        </w:tc>
+        <w:tc>
+          <w:tcPr>
+            <w:tcW w:type="dxa" w:w="4760"/>
+            <w:tcMar>
+              <w:top w:type="dxa" w:w="60"/>
+              <w:left w:type="dxa" w:w="80"/>
+              <w:bottom w:type="dxa" w:w="60"/>
+              <w:right w:type="dxa" w:w="80"/>
+            </w:tcMar>
+          </w:tcPr>
+          <w:p>
+            <w:pPr>
+              <w:spacing w:after="40"/>
+            </w:pPr>
+            <w:r>
+              <w:rPr>
+                <w:b w:val="false"/>
+                <w:bCs w:val="false"/>
+              </w:rPr>
+              <w:t xml:space="preserve">guardar_figura() escribe un archivo PNG válido en disco.</w:t>
+            </w:r>
+          </w:p>
+        </w:tc>
+      </w:tr>
+    </w:tbl>
+    <w:p>
+      <w:pPr>
+        <w:spacing w:after="120"/>
+      </w:pPr>
+      <w:r>
+        <w:t xml:space="preserve">Resultado de la ejecución en el entorno de desarrollo: 7 passed (pytest tests/test_visualization.py -v); 30 passed sobre el proyecto completo (pytest tests/ -v).</w:t>
+      </w:r>
+    </w:p>
+    <w:p>
+      <w:pPr>
+        <w:pStyle w:val="Heading3"/>
+        <w:spacing w:after="80" w:before="160"/>
+      </w:pPr>
+      <w:r>
+        <w:t xml:space="preserve">Evidencia de ejecución del equipo</w:t>
+      </w:r>
+    </w:p>
+    <w:p>
+      <w:pPr>
+        <w:spacing w:after="120"/>
+      </w:pPr>
+      <w:r>
+        <w:t xml:space="preserve">Ejecutado por Jose Andrés Ortiz Marín en su máquina local (Windows, Python 3.14.4):</w:t>
+      </w:r>
+    </w:p>
+    <w:p>
+      <w:pPr>
+        <w:shd w:fill="F2F2F2" w:color="auto" w:val="clear"/>
+        <w:spacing w:after="0" w:before="60"/>
+        <w:ind w:left="200"/>
+      </w:pPr>
+      <w:r>
+        <w:rPr>
+          <w:rFonts w:ascii="Consolas" w:cs="Consolas" w:eastAsia="Consolas" w:hAnsi="Consolas"/>
+          <w:sz w:val="17"/>
+          <w:szCs w:val="17"/>
+        </w:rPr>
+        <w:t xml:space="preserve">=============================================================== test session starts ===============================================================</w:t>
+      </w:r>
+    </w:p>
+    <w:p>
+      <w:pPr>
+        <w:shd w:fill="F2F2F2" w:color="auto" w:val="clear"/>
+        <w:spacing w:after="0" w:before="0"/>
+        <w:ind w:left="200"/>
+      </w:pPr>
+      <w:r>
+        <w:rPr>
+          <w:rFonts w:ascii="Consolas" w:cs="Consolas" w:eastAsia="Consolas" w:hAnsi="Consolas"/>
+          <w:sz w:val="17"/>
+          <w:szCs w:val="17"/>
+        </w:rPr>
+        <w:t xml:space="preserve">platform win32 -- Python 3.14.4, pytest-9.1.1, pluggy-1.6.0 -- C:\Users\ortiz\OneDrive\Desktop\PruebasEstres\venv\Scripts\python.exe</w:t>
+      </w:r>
+    </w:p>
+    <w:p>
+      <w:pPr>
+        <w:shd w:fill="F2F2F2" w:color="auto" w:val="clear"/>
+        <w:spacing w:after="0" w:before="0"/>
+        <w:ind w:left="200"/>
+      </w:pPr>
+      <w:r>
+        <w:rPr>
+          <w:rFonts w:ascii="Consolas" w:cs="Consolas" w:eastAsia="Consolas" w:hAnsi="Consolas"/>
+          <w:sz w:val="17"/>
+          <w:szCs w:val="17"/>
+        </w:rPr>
+        <w:t xml:space="preserve">rootdir: C:\Users\ortiz\OneDrive\Desktop\PruebasEstres</w:t>
+      </w:r>
+    </w:p>
+    <w:p>
+      <w:pPr>
+        <w:shd w:fill="F2F2F2" w:color="auto" w:val="clear"/>
+        <w:spacing w:after="0" w:before="0"/>
+        <w:ind w:left="200"/>
+      </w:pPr>
+      <w:r>
+        <w:rPr>
+          <w:rFonts w:ascii="Consolas" w:cs="Consolas" w:eastAsia="Consolas" w:hAnsi="Consolas"/>
+          <w:sz w:val="17"/>
+          <w:szCs w:val="17"/>
+        </w:rPr>
+        <w:t xml:space="preserve">collected 30 items</w:t>
+      </w:r>
+    </w:p>
+    <w:p>
+      <w:pPr>
+        <w:shd w:fill="F2F2F2" w:color="auto" w:val="clear"/>
+        <w:spacing w:after="0" w:before="0"/>
+        <w:ind w:left="200"/>
+      </w:pPr>
+      <w:r>
+        <w:rPr>
+          <w:rFonts w:ascii="Consolas" w:cs="Consolas" w:eastAsia="Consolas" w:hAnsi="Consolas"/>
+          <w:sz w:val="17"/>
+          <w:szCs w:val="17"/>
+        </w:rPr>
+        <w:t xml:space="preserve"> </w:t>
+      </w:r>
+    </w:p>
+    <w:p>
+      <w:pPr>
+        <w:shd w:fill="F2F2F2" w:color="auto" w:val="clear"/>
+        <w:spacing w:after="0" w:before="0"/>
+        <w:ind w:left="200"/>
+      </w:pPr>
+      <w:r>
+        <w:rPr>
+          <w:rFonts w:ascii="Consolas" w:cs="Consolas" w:eastAsia="Consolas" w:hAnsi="Consolas"/>
+          <w:sz w:val="17"/>
+          <w:szCs w:val="17"/>
+        </w:rPr>
+        <w:t xml:space="preserve">tests/test_calibration.py .... [ 13%]   tests/test_integration.py ........... [ 50%]</w:t>
+      </w:r>
+    </w:p>
+    <w:p>
+      <w:pPr>
+        <w:shd w:fill="F2F2F2" w:color="auto" w:val="clear"/>
+        <w:spacing w:after="0" w:before="0"/>
+        <w:ind w:left="200"/>
+      </w:pPr>
+      <w:r>
+        <w:rPr>
+          <w:rFonts w:ascii="Consolas" w:cs="Consolas" w:eastAsia="Consolas" w:hAnsi="Consolas"/>
+          <w:sz w:val="17"/>
+          <w:szCs w:val="17"/>
+        </w:rPr>
+        <w:t xml:space="preserve">tests/test_simulation.py ........ [ 76%]   tests/test_visualization.py ....... [100%]</w:t>
+      </w:r>
+    </w:p>
+    <w:p>
+      <w:pPr>
+        <w:shd w:fill="F2F2F2" w:color="auto" w:val="clear"/>
+        <w:spacing w:after="0" w:before="0"/>
+        <w:ind w:left="200"/>
+      </w:pPr>
+      <w:r>
+        <w:rPr>
+          <w:rFonts w:ascii="Consolas" w:cs="Consolas" w:eastAsia="Consolas" w:hAnsi="Consolas"/>
+          <w:sz w:val="17"/>
+          <w:szCs w:val="17"/>
+        </w:rPr>
+        <w:t xml:space="preserve"> </w:t>
+      </w:r>
+    </w:p>
+    <w:p>
+      <w:pPr>
+        <w:shd w:fill="F2F2F2" w:color="auto" w:val="clear"/>
+        <w:spacing w:after="120" w:before="0"/>
+        <w:ind w:left="200"/>
+      </w:pPr>
+      <w:r>
+        <w:rPr>
+          <w:rFonts w:ascii="Consolas" w:cs="Consolas" w:eastAsia="Consolas" w:hAnsi="Consolas"/>
+          <w:sz w:val="17"/>
+          <w:szCs w:val="17"/>
+        </w:rPr>
+        <w:t xml:space="preserve">=============================================================== 30 passed in 8.74s ================================================================</w:t>
+      </w:r>
+    </w:p>
+    <w:p>
+      <w:pPr>
+        <w:shd w:fill="F2F2F2" w:color="auto" w:val="clear"/>
+        <w:spacing w:after="0" w:before="60"/>
+        <w:ind w:left="200"/>
+      </w:pPr>
+      <w:r>
+        <w:rPr>
+          <w:rFonts w:ascii="Consolas" w:cs="Consolas" w:eastAsia="Consolas" w:hAnsi="Consolas"/>
+          <w:sz w:val="17"/>
+          <w:szCs w:val="17"/>
+        </w:rPr>
+        <w:t xml:space="preserve">Gráficas guardadas en assets/:</w:t>
+      </w:r>
+    </w:p>
+    <w:p>
+      <w:pPr>
+        <w:shd w:fill="F2F2F2" w:color="auto" w:val="clear"/>
+        <w:spacing w:after="0" w:before="0"/>
+        <w:ind w:left="200"/>
+      </w:pPr>
+      <w:r>
+        <w:rPr>
+          <w:rFonts w:ascii="Consolas" w:cs="Consolas" w:eastAsia="Consolas" w:hAnsi="Consolas"/>
+          <w:sz w:val="17"/>
+          <w:szCs w:val="17"/>
+        </w:rPr>
+        <w:t xml:space="preserve">  grafica_throughput.png</w:t>
+      </w:r>
+    </w:p>
+    <w:p>
+      <w:pPr>
+        <w:shd w:fill="F2F2F2" w:color="auto" w:val="clear"/>
+        <w:spacing w:after="0" w:before="0"/>
+        <w:ind w:left="200"/>
+      </w:pPr>
+      <w:r>
+        <w:rPr>
+          <w:rFonts w:ascii="Consolas" w:cs="Consolas" w:eastAsia="Consolas" w:hAnsi="Consolas"/>
+          <w:sz w:val="17"/>
+          <w:szCs w:val="17"/>
+        </w:rPr>
+        <w:t xml:space="preserve">  grafica_latencia.png</w:t>
+      </w:r>
+    </w:p>
+    <w:p>
+      <w:pPr>
+        <w:shd w:fill="F2F2F2" w:color="auto" w:val="clear"/>
+        <w:spacing w:after="0" w:before="0"/>
+        <w:ind w:left="200"/>
+      </w:pPr>
+      <w:r>
+        <w:rPr>
+          <w:rFonts w:ascii="Consolas" w:cs="Consolas" w:eastAsia="Consolas" w:hAnsi="Consolas"/>
+          <w:sz w:val="17"/>
+          <w:szCs w:val="17"/>
+        </w:rPr>
+        <w:t xml:space="preserve">  grafica_tasa_error.png</w:t>
+      </w:r>
+    </w:p>
+    <w:p>
+      <w:pPr>
+        <w:shd w:fill="F2F2F2" w:color="auto" w:val="clear"/>
+        <w:spacing w:after="0" w:before="0"/>
+        <w:ind w:left="200"/>
+      </w:pPr>
+      <w:r>
+        <w:rPr>
+          <w:rFonts w:ascii="Consolas" w:cs="Consolas" w:eastAsia="Consolas" w:hAnsi="Consolas"/>
+          <w:sz w:val="17"/>
+          <w:szCs w:val="17"/>
+        </w:rPr>
+        <w:t xml:space="preserve">  tabla_comparativa_auc.png</w:t>
+      </w:r>
+    </w:p>
+    <w:p>
+      <w:pPr>
+        <w:shd w:fill="F2F2F2" w:color="auto" w:val="clear"/>
+        <w:spacing w:after="0" w:before="0"/>
+        <w:ind w:left="200"/>
+      </w:pPr>
+      <w:r>
+        <w:rPr>
+          <w:rFonts w:ascii="Consolas" w:cs="Consolas" w:eastAsia="Consolas" w:hAnsi="Consolas"/>
+          <w:sz w:val="17"/>
+          <w:szCs w:val="17"/>
+        </w:rPr>
+        <w:t xml:space="preserve">=== Tabla comparativa AUC (Trapecio vs. Simpson 1/3) ===</w:t>
+      </w:r>
+    </w:p>
+    <w:p>
+      <w:pPr>
+        <w:shd w:fill="F2F2F2" w:color="auto" w:val="clear"/>
+        <w:spacing w:after="0" w:before="0"/>
+        <w:ind w:left="200"/>
+      </w:pPr>
+      <w:r>
+        <w:rPr>
+          <w:rFonts w:ascii="Consolas" w:cs="Consolas" w:eastAsia="Consolas" w:hAnsi="Consolas"/>
+          <w:sz w:val="17"/>
+          <w:szCs w:val="17"/>
+        </w:rPr>
+        <w:t xml:space="preserve">variable             unidad  auc_trapecio   auc_simpson  diferencia_%</w:t>
+      </w:r>
+    </w:p>
+    <w:p>
+      <w:pPr>
+        <w:shd w:fill="F2F2F2" w:color="auto" w:val="clear"/>
+        <w:spacing w:after="0" w:before="0"/>
+        <w:ind w:left="200"/>
+      </w:pPr>
+      <w:r>
+        <w:rPr>
+          <w:rFonts w:ascii="Consolas" w:cs="Consolas" w:eastAsia="Consolas" w:hAnsi="Consolas"/>
+          <w:sz w:val="17"/>
+          <w:szCs w:val="17"/>
+        </w:rPr>
+        <w:t xml:space="preserve">       T sol/seg · usuarios 119996.900429 119996.905980      0.000005</w:t>
+      </w:r>
+    </w:p>
+    <w:p>
+      <w:pPr>
+        <w:shd w:fill="F2F2F2" w:color="auto" w:val="clear"/>
+        <w:spacing w:after="0" w:before="0"/>
+        <w:ind w:left="200"/>
+      </w:pPr>
+      <w:r>
+        <w:rPr>
+          <w:rFonts w:ascii="Consolas" w:cs="Consolas" w:eastAsia="Consolas" w:hAnsi="Consolas"/>
+          <w:sz w:val="17"/>
+          <w:szCs w:val="17"/>
+        </w:rPr>
+        <w:t xml:space="preserve">       L      ms · usuarios 268278.134008 268200.882231      0.028804</w:t>
+      </w:r>
+    </w:p>
+    <w:p>
+      <w:pPr>
+        <w:shd w:fill="F2F2F2" w:color="auto" w:val="clear"/>
+        <w:spacing w:after="120" w:before="0"/>
+        <w:ind w:left="200"/>
+      </w:pPr>
+      <w:r>
+        <w:rPr>
+          <w:rFonts w:ascii="Consolas" w:cs="Consolas" w:eastAsia="Consolas" w:hAnsi="Consolas"/>
+          <w:sz w:val="17"/>
+          <w:szCs w:val="17"/>
+        </w:rPr>
+        <w:t xml:space="preserve">       E       % · usuarios   8036.476396   8036.300483      0.002189</w:t>
+      </w:r>
+    </w:p>
+    <w:p>
+      <w:pPr>
+        <w:spacing w:after="120"/>
+      </w:pPr>
+      <w:r>
+        <w:t xml:space="preserve">Resultados idénticos a los del entorno de desarrollo, como corresponde a un módulo determinístico (sin números aleatorios). Las 30 pruebas del proyecto completo pasan en ambos entornos (Linux/Python 3.12 y Windows/Python 3.14).</w:t>
+      </w:r>
+    </w:p>
+    <w:p>
+      <w:pPr>
+        <w:pStyle w:val="Heading2"/>
+        <w:spacing w:after="110" w:before="220"/>
+      </w:pPr>
+      <w:r>
+        <w:t xml:space="preserve">5.6 Archivos de esta tarea</w:t>
+      </w:r>
+    </w:p>
+    <w:p>
+      <w:pPr>
+        <w:shd w:fill="F2F2F2" w:color="auto" w:val="clear"/>
+        <w:spacing w:after="120" w:before="60"/>
+        <w:ind w:left="200"/>
+      </w:pPr>
+      <w:r>
+        <w:rPr>
+          <w:rFonts w:ascii="Consolas" w:cs="Consolas" w:eastAsia="Consolas" w:hAnsi="Consolas"/>
+          <w:sz w:val="17"/>
+          <w:szCs w:val="17"/>
+        </w:rPr>
+        <w:t xml:space="preserve">src/visualization.py · tests/test_visualization.py · assets/grafica_throughput.png · assets/grafica_latencia.png · assets/grafica_tasa_error.png · assets/tabla_comparativa_auc.png</w:t>
+      </w:r>
+    </w:p>
+    <w:p>
+      <w:pPr>
+        <w:spacing w:after="120"/>
+      </w:pPr>
+      <w:r>
+        <w:t xml:space="preserve">Commit aplicado: feat: implementar módulo de visualización (gráficas con AUC sombreado y tabla comparativa)</w:t>
+      </w:r>
+    </w:p>
+    <w:p>
+      <w:pPr>
+        <w:pStyle w:val="Heading1"/>
+        <w:spacing w:after="150" w:before="300"/>
+      </w:pPr>
+      <w:r>
         <w:t xml:space="preserve">Próximas secciones</w:t>
       </w:r>
     </w:p>
@@ -6898,7 +8384,7 @@
         <w:spacing w:after="120"/>
       </w:pPr>
       <w:r>
-        <w:t xml:space="preserve">Se agregarán conforme avance el equipo: TG5 (visualización), TG6 (exportación de datos), TG7 (interfaz/dashboard), TG8 (pruebas del sistema completo).</w:t>
+        <w:t xml:space="preserve">Se agregarán conforme avance el equipo: TG6 (exportación de datos), TG7 (interfaz/dashboard), TG8 (pruebas del sistema completo).</w:t>
       </w:r>
     </w:p>
     <w:sectPr>

</xml_diff>

<commit_message>
git commit -m "docs: agregar sección de exportación de datos (TG6) con hallazgo CRLF/LF y evidencia del equipo"
</commit_message>
<xml_diff>
--- a/docs/documentacion_tecnica.docx
+++ b/docs/documentacion_tecnica.docx
@@ -8376,6 +8376,2089 @@
         <w:spacing w:after="150" w:before="300"/>
       </w:pPr>
       <w:r>
+        <w:t xml:space="preserve">6. Módulo de Exportación de Datos — src/export_data.py (TG6)</w:t>
+      </w:r>
+    </w:p>
+    <w:p>
+      <w:pPr>
+        <w:spacing w:after="120"/>
+      </w:pPr>
+      <w:r>
+        <w:t xml:space="preserve">Responsable: Jose Andrés Ortiz Marín.</w:t>
+      </w:r>
+    </w:p>
+    <w:p>
+      <w:pPr>
+        <w:spacing w:after="120"/>
+      </w:pPr>
+      <w:r>
+        <w:t xml:space="preserve">Exporta a CSV los datos de la simulación de carga (TG2) y los resultados del cálculo de AUC (TG4), y valida que los archivos exportados sean íntegros y reproducibles.</w:t>
+      </w:r>
+    </w:p>
+    <w:p>
+      <w:pPr>
+        <w:pStyle w:val="Heading2"/>
+        <w:spacing w:after="110" w:before="220"/>
+      </w:pPr>
+      <w:r>
+        <w:t xml:space="preserve">6.1 Funciones implementadas</w:t>
+      </w:r>
+    </w:p>
+    <w:tbl>
+      <w:tblPr>
+        <w:tblW w:type="dxa" w:w="9360"/>
+        <w:tblBorders>
+          <w:top w:val="single" w:color="auto" w:sz="4"/>
+          <w:left w:val="single" w:color="auto" w:sz="4"/>
+          <w:bottom w:val="single" w:color="auto" w:sz="4"/>
+          <w:right w:val="single" w:color="auto" w:sz="4"/>
+          <w:insideH w:val="single" w:color="auto" w:sz="4"/>
+          <w:insideV w:val="single" w:color="auto" w:sz="4"/>
+        </w:tblBorders>
+      </w:tblPr>
+      <w:tblGrid>
+        <w:gridCol w:w="3200"/>
+        <w:gridCol w:w="3800"/>
+        <w:gridCol w:w="2360"/>
+      </w:tblGrid>
+      <w:tr>
+        <w:trPr>
+          <w:tblHeader/>
+        </w:trPr>
+        <w:tc>
+          <w:tcPr>
+            <w:tcW w:type="dxa" w:w="3200"/>
+            <w:shd w:fill="1F4E79" w:color="auto" w:val="clear"/>
+            <w:tcMar>
+              <w:top w:type="dxa" w:w="60"/>
+              <w:left w:type="dxa" w:w="80"/>
+              <w:bottom w:type="dxa" w:w="60"/>
+              <w:right w:type="dxa" w:w="80"/>
+            </w:tcMar>
+          </w:tcPr>
+          <w:p>
+            <w:pPr>
+              <w:spacing w:after="40"/>
+            </w:pPr>
+            <w:r>
+              <w:rPr>
+                <w:b/>
+                <w:bCs/>
+                <w:color w:val="FFFFFF"/>
+              </w:rPr>
+              <w:t xml:space="preserve">Función</w:t>
+            </w:r>
+          </w:p>
+        </w:tc>
+        <w:tc>
+          <w:tcPr>
+            <w:tcW w:type="dxa" w:w="3800"/>
+            <w:shd w:fill="1F4E79" w:color="auto" w:val="clear"/>
+            <w:tcMar>
+              <w:top w:type="dxa" w:w="60"/>
+              <w:left w:type="dxa" w:w="80"/>
+              <w:bottom w:type="dxa" w:w="60"/>
+              <w:right w:type="dxa" w:w="80"/>
+            </w:tcMar>
+          </w:tcPr>
+          <w:p>
+            <w:pPr>
+              <w:spacing w:after="40"/>
+            </w:pPr>
+            <w:r>
+              <w:rPr>
+                <w:b/>
+                <w:bCs/>
+                <w:color w:val="FFFFFF"/>
+              </w:rPr>
+              <w:t xml:space="preserve">Propósito</w:t>
+            </w:r>
+          </w:p>
+        </w:tc>
+        <w:tc>
+          <w:tcPr>
+            <w:tcW w:type="dxa" w:w="2360"/>
+            <w:shd w:fill="1F4E79" w:color="auto" w:val="clear"/>
+            <w:tcMar>
+              <w:top w:type="dxa" w:w="60"/>
+              <w:left w:type="dxa" w:w="80"/>
+              <w:bottom w:type="dxa" w:w="60"/>
+              <w:right w:type="dxa" w:w="80"/>
+            </w:tcMar>
+          </w:tcPr>
+          <w:p>
+            <w:pPr>
+              <w:spacing w:after="40"/>
+            </w:pPr>
+            <w:r>
+              <w:rPr>
+                <w:b/>
+                <w:bCs/>
+                <w:color w:val="FFFFFF"/>
+              </w:rPr>
+              <w:t xml:space="preserve">Retorno</w:t>
+            </w:r>
+          </w:p>
+        </w:tc>
+      </w:tr>
+      <w:tr>
+        <w:tc>
+          <w:tcPr>
+            <w:tcW w:type="dxa" w:w="3200"/>
+            <w:tcMar>
+              <w:top w:type="dxa" w:w="60"/>
+              <w:left w:type="dxa" w:w="80"/>
+              <w:bottom w:type="dxa" w:w="60"/>
+              <w:right w:type="dxa" w:w="80"/>
+            </w:tcMar>
+          </w:tcPr>
+          <w:p>
+            <w:pPr>
+              <w:spacing w:after="40"/>
+            </w:pPr>
+            <w:r>
+              <w:rPr>
+                <w:rFonts w:ascii="Consolas" w:cs="Consolas" w:eastAsia="Consolas" w:hAnsi="Consolas"/>
+                <w:b w:val="false"/>
+                <w:bCs w:val="false"/>
+                <w:sz w:val="19"/>
+                <w:szCs w:val="19"/>
+              </w:rPr>
+              <w:t xml:space="preserve">exportar_datos_simulacion(datos, ruta)</w:t>
+            </w:r>
+          </w:p>
+        </w:tc>
+        <w:tc>
+          <w:tcPr>
+            <w:tcW w:type="dxa" w:w="3800"/>
+            <w:tcMar>
+              <w:top w:type="dxa" w:w="60"/>
+              <w:left w:type="dxa" w:w="80"/>
+              <w:bottom w:type="dxa" w:w="60"/>
+              <w:right w:type="dxa" w:w="80"/>
+            </w:tcMar>
+          </w:tcPr>
+          <w:p>
+            <w:pPr>
+              <w:spacing w:after="40"/>
+            </w:pPr>
+            <w:r>
+              <w:rPr>
+                <w:b w:val="false"/>
+                <w:bCs w:val="false"/>
+              </w:rPr>
+              <w:t xml:space="preserve">Exporta el DataFrame [x, T, L, E] a CSV.</w:t>
+            </w:r>
+          </w:p>
+        </w:tc>
+        <w:tc>
+          <w:tcPr>
+            <w:tcW w:type="dxa" w:w="2360"/>
+            <w:tcMar>
+              <w:top w:type="dxa" w:w="60"/>
+              <w:left w:type="dxa" w:w="80"/>
+              <w:bottom w:type="dxa" w:w="60"/>
+              <w:right w:type="dxa" w:w="80"/>
+            </w:tcMar>
+          </w:tcPr>
+          <w:p>
+            <w:pPr>
+              <w:spacing w:after="40"/>
+            </w:pPr>
+            <w:r>
+              <w:rPr>
+                <w:b w:val="false"/>
+                <w:bCs w:val="false"/>
+              </w:rPr>
+              <w:t xml:space="preserve">Ruta del archivo generado.</w:t>
+            </w:r>
+          </w:p>
+        </w:tc>
+      </w:tr>
+      <w:tr>
+        <w:tc>
+          <w:tcPr>
+            <w:tcW w:type="dxa" w:w="3200"/>
+            <w:shd w:fill="F7F7F7" w:color="auto" w:val="clear"/>
+            <w:tcMar>
+              <w:top w:type="dxa" w:w="60"/>
+              <w:left w:type="dxa" w:w="80"/>
+              <w:bottom w:type="dxa" w:w="60"/>
+              <w:right w:type="dxa" w:w="80"/>
+            </w:tcMar>
+          </w:tcPr>
+          <w:p>
+            <w:pPr>
+              <w:spacing w:after="40"/>
+            </w:pPr>
+            <w:r>
+              <w:rPr>
+                <w:rFonts w:ascii="Consolas" w:cs="Consolas" w:eastAsia="Consolas" w:hAnsi="Consolas"/>
+                <w:b w:val="false"/>
+                <w:bCs w:val="false"/>
+                <w:sz w:val="19"/>
+                <w:szCs w:val="19"/>
+              </w:rPr>
+              <w:t xml:space="preserve">exportar_resultados_auc(resultados_auc, ruta)</w:t>
+            </w:r>
+          </w:p>
+        </w:tc>
+        <w:tc>
+          <w:tcPr>
+            <w:tcW w:type="dxa" w:w="3800"/>
+            <w:shd w:fill="F7F7F7" w:color="auto" w:val="clear"/>
+            <w:tcMar>
+              <w:top w:type="dxa" w:w="60"/>
+              <w:left w:type="dxa" w:w="80"/>
+              <w:bottom w:type="dxa" w:w="60"/>
+              <w:right w:type="dxa" w:w="80"/>
+            </w:tcMar>
+          </w:tcPr>
+          <w:p>
+            <w:pPr>
+              <w:spacing w:after="40"/>
+            </w:pPr>
+            <w:r>
+              <w:rPr>
+                <w:b w:val="false"/>
+                <w:bCs w:val="false"/>
+              </w:rPr>
+              <w:t xml:space="preserve">Exporta la tabla comparativa de AUC a CSV.</w:t>
+            </w:r>
+          </w:p>
+        </w:tc>
+        <w:tc>
+          <w:tcPr>
+            <w:tcW w:type="dxa" w:w="2360"/>
+            <w:shd w:fill="F7F7F7" w:color="auto" w:val="clear"/>
+            <w:tcMar>
+              <w:top w:type="dxa" w:w="60"/>
+              <w:left w:type="dxa" w:w="80"/>
+              <w:bottom w:type="dxa" w:w="60"/>
+              <w:right w:type="dxa" w:w="80"/>
+            </w:tcMar>
+          </w:tcPr>
+          <w:p>
+            <w:pPr>
+              <w:spacing w:after="40"/>
+            </w:pPr>
+            <w:r>
+              <w:rPr>
+                <w:b w:val="false"/>
+                <w:bCs w:val="false"/>
+              </w:rPr>
+              <w:t xml:space="preserve">Ruta del archivo generado.</w:t>
+            </w:r>
+          </w:p>
+        </w:tc>
+      </w:tr>
+      <w:tr>
+        <w:tc>
+          <w:tcPr>
+            <w:tcW w:type="dxa" w:w="3200"/>
+            <w:tcMar>
+              <w:top w:type="dxa" w:w="60"/>
+              <w:left w:type="dxa" w:w="80"/>
+              <w:bottom w:type="dxa" w:w="60"/>
+              <w:right w:type="dxa" w:w="80"/>
+            </w:tcMar>
+          </w:tcPr>
+          <w:p>
+            <w:pPr>
+              <w:spacing w:after="40"/>
+            </w:pPr>
+            <w:r>
+              <w:rPr>
+                <w:rFonts w:ascii="Consolas" w:cs="Consolas" w:eastAsia="Consolas" w:hAnsi="Consolas"/>
+                <w:b w:val="false"/>
+                <w:bCs w:val="false"/>
+                <w:sz w:val="19"/>
+                <w:szCs w:val="19"/>
+              </w:rPr>
+              <w:t xml:space="preserve">calcular_hash_archivo(ruta)</w:t>
+            </w:r>
+          </w:p>
+        </w:tc>
+        <w:tc>
+          <w:tcPr>
+            <w:tcW w:type="dxa" w:w="3800"/>
+            <w:tcMar>
+              <w:top w:type="dxa" w:w="60"/>
+              <w:left w:type="dxa" w:w="80"/>
+              <w:bottom w:type="dxa" w:w="60"/>
+              <w:right w:type="dxa" w:w="80"/>
+            </w:tcMar>
+          </w:tcPr>
+          <w:p>
+            <w:pPr>
+              <w:spacing w:after="40"/>
+            </w:pPr>
+            <w:r>
+              <w:rPr>
+                <w:b w:val="false"/>
+                <w:bCs w:val="false"/>
+              </w:rPr>
+              <w:t xml:space="preserve">Calcula el hash SHA-256 del contenido de un archivo.</w:t>
+            </w:r>
+          </w:p>
+        </w:tc>
+        <w:tc>
+          <w:tcPr>
+            <w:tcW w:type="dxa" w:w="2360"/>
+            <w:tcMar>
+              <w:top w:type="dxa" w:w="60"/>
+              <w:left w:type="dxa" w:w="80"/>
+              <w:bottom w:type="dxa" w:w="60"/>
+              <w:right w:type="dxa" w:w="80"/>
+            </w:tcMar>
+          </w:tcPr>
+          <w:p>
+            <w:pPr>
+              <w:spacing w:after="40"/>
+            </w:pPr>
+            <w:r>
+              <w:rPr>
+                <w:b w:val="false"/>
+                <w:bCs w:val="false"/>
+              </w:rPr>
+              <w:t xml:space="preserve">Hash en hexadecimal.</w:t>
+            </w:r>
+          </w:p>
+        </w:tc>
+      </w:tr>
+      <w:tr>
+        <w:tc>
+          <w:tcPr>
+            <w:tcW w:type="dxa" w:w="3200"/>
+            <w:shd w:fill="F7F7F7" w:color="auto" w:val="clear"/>
+            <w:tcMar>
+              <w:top w:type="dxa" w:w="60"/>
+              <w:left w:type="dxa" w:w="80"/>
+              <w:bottom w:type="dxa" w:w="60"/>
+              <w:right w:type="dxa" w:w="80"/>
+            </w:tcMar>
+          </w:tcPr>
+          <w:p>
+            <w:pPr>
+              <w:spacing w:after="40"/>
+            </w:pPr>
+            <w:r>
+              <w:rPr>
+                <w:rFonts w:ascii="Consolas" w:cs="Consolas" w:eastAsia="Consolas" w:hAnsi="Consolas"/>
+                <w:b w:val="false"/>
+                <w:bCs w:val="false"/>
+                <w:sz w:val="19"/>
+                <w:szCs w:val="19"/>
+              </w:rPr>
+              <w:t xml:space="preserve">validar_integridad_exportacion(df_original, ruta)</w:t>
+            </w:r>
+          </w:p>
+        </w:tc>
+        <w:tc>
+          <w:tcPr>
+            <w:tcW w:type="dxa" w:w="3800"/>
+            <w:shd w:fill="F7F7F7" w:color="auto" w:val="clear"/>
+            <w:tcMar>
+              <w:top w:type="dxa" w:w="60"/>
+              <w:left w:type="dxa" w:w="80"/>
+              <w:bottom w:type="dxa" w:w="60"/>
+              <w:right w:type="dxa" w:w="80"/>
+            </w:tcMar>
+          </w:tcPr>
+          <w:p>
+            <w:pPr>
+              <w:spacing w:after="40"/>
+            </w:pPr>
+            <w:r>
+              <w:rPr>
+                <w:b w:val="false"/>
+                <w:bCs w:val="false"/>
+              </w:rPr>
+              <w:t xml:space="preserve">Relee el CSV y compara valor por valor contra el original.</w:t>
+            </w:r>
+          </w:p>
+        </w:tc>
+        <w:tc>
+          <w:tcPr>
+            <w:tcW w:type="dxa" w:w="2360"/>
+            <w:shd w:fill="F7F7F7" w:color="auto" w:val="clear"/>
+            <w:tcMar>
+              <w:top w:type="dxa" w:w="60"/>
+              <w:left w:type="dxa" w:w="80"/>
+              <w:bottom w:type="dxa" w:w="60"/>
+              <w:right w:type="dxa" w:w="80"/>
+            </w:tcMar>
+          </w:tcPr>
+          <w:p>
+            <w:pPr>
+              <w:spacing w:after="40"/>
+            </w:pPr>
+            <w:r>
+              <w:rPr>
+                <w:b w:val="false"/>
+                <w:bCs w:val="false"/>
+              </w:rPr>
+              <w:t xml:space="preserve">True, o AssertionError si no coincide.</w:t>
+            </w:r>
+          </w:p>
+        </w:tc>
+      </w:tr>
+      <w:tr>
+        <w:tc>
+          <w:tcPr>
+            <w:tcW w:type="dxa" w:w="3200"/>
+            <w:tcMar>
+              <w:top w:type="dxa" w:w="60"/>
+              <w:left w:type="dxa" w:w="80"/>
+              <w:bottom w:type="dxa" w:w="60"/>
+              <w:right w:type="dxa" w:w="80"/>
+            </w:tcMar>
+          </w:tcPr>
+          <w:p>
+            <w:pPr>
+              <w:spacing w:after="40"/>
+            </w:pPr>
+            <w:r>
+              <w:rPr>
+                <w:rFonts w:ascii="Consolas" w:cs="Consolas" w:eastAsia="Consolas" w:hAnsi="Consolas"/>
+                <w:b w:val="false"/>
+                <w:bCs w:val="false"/>
+                <w:sz w:val="19"/>
+                <w:szCs w:val="19"/>
+              </w:rPr>
+              <w:t xml:space="preserve">validar_reproducibilidad_exportacion(datos, fn, ruta)</w:t>
+            </w:r>
+          </w:p>
+        </w:tc>
+        <w:tc>
+          <w:tcPr>
+            <w:tcW w:type="dxa" w:w="3800"/>
+            <w:tcMar>
+              <w:top w:type="dxa" w:w="60"/>
+              <w:left w:type="dxa" w:w="80"/>
+              <w:bottom w:type="dxa" w:w="60"/>
+              <w:right w:type="dxa" w:w="80"/>
+            </w:tcMar>
+          </w:tcPr>
+          <w:p>
+            <w:pPr>
+              <w:spacing w:after="40"/>
+            </w:pPr>
+            <w:r>
+              <w:rPr>
+                <w:b w:val="false"/>
+                <w:bCs w:val="false"/>
+              </w:rPr>
+              <w:t xml:space="preserve">Exporta dos veces y compara los hashes.</w:t>
+            </w:r>
+          </w:p>
+        </w:tc>
+        <w:tc>
+          <w:tcPr>
+            <w:tcW w:type="dxa" w:w="2360"/>
+            <w:tcMar>
+              <w:top w:type="dxa" w:w="60"/>
+              <w:left w:type="dxa" w:w="80"/>
+              <w:bottom w:type="dxa" w:w="60"/>
+              <w:right w:type="dxa" w:w="80"/>
+            </w:tcMar>
+          </w:tcPr>
+          <w:p>
+            <w:pPr>
+              <w:spacing w:after="40"/>
+            </w:pPr>
+            <w:r>
+              <w:rPr>
+                <w:b w:val="false"/>
+                <w:bCs w:val="false"/>
+              </w:rPr>
+              <w:t xml:space="preserve">True si ambos hashes coinciden.</w:t>
+            </w:r>
+          </w:p>
+        </w:tc>
+      </w:tr>
+    </w:tbl>
+    <w:p>
+      <w:pPr>
+        <w:pStyle w:val="Heading2"/>
+        <w:spacing w:after="110" w:before="220"/>
+      </w:pPr>
+      <w:r>
+        <w:t xml:space="preserve">6.2 Resultados de la exportación</w:t>
+      </w:r>
+    </w:p>
+    <w:tbl>
+      <w:tblPr>
+        <w:tblW w:type="dxa" w:w="9360"/>
+        <w:tblBorders>
+          <w:top w:val="single" w:color="auto" w:sz="4"/>
+          <w:left w:val="single" w:color="auto" w:sz="4"/>
+          <w:bottom w:val="single" w:color="auto" w:sz="4"/>
+          <w:right w:val="single" w:color="auto" w:sz="4"/>
+          <w:insideH w:val="single" w:color="auto" w:sz="4"/>
+          <w:insideV w:val="single" w:color="auto" w:sz="4"/>
+        </w:tblBorders>
+      </w:tblPr>
+      <w:tblGrid>
+        <w:gridCol w:w="1900"/>
+        <w:gridCol w:w="2600"/>
+        <w:gridCol w:w="800"/>
+        <w:gridCol w:w="4060"/>
+      </w:tblGrid>
+      <w:tr>
+        <w:trPr>
+          <w:tblHeader/>
+        </w:trPr>
+        <w:tc>
+          <w:tcPr>
+            <w:tcW w:type="dxa" w:w="1900"/>
+            <w:shd w:fill="1F4E79" w:color="auto" w:val="clear"/>
+            <w:tcMar>
+              <w:top w:type="dxa" w:w="60"/>
+              <w:left w:type="dxa" w:w="80"/>
+              <w:bottom w:type="dxa" w:w="60"/>
+              <w:right w:type="dxa" w:w="80"/>
+            </w:tcMar>
+          </w:tcPr>
+          <w:p>
+            <w:pPr>
+              <w:spacing w:after="40"/>
+            </w:pPr>
+            <w:r>
+              <w:rPr>
+                <w:b/>
+                <w:bCs/>
+                <w:color w:val="FFFFFF"/>
+              </w:rPr>
+              <w:t xml:space="preserve">Entorno</w:t>
+            </w:r>
+          </w:p>
+        </w:tc>
+        <w:tc>
+          <w:tcPr>
+            <w:tcW w:type="dxa" w:w="2600"/>
+            <w:shd w:fill="1F4E79" w:color="auto" w:val="clear"/>
+            <w:tcMar>
+              <w:top w:type="dxa" w:w="60"/>
+              <w:left w:type="dxa" w:w="80"/>
+              <w:bottom w:type="dxa" w:w="60"/>
+              <w:right w:type="dxa" w:w="80"/>
+            </w:tcMar>
+          </w:tcPr>
+          <w:p>
+            <w:pPr>
+              <w:spacing w:after="40"/>
+            </w:pPr>
+            <w:r>
+              <w:rPr>
+                <w:b/>
+                <w:bCs/>
+                <w:color w:val="FFFFFF"/>
+              </w:rPr>
+              <w:t xml:space="preserve">Archivo</w:t>
+            </w:r>
+          </w:p>
+        </w:tc>
+        <w:tc>
+          <w:tcPr>
+            <w:tcW w:type="dxa" w:w="800"/>
+            <w:shd w:fill="1F4E79" w:color="auto" w:val="clear"/>
+            <w:tcMar>
+              <w:top w:type="dxa" w:w="60"/>
+              <w:left w:type="dxa" w:w="80"/>
+              <w:bottom w:type="dxa" w:w="60"/>
+              <w:right w:type="dxa" w:w="80"/>
+            </w:tcMar>
+          </w:tcPr>
+          <w:p>
+            <w:pPr>
+              <w:spacing w:after="40"/>
+            </w:pPr>
+            <w:r>
+              <w:rPr>
+                <w:b/>
+                <w:bCs/>
+                <w:color w:val="FFFFFF"/>
+              </w:rPr>
+              <w:t xml:space="preserve">Filas</w:t>
+            </w:r>
+          </w:p>
+        </w:tc>
+        <w:tc>
+          <w:tcPr>
+            <w:tcW w:type="dxa" w:w="4060"/>
+            <w:shd w:fill="1F4E79" w:color="auto" w:val="clear"/>
+            <w:tcMar>
+              <w:top w:type="dxa" w:w="60"/>
+              <w:left w:type="dxa" w:w="80"/>
+              <w:bottom w:type="dxa" w:w="60"/>
+              <w:right w:type="dxa" w:w="80"/>
+            </w:tcMar>
+          </w:tcPr>
+          <w:p>
+            <w:pPr>
+              <w:spacing w:after="40"/>
+            </w:pPr>
+            <w:r>
+              <w:rPr>
+                <w:b/>
+                <w:bCs/>
+                <w:color w:val="FFFFFF"/>
+              </w:rPr>
+              <w:t xml:space="preserve">Hash SHA-256</w:t>
+            </w:r>
+          </w:p>
+        </w:tc>
+      </w:tr>
+      <w:tr>
+        <w:tc>
+          <w:tcPr>
+            <w:tcW w:type="dxa" w:w="1900"/>
+            <w:tcMar>
+              <w:top w:type="dxa" w:w="60"/>
+              <w:left w:type="dxa" w:w="80"/>
+              <w:bottom w:type="dxa" w:w="60"/>
+              <w:right w:type="dxa" w:w="80"/>
+            </w:tcMar>
+          </w:tcPr>
+          <w:p>
+            <w:pPr>
+              <w:spacing w:after="40"/>
+            </w:pPr>
+            <w:r>
+              <w:rPr>
+                <w:rFonts w:ascii="Consolas" w:cs="Consolas" w:eastAsia="Consolas" w:hAnsi="Consolas"/>
+                <w:b w:val="false"/>
+                <w:bCs w:val="false"/>
+                <w:sz w:val="19"/>
+                <w:szCs w:val="19"/>
+              </w:rPr>
+              <w:t xml:space="preserve">Linux (desarrollo)</w:t>
+            </w:r>
+          </w:p>
+        </w:tc>
+        <w:tc>
+          <w:tcPr>
+            <w:tcW w:type="dxa" w:w="2600"/>
+            <w:tcMar>
+              <w:top w:type="dxa" w:w="60"/>
+              <w:left w:type="dxa" w:w="80"/>
+              <w:bottom w:type="dxa" w:w="60"/>
+              <w:right w:type="dxa" w:w="80"/>
+            </w:tcMar>
+          </w:tcPr>
+          <w:p>
+            <w:pPr>
+              <w:spacing w:after="40"/>
+            </w:pPr>
+            <w:r>
+              <w:rPr>
+                <w:b w:val="false"/>
+                <w:bCs w:val="false"/>
+              </w:rPr>
+              <w:t xml:space="preserve">datos_simulacion.csv</w:t>
+            </w:r>
+          </w:p>
+        </w:tc>
+        <w:tc>
+          <w:tcPr>
+            <w:tcW w:type="dxa" w:w="800"/>
+            <w:tcMar>
+              <w:top w:type="dxa" w:w="60"/>
+              <w:left w:type="dxa" w:w="80"/>
+              <w:bottom w:type="dxa" w:w="60"/>
+              <w:right w:type="dxa" w:w="80"/>
+            </w:tcMar>
+          </w:tcPr>
+          <w:p>
+            <w:pPr>
+              <w:spacing w:after="40"/>
+            </w:pPr>
+            <w:r>
+              <w:rPr>
+                <w:b w:val="false"/>
+                <w:bCs w:val="false"/>
+              </w:rPr>
+              <w:t xml:space="preserve">101</w:t>
+            </w:r>
+          </w:p>
+        </w:tc>
+        <w:tc>
+          <w:tcPr>
+            <w:tcW w:type="dxa" w:w="4060"/>
+            <w:tcMar>
+              <w:top w:type="dxa" w:w="60"/>
+              <w:left w:type="dxa" w:w="80"/>
+              <w:bottom w:type="dxa" w:w="60"/>
+              <w:right w:type="dxa" w:w="80"/>
+            </w:tcMar>
+          </w:tcPr>
+          <w:p>
+            <w:pPr>
+              <w:spacing w:after="40"/>
+            </w:pPr>
+            <w:r>
+              <w:rPr>
+                <w:b w:val="false"/>
+                <w:bCs w:val="false"/>
+              </w:rPr>
+              <w:t xml:space="preserve">8a4e95f1d769c928b5a7a4ae8934924303d9a1b653175711d405ff58184ccee9</w:t>
+            </w:r>
+          </w:p>
+        </w:tc>
+      </w:tr>
+      <w:tr>
+        <w:tc>
+          <w:tcPr>
+            <w:tcW w:type="dxa" w:w="1900"/>
+            <w:shd w:fill="F7F7F7" w:color="auto" w:val="clear"/>
+            <w:tcMar>
+              <w:top w:type="dxa" w:w="60"/>
+              <w:left w:type="dxa" w:w="80"/>
+              <w:bottom w:type="dxa" w:w="60"/>
+              <w:right w:type="dxa" w:w="80"/>
+            </w:tcMar>
+          </w:tcPr>
+          <w:p>
+            <w:pPr>
+              <w:spacing w:after="40"/>
+            </w:pPr>
+            <w:r>
+              <w:rPr>
+                <w:rFonts w:ascii="Consolas" w:cs="Consolas" w:eastAsia="Consolas" w:hAnsi="Consolas"/>
+                <w:b w:val="false"/>
+                <w:bCs w:val="false"/>
+                <w:sz w:val="19"/>
+                <w:szCs w:val="19"/>
+              </w:rPr>
+              <w:t xml:space="preserve">Linux (desarrollo)</w:t>
+            </w:r>
+          </w:p>
+        </w:tc>
+        <w:tc>
+          <w:tcPr>
+            <w:tcW w:type="dxa" w:w="2600"/>
+            <w:shd w:fill="F7F7F7" w:color="auto" w:val="clear"/>
+            <w:tcMar>
+              <w:top w:type="dxa" w:w="60"/>
+              <w:left w:type="dxa" w:w="80"/>
+              <w:bottom w:type="dxa" w:w="60"/>
+              <w:right w:type="dxa" w:w="80"/>
+            </w:tcMar>
+          </w:tcPr>
+          <w:p>
+            <w:pPr>
+              <w:spacing w:after="40"/>
+            </w:pPr>
+            <w:r>
+              <w:rPr>
+                <w:b w:val="false"/>
+                <w:bCs w:val="false"/>
+              </w:rPr>
+              <w:t xml:space="preserve">resultados_auc.csv</w:t>
+            </w:r>
+          </w:p>
+        </w:tc>
+        <w:tc>
+          <w:tcPr>
+            <w:tcW w:type="dxa" w:w="800"/>
+            <w:shd w:fill="F7F7F7" w:color="auto" w:val="clear"/>
+            <w:tcMar>
+              <w:top w:type="dxa" w:w="60"/>
+              <w:left w:type="dxa" w:w="80"/>
+              <w:bottom w:type="dxa" w:w="60"/>
+              <w:right w:type="dxa" w:w="80"/>
+            </w:tcMar>
+          </w:tcPr>
+          <w:p>
+            <w:pPr>
+              <w:spacing w:after="40"/>
+            </w:pPr>
+            <w:r>
+              <w:rPr>
+                <w:b w:val="false"/>
+                <w:bCs w:val="false"/>
+              </w:rPr>
+              <w:t xml:space="preserve">3</w:t>
+            </w:r>
+          </w:p>
+        </w:tc>
+        <w:tc>
+          <w:tcPr>
+            <w:tcW w:type="dxa" w:w="4060"/>
+            <w:shd w:fill="F7F7F7" w:color="auto" w:val="clear"/>
+            <w:tcMar>
+              <w:top w:type="dxa" w:w="60"/>
+              <w:left w:type="dxa" w:w="80"/>
+              <w:bottom w:type="dxa" w:w="60"/>
+              <w:right w:type="dxa" w:w="80"/>
+            </w:tcMar>
+          </w:tcPr>
+          <w:p>
+            <w:pPr>
+              <w:spacing w:after="40"/>
+            </w:pPr>
+            <w:r>
+              <w:rPr>
+                <w:b w:val="false"/>
+                <w:bCs w:val="false"/>
+              </w:rPr>
+              <w:t xml:space="preserve">469a090496d55998600ec95776b5474455bf65e2a7643c748e1e36e57ea03ce0</w:t>
+            </w:r>
+          </w:p>
+        </w:tc>
+      </w:tr>
+      <w:tr>
+        <w:tc>
+          <w:tcPr>
+            <w:tcW w:type="dxa" w:w="1900"/>
+            <w:tcMar>
+              <w:top w:type="dxa" w:w="60"/>
+              <w:left w:type="dxa" w:w="80"/>
+              <w:bottom w:type="dxa" w:w="60"/>
+              <w:right w:type="dxa" w:w="80"/>
+            </w:tcMar>
+          </w:tcPr>
+          <w:p>
+            <w:pPr>
+              <w:spacing w:after="40"/>
+            </w:pPr>
+            <w:r>
+              <w:rPr>
+                <w:rFonts w:ascii="Consolas" w:cs="Consolas" w:eastAsia="Consolas" w:hAnsi="Consolas"/>
+                <w:b w:val="false"/>
+                <w:bCs w:val="false"/>
+                <w:sz w:val="19"/>
+                <w:szCs w:val="19"/>
+              </w:rPr>
+              <w:t xml:space="preserve">Windows (Jose)</w:t>
+            </w:r>
+          </w:p>
+        </w:tc>
+        <w:tc>
+          <w:tcPr>
+            <w:tcW w:type="dxa" w:w="2600"/>
+            <w:tcMar>
+              <w:top w:type="dxa" w:w="60"/>
+              <w:left w:type="dxa" w:w="80"/>
+              <w:bottom w:type="dxa" w:w="60"/>
+              <w:right w:type="dxa" w:w="80"/>
+            </w:tcMar>
+          </w:tcPr>
+          <w:p>
+            <w:pPr>
+              <w:spacing w:after="40"/>
+            </w:pPr>
+            <w:r>
+              <w:rPr>
+                <w:b w:val="false"/>
+                <w:bCs w:val="false"/>
+              </w:rPr>
+              <w:t xml:space="preserve">datos_simulacion.csv</w:t>
+            </w:r>
+          </w:p>
+        </w:tc>
+        <w:tc>
+          <w:tcPr>
+            <w:tcW w:type="dxa" w:w="800"/>
+            <w:tcMar>
+              <w:top w:type="dxa" w:w="60"/>
+              <w:left w:type="dxa" w:w="80"/>
+              <w:bottom w:type="dxa" w:w="60"/>
+              <w:right w:type="dxa" w:w="80"/>
+            </w:tcMar>
+          </w:tcPr>
+          <w:p>
+            <w:pPr>
+              <w:spacing w:after="40"/>
+            </w:pPr>
+            <w:r>
+              <w:rPr>
+                <w:b w:val="false"/>
+                <w:bCs w:val="false"/>
+              </w:rPr>
+              <w:t xml:space="preserve">101</w:t>
+            </w:r>
+          </w:p>
+        </w:tc>
+        <w:tc>
+          <w:tcPr>
+            <w:tcW w:type="dxa" w:w="4060"/>
+            <w:tcMar>
+              <w:top w:type="dxa" w:w="60"/>
+              <w:left w:type="dxa" w:w="80"/>
+              <w:bottom w:type="dxa" w:w="60"/>
+              <w:right w:type="dxa" w:w="80"/>
+            </w:tcMar>
+          </w:tcPr>
+          <w:p>
+            <w:pPr>
+              <w:spacing w:after="40"/>
+            </w:pPr>
+            <w:r>
+              <w:rPr>
+                <w:b w:val="false"/>
+                <w:bCs w:val="false"/>
+              </w:rPr>
+              <w:t xml:space="preserve">4212a64a0c6bc5fece9d7c88cfd793b42aa267f3b9ce6ef96535ab72d1deeb7d</w:t>
+            </w:r>
+          </w:p>
+        </w:tc>
+      </w:tr>
+      <w:tr>
+        <w:tc>
+          <w:tcPr>
+            <w:tcW w:type="dxa" w:w="1900"/>
+            <w:shd w:fill="F7F7F7" w:color="auto" w:val="clear"/>
+            <w:tcMar>
+              <w:top w:type="dxa" w:w="60"/>
+              <w:left w:type="dxa" w:w="80"/>
+              <w:bottom w:type="dxa" w:w="60"/>
+              <w:right w:type="dxa" w:w="80"/>
+            </w:tcMar>
+          </w:tcPr>
+          <w:p>
+            <w:pPr>
+              <w:spacing w:after="40"/>
+            </w:pPr>
+            <w:r>
+              <w:rPr>
+                <w:rFonts w:ascii="Consolas" w:cs="Consolas" w:eastAsia="Consolas" w:hAnsi="Consolas"/>
+                <w:b w:val="false"/>
+                <w:bCs w:val="false"/>
+                <w:sz w:val="19"/>
+                <w:szCs w:val="19"/>
+              </w:rPr>
+              <w:t xml:space="preserve">Windows (Jose)</w:t>
+            </w:r>
+          </w:p>
+        </w:tc>
+        <w:tc>
+          <w:tcPr>
+            <w:tcW w:type="dxa" w:w="2600"/>
+            <w:shd w:fill="F7F7F7" w:color="auto" w:val="clear"/>
+            <w:tcMar>
+              <w:top w:type="dxa" w:w="60"/>
+              <w:left w:type="dxa" w:w="80"/>
+              <w:bottom w:type="dxa" w:w="60"/>
+              <w:right w:type="dxa" w:w="80"/>
+            </w:tcMar>
+          </w:tcPr>
+          <w:p>
+            <w:pPr>
+              <w:spacing w:after="40"/>
+            </w:pPr>
+            <w:r>
+              <w:rPr>
+                <w:b w:val="false"/>
+                <w:bCs w:val="false"/>
+              </w:rPr>
+              <w:t xml:space="preserve">resultados_auc.csv</w:t>
+            </w:r>
+          </w:p>
+        </w:tc>
+        <w:tc>
+          <w:tcPr>
+            <w:tcW w:type="dxa" w:w="800"/>
+            <w:shd w:fill="F7F7F7" w:color="auto" w:val="clear"/>
+            <w:tcMar>
+              <w:top w:type="dxa" w:w="60"/>
+              <w:left w:type="dxa" w:w="80"/>
+              <w:bottom w:type="dxa" w:w="60"/>
+              <w:right w:type="dxa" w:w="80"/>
+            </w:tcMar>
+          </w:tcPr>
+          <w:p>
+            <w:pPr>
+              <w:spacing w:after="40"/>
+            </w:pPr>
+            <w:r>
+              <w:rPr>
+                <w:b w:val="false"/>
+                <w:bCs w:val="false"/>
+              </w:rPr>
+              <w:t xml:space="preserve">3</w:t>
+            </w:r>
+          </w:p>
+        </w:tc>
+        <w:tc>
+          <w:tcPr>
+            <w:tcW w:type="dxa" w:w="4060"/>
+            <w:shd w:fill="F7F7F7" w:color="auto" w:val="clear"/>
+            <w:tcMar>
+              <w:top w:type="dxa" w:w="60"/>
+              <w:left w:type="dxa" w:w="80"/>
+              <w:bottom w:type="dxa" w:w="60"/>
+              <w:right w:type="dxa" w:w="80"/>
+            </w:tcMar>
+          </w:tcPr>
+          <w:p>
+            <w:pPr>
+              <w:spacing w:after="40"/>
+            </w:pPr>
+            <w:r>
+              <w:rPr>
+                <w:b w:val="false"/>
+                <w:bCs w:val="false"/>
+              </w:rPr>
+              <w:t xml:space="preserve">0154e6f7b32c236637892fd8def12564200b78bed3a602f81699a51735d35be7</w:t>
+            </w:r>
+          </w:p>
+        </w:tc>
+      </w:tr>
+    </w:tbl>
+    <w:p>
+      <w:pPr>
+        <w:pStyle w:val="Heading2"/>
+        <w:spacing w:after="110" w:before="220"/>
+      </w:pPr>
+      <w:r>
+        <w:t xml:space="preserve">6.3 Validación de integridad y reproducibilidad</w:t>
+      </w:r>
+    </w:p>
+    <w:p>
+      <w:pPr>
+        <w:spacing w:after="120"/>
+      </w:pPr>
+      <w:r>
+        <w:t xml:space="preserve">Integridad: los CSV exportados se releen con pandas y se comparan valor por valor contra el DataFrame original (tolerancia flotante estricta en columnas numéricas, igualdad exacta en columnas de texto). Resultado en ambos entornos: íntegro = True en datos_simulacion.csv y en resultados_auc.csv.</w:t>
+      </w:r>
+    </w:p>
+    <w:p>
+      <w:pPr>
+        <w:spacing w:after="120"/>
+      </w:pPr>
+      <w:r>
+        <w:t xml:space="preserve">Reproducibilidad: cada archivo se exporta dos veces dentro del mismo entorno y se comparan los hashes SHA-256. Resultado en ambos entornos: reproducible = True en los dos archivos.</w:t>
+      </w:r>
+    </w:p>
+    <w:p>
+      <w:pPr>
+        <w:pStyle w:val="Heading2"/>
+        <w:spacing w:after="110" w:before="220"/>
+      </w:pPr>
+      <w:r>
+        <w:t xml:space="preserve">6.4 Hallazgo: los hashes difieren entre Windows y Linux (no es un error de datos)</w:t>
+      </w:r>
+    </w:p>
+    <w:p>
+      <w:pPr>
+        <w:spacing w:after="120"/>
+      </w:pPr>
+      <w:r>
+        <w:t xml:space="preserve">Como se observa en la tabla 6.2, el hash SHA-256 de cada archivo es distinto entre el entorno de desarrollo (Linux) y la máquina de Jose (Windows), a pesar de que los datos numéricos son idénticos y ambas validaciones de integridad dieron True. La causa: pandas.to_csv() escribe el archivo en modo texto, y Python traduce automáticamente el salto de línea según el sistema operativo — LF (\n) en Linux/macOS, CRLF (\r\n) en Windows. Se confirmó revisando los bytes del CSV generado en el entorno de desarrollo: usa exclusivamente LF.</w:t>
+      </w:r>
+    </w:p>
+    <w:p>
+      <w:pPr>
+        <w:spacing w:after="120"/>
+      </w:pPr>
+      <w:r>
+        <w:t xml:space="preserve">Esto no es un defecto: la reproducibilidad se definió y se validó dentro de un mismo entorno (exportar dos veces en la misma máquina produce el mismo hash), no entre sistemas operativos distintos. Queda como recomendación para una futura mejora (Sección 9 del informe final) fijar explícitamente lineterminator="\n" en to_csv(), lo que haría los archivos byte-idénticos también entre Windows y Linux.</w:t>
+      </w:r>
+    </w:p>
+    <w:p>
+      <w:pPr>
+        <w:pStyle w:val="Heading2"/>
+        <w:spacing w:after="110" w:before="220"/>
+      </w:pPr>
+      <w:r>
+        <w:t xml:space="preserve">6.5 Pruebas automatizadas — tests/test_export_data.py</w:t>
+      </w:r>
+    </w:p>
+    <w:tbl>
+      <w:tblPr>
+        <w:tblW w:type="dxa" w:w="9360"/>
+        <w:tblBorders>
+          <w:top w:val="single" w:color="auto" w:sz="4"/>
+          <w:left w:val="single" w:color="auto" w:sz="4"/>
+          <w:bottom w:val="single" w:color="auto" w:sz="4"/>
+          <w:right w:val="single" w:color="auto" w:sz="4"/>
+          <w:insideH w:val="single" w:color="auto" w:sz="4"/>
+          <w:insideV w:val="single" w:color="auto" w:sz="4"/>
+        </w:tblBorders>
+      </w:tblPr>
+      <w:tblGrid>
+        <w:gridCol w:w="4600"/>
+        <w:gridCol w:w="4760"/>
+      </w:tblGrid>
+      <w:tr>
+        <w:trPr>
+          <w:tblHeader/>
+        </w:trPr>
+        <w:tc>
+          <w:tcPr>
+            <w:tcW w:type="dxa" w:w="4600"/>
+            <w:shd w:fill="1F4E79" w:color="auto" w:val="clear"/>
+            <w:tcMar>
+              <w:top w:type="dxa" w:w="60"/>
+              <w:left w:type="dxa" w:w="80"/>
+              <w:bottom w:type="dxa" w:w="60"/>
+              <w:right w:type="dxa" w:w="80"/>
+            </w:tcMar>
+          </w:tcPr>
+          <w:p>
+            <w:pPr>
+              <w:spacing w:after="40"/>
+            </w:pPr>
+            <w:r>
+              <w:rPr>
+                <w:b/>
+                <w:bCs/>
+                <w:color w:val="FFFFFF"/>
+              </w:rPr>
+              <w:t xml:space="preserve">Prueba</w:t>
+            </w:r>
+          </w:p>
+        </w:tc>
+        <w:tc>
+          <w:tcPr>
+            <w:tcW w:type="dxa" w:w="4760"/>
+            <w:shd w:fill="1F4E79" w:color="auto" w:val="clear"/>
+            <w:tcMar>
+              <w:top w:type="dxa" w:w="60"/>
+              <w:left w:type="dxa" w:w="80"/>
+              <w:bottom w:type="dxa" w:w="60"/>
+              <w:right w:type="dxa" w:w="80"/>
+            </w:tcMar>
+          </w:tcPr>
+          <w:p>
+            <w:pPr>
+              <w:spacing w:after="40"/>
+            </w:pPr>
+            <w:r>
+              <w:rPr>
+                <w:b/>
+                <w:bCs/>
+                <w:color w:val="FFFFFF"/>
+              </w:rPr>
+              <w:t xml:space="preserve">Qué verifica</w:t>
+            </w:r>
+          </w:p>
+        </w:tc>
+      </w:tr>
+      <w:tr>
+        <w:tc>
+          <w:tcPr>
+            <w:tcW w:type="dxa" w:w="4600"/>
+            <w:tcMar>
+              <w:top w:type="dxa" w:w="60"/>
+              <w:left w:type="dxa" w:w="80"/>
+              <w:bottom w:type="dxa" w:w="60"/>
+              <w:right w:type="dxa" w:w="80"/>
+            </w:tcMar>
+          </w:tcPr>
+          <w:p>
+            <w:pPr>
+              <w:spacing w:after="40"/>
+            </w:pPr>
+            <w:r>
+              <w:rPr>
+                <w:b w:val="false"/>
+                <w:bCs w:val="false"/>
+              </w:rPr>
+              <w:t xml:space="preserve">test_exportar_datos_simulacion_crea_archivo</w:t>
+            </w:r>
+          </w:p>
+        </w:tc>
+        <w:tc>
+          <w:tcPr>
+            <w:tcW w:type="dxa" w:w="4760"/>
+            <w:tcMar>
+              <w:top w:type="dxa" w:w="60"/>
+              <w:left w:type="dxa" w:w="80"/>
+              <w:bottom w:type="dxa" w:w="60"/>
+              <w:right w:type="dxa" w:w="80"/>
+            </w:tcMar>
+          </w:tcPr>
+          <w:p>
+            <w:pPr>
+              <w:spacing w:after="40"/>
+            </w:pPr>
+            <w:r>
+              <w:rPr>
+                <w:b w:val="false"/>
+                <w:bCs w:val="false"/>
+              </w:rPr>
+              <w:t xml:space="preserve">El CSV de datos de simulación se crea correctamente.</w:t>
+            </w:r>
+          </w:p>
+        </w:tc>
+      </w:tr>
+      <w:tr>
+        <w:tc>
+          <w:tcPr>
+            <w:tcW w:type="dxa" w:w="4600"/>
+            <w:shd w:fill="F7F7F7" w:color="auto" w:val="clear"/>
+            <w:tcMar>
+              <w:top w:type="dxa" w:w="60"/>
+              <w:left w:type="dxa" w:w="80"/>
+              <w:bottom w:type="dxa" w:w="60"/>
+              <w:right w:type="dxa" w:w="80"/>
+            </w:tcMar>
+          </w:tcPr>
+          <w:p>
+            <w:pPr>
+              <w:spacing w:after="40"/>
+            </w:pPr>
+            <w:r>
+              <w:rPr>
+                <w:b w:val="false"/>
+                <w:bCs w:val="false"/>
+              </w:rPr>
+              <w:t xml:space="preserve">test_exportar_resultados_auc_crea_archivo</w:t>
+            </w:r>
+          </w:p>
+        </w:tc>
+        <w:tc>
+          <w:tcPr>
+            <w:tcW w:type="dxa" w:w="4760"/>
+            <w:shd w:fill="F7F7F7" w:color="auto" w:val="clear"/>
+            <w:tcMar>
+              <w:top w:type="dxa" w:w="60"/>
+              <w:left w:type="dxa" w:w="80"/>
+              <w:bottom w:type="dxa" w:w="60"/>
+              <w:right w:type="dxa" w:w="80"/>
+            </w:tcMar>
+          </w:tcPr>
+          <w:p>
+            <w:pPr>
+              <w:spacing w:after="40"/>
+            </w:pPr>
+            <w:r>
+              <w:rPr>
+                <w:b w:val="false"/>
+                <w:bCs w:val="false"/>
+              </w:rPr>
+              <w:t xml:space="preserve">El CSV de resultados de AUC se crea correctamente.</w:t>
+            </w:r>
+          </w:p>
+        </w:tc>
+      </w:tr>
+      <w:tr>
+        <w:tc>
+          <w:tcPr>
+            <w:tcW w:type="dxa" w:w="4600"/>
+            <w:tcMar>
+              <w:top w:type="dxa" w:w="60"/>
+              <w:left w:type="dxa" w:w="80"/>
+              <w:bottom w:type="dxa" w:w="60"/>
+              <w:right w:type="dxa" w:w="80"/>
+            </w:tcMar>
+          </w:tcPr>
+          <w:p>
+            <w:pPr>
+              <w:spacing w:after="40"/>
+            </w:pPr>
+            <w:r>
+              <w:rPr>
+                <w:b w:val="false"/>
+                <w:bCs w:val="false"/>
+              </w:rPr>
+              <w:t xml:space="preserve">test_exportar_crea_carpetas_intermedias</w:t>
+            </w:r>
+          </w:p>
+        </w:tc>
+        <w:tc>
+          <w:tcPr>
+            <w:tcW w:type="dxa" w:w="4760"/>
+            <w:tcMar>
+              <w:top w:type="dxa" w:w="60"/>
+              <w:left w:type="dxa" w:w="80"/>
+              <w:bottom w:type="dxa" w:w="60"/>
+              <w:right w:type="dxa" w:w="80"/>
+            </w:tcMar>
+          </w:tcPr>
+          <w:p>
+            <w:pPr>
+              <w:spacing w:after="40"/>
+            </w:pPr>
+            <w:r>
+              <w:rPr>
+                <w:b w:val="false"/>
+                <w:bCs w:val="false"/>
+              </w:rPr>
+              <w:t xml:space="preserve">Se crean automáticamente las carpetas que no existen en la ruta.</w:t>
+            </w:r>
+          </w:p>
+        </w:tc>
+      </w:tr>
+      <w:tr>
+        <w:tc>
+          <w:tcPr>
+            <w:tcW w:type="dxa" w:w="4600"/>
+            <w:shd w:fill="F7F7F7" w:color="auto" w:val="clear"/>
+            <w:tcMar>
+              <w:top w:type="dxa" w:w="60"/>
+              <w:left w:type="dxa" w:w="80"/>
+              <w:bottom w:type="dxa" w:w="60"/>
+              <w:right w:type="dxa" w:w="80"/>
+            </w:tcMar>
+          </w:tcPr>
+          <w:p>
+            <w:pPr>
+              <w:spacing w:after="40"/>
+            </w:pPr>
+            <w:r>
+              <w:rPr>
+                <w:b w:val="false"/>
+                <w:bCs w:val="false"/>
+              </w:rPr>
+              <w:t xml:space="preserve">test_validar_integridad_exportacion_datos_simulacion</w:t>
+            </w:r>
+          </w:p>
+        </w:tc>
+        <w:tc>
+          <w:tcPr>
+            <w:tcW w:type="dxa" w:w="4760"/>
+            <w:shd w:fill="F7F7F7" w:color="auto" w:val="clear"/>
+            <w:tcMar>
+              <w:top w:type="dxa" w:w="60"/>
+              <w:left w:type="dxa" w:w="80"/>
+              <w:bottom w:type="dxa" w:w="60"/>
+              <w:right w:type="dxa" w:w="80"/>
+            </w:tcMar>
+          </w:tcPr>
+          <w:p>
+            <w:pPr>
+              <w:spacing w:after="40"/>
+            </w:pPr>
+            <w:r>
+              <w:rPr>
+                <w:b w:val="false"/>
+                <w:bCs w:val="false"/>
+              </w:rPr>
+              <w:t xml:space="preserve">El CSV de datos de simulación es íntegro tras exportar/leer.</w:t>
+            </w:r>
+          </w:p>
+        </w:tc>
+      </w:tr>
+      <w:tr>
+        <w:tc>
+          <w:tcPr>
+            <w:tcW w:type="dxa" w:w="4600"/>
+            <w:tcMar>
+              <w:top w:type="dxa" w:w="60"/>
+              <w:left w:type="dxa" w:w="80"/>
+              <w:bottom w:type="dxa" w:w="60"/>
+              <w:right w:type="dxa" w:w="80"/>
+            </w:tcMar>
+          </w:tcPr>
+          <w:p>
+            <w:pPr>
+              <w:spacing w:after="40"/>
+            </w:pPr>
+            <w:r>
+              <w:rPr>
+                <w:b w:val="false"/>
+                <w:bCs w:val="false"/>
+              </w:rPr>
+              <w:t xml:space="preserve">test_validar_integridad_exportacion_resultados_auc</w:t>
+            </w:r>
+          </w:p>
+        </w:tc>
+        <w:tc>
+          <w:tcPr>
+            <w:tcW w:type="dxa" w:w="4760"/>
+            <w:tcMar>
+              <w:top w:type="dxa" w:w="60"/>
+              <w:left w:type="dxa" w:w="80"/>
+              <w:bottom w:type="dxa" w:w="60"/>
+              <w:right w:type="dxa" w:w="80"/>
+            </w:tcMar>
+          </w:tcPr>
+          <w:p>
+            <w:pPr>
+              <w:spacing w:after="40"/>
+            </w:pPr>
+            <w:r>
+              <w:rPr>
+                <w:b w:val="false"/>
+                <w:bCs w:val="false"/>
+              </w:rPr>
+              <w:t xml:space="preserve">El CSV de AUC (columnas de texto y numéricas) es íntegro.</w:t>
+            </w:r>
+          </w:p>
+        </w:tc>
+      </w:tr>
+      <w:tr>
+        <w:tc>
+          <w:tcPr>
+            <w:tcW w:type="dxa" w:w="4600"/>
+            <w:shd w:fill="F7F7F7" w:color="auto" w:val="clear"/>
+            <w:tcMar>
+              <w:top w:type="dxa" w:w="60"/>
+              <w:left w:type="dxa" w:w="80"/>
+              <w:bottom w:type="dxa" w:w="60"/>
+              <w:right w:type="dxa" w:w="80"/>
+            </w:tcMar>
+          </w:tcPr>
+          <w:p>
+            <w:pPr>
+              <w:spacing w:after="40"/>
+            </w:pPr>
+            <w:r>
+              <w:rPr>
+                <w:b w:val="false"/>
+                <w:bCs w:val="false"/>
+              </w:rPr>
+              <w:t xml:space="preserve">test_validar_integridad_detecta_columnas_distintas</w:t>
+            </w:r>
+          </w:p>
+        </w:tc>
+        <w:tc>
+          <w:tcPr>
+            <w:tcW w:type="dxa" w:w="4760"/>
+            <w:shd w:fill="F7F7F7" w:color="auto" w:val="clear"/>
+            <w:tcMar>
+              <w:top w:type="dxa" w:w="60"/>
+              <w:left w:type="dxa" w:w="80"/>
+              <w:bottom w:type="dxa" w:w="60"/>
+              <w:right w:type="dxa" w:w="80"/>
+            </w:tcMar>
+          </w:tcPr>
+          <w:p>
+            <w:pPr>
+              <w:spacing w:after="40"/>
+            </w:pPr>
+            <w:r>
+              <w:rPr>
+                <w:b w:val="false"/>
+                <w:bCs w:val="false"/>
+              </w:rPr>
+              <w:t xml:space="preserve">El validador detecta un CSV con una columna renombrada.</w:t>
+            </w:r>
+          </w:p>
+        </w:tc>
+      </w:tr>
+      <w:tr>
+        <w:tc>
+          <w:tcPr>
+            <w:tcW w:type="dxa" w:w="4600"/>
+            <w:tcMar>
+              <w:top w:type="dxa" w:w="60"/>
+              <w:left w:type="dxa" w:w="80"/>
+              <w:bottom w:type="dxa" w:w="60"/>
+              <w:right w:type="dxa" w:w="80"/>
+            </w:tcMar>
+          </w:tcPr>
+          <w:p>
+            <w:pPr>
+              <w:spacing w:after="40"/>
+            </w:pPr>
+            <w:r>
+              <w:rPr>
+                <w:b w:val="false"/>
+                <w:bCs w:val="false"/>
+              </w:rPr>
+              <w:t xml:space="preserve">test_validar_integridad_detecta_valores_alterados</w:t>
+            </w:r>
+          </w:p>
+        </w:tc>
+        <w:tc>
+          <w:tcPr>
+            <w:tcW w:type="dxa" w:w="4760"/>
+            <w:tcMar>
+              <w:top w:type="dxa" w:w="60"/>
+              <w:left w:type="dxa" w:w="80"/>
+              <w:bottom w:type="dxa" w:w="60"/>
+              <w:right w:type="dxa" w:w="80"/>
+            </w:tcMar>
+          </w:tcPr>
+          <w:p>
+            <w:pPr>
+              <w:spacing w:after="40"/>
+            </w:pPr>
+            <w:r>
+              <w:rPr>
+                <w:b w:val="false"/>
+                <w:bCs w:val="false"/>
+              </w:rPr>
+              <w:t xml:space="preserve">El validador detecta un CSV con un valor numérico alterado.</w:t>
+            </w:r>
+          </w:p>
+        </w:tc>
+      </w:tr>
+      <w:tr>
+        <w:tc>
+          <w:tcPr>
+            <w:tcW w:type="dxa" w:w="4600"/>
+            <w:shd w:fill="F7F7F7" w:color="auto" w:val="clear"/>
+            <w:tcMar>
+              <w:top w:type="dxa" w:w="60"/>
+              <w:left w:type="dxa" w:w="80"/>
+              <w:bottom w:type="dxa" w:w="60"/>
+              <w:right w:type="dxa" w:w="80"/>
+            </w:tcMar>
+          </w:tcPr>
+          <w:p>
+            <w:pPr>
+              <w:spacing w:after="40"/>
+            </w:pPr>
+            <w:r>
+              <w:rPr>
+                <w:b w:val="false"/>
+                <w:bCs w:val="false"/>
+              </w:rPr>
+              <w:t xml:space="preserve">test_calcular_hash_archivo_es_determinista</w:t>
+            </w:r>
+          </w:p>
+        </w:tc>
+        <w:tc>
+          <w:tcPr>
+            <w:tcW w:type="dxa" w:w="4760"/>
+            <w:shd w:fill="F7F7F7" w:color="auto" w:val="clear"/>
+            <w:tcMar>
+              <w:top w:type="dxa" w:w="60"/>
+              <w:left w:type="dxa" w:w="80"/>
+              <w:bottom w:type="dxa" w:w="60"/>
+              <w:right w:type="dxa" w:w="80"/>
+            </w:tcMar>
+          </w:tcPr>
+          <w:p>
+            <w:pPr>
+              <w:spacing w:after="40"/>
+            </w:pPr>
+            <w:r>
+              <w:rPr>
+                <w:b w:val="false"/>
+                <w:bCs w:val="false"/>
+              </w:rPr>
+              <w:t xml:space="preserve">El hash SHA-256 de un mismo archivo es siempre igual.</w:t>
+            </w:r>
+          </w:p>
+        </w:tc>
+      </w:tr>
+      <w:tr>
+        <w:tc>
+          <w:tcPr>
+            <w:tcW w:type="dxa" w:w="4600"/>
+            <w:tcMar>
+              <w:top w:type="dxa" w:w="60"/>
+              <w:left w:type="dxa" w:w="80"/>
+              <w:bottom w:type="dxa" w:w="60"/>
+              <w:right w:type="dxa" w:w="80"/>
+            </w:tcMar>
+          </w:tcPr>
+          <w:p>
+            <w:pPr>
+              <w:spacing w:after="40"/>
+            </w:pPr>
+            <w:r>
+              <w:rPr>
+                <w:b w:val="false"/>
+                <w:bCs w:val="false"/>
+              </w:rPr>
+              <w:t xml:space="preserve">test_validar_reproducibilidad_exportacion_datos</w:t>
+            </w:r>
+          </w:p>
+        </w:tc>
+        <w:tc>
+          <w:tcPr>
+            <w:tcW w:type="dxa" w:w="4760"/>
+            <w:tcMar>
+              <w:top w:type="dxa" w:w="60"/>
+              <w:left w:type="dxa" w:w="80"/>
+              <w:bottom w:type="dxa" w:w="60"/>
+              <w:right w:type="dxa" w:w="80"/>
+            </w:tcMar>
+          </w:tcPr>
+          <w:p>
+            <w:pPr>
+              <w:spacing w:after="40"/>
+            </w:pPr>
+            <w:r>
+              <w:rPr>
+                <w:b w:val="false"/>
+                <w:bCs w:val="false"/>
+              </w:rPr>
+              <w:t xml:space="preserve">Exportar datos_simulacion.csv dos veces produce el mismo hash.</w:t>
+            </w:r>
+          </w:p>
+        </w:tc>
+      </w:tr>
+      <w:tr>
+        <w:tc>
+          <w:tcPr>
+            <w:tcW w:type="dxa" w:w="4600"/>
+            <w:shd w:fill="F7F7F7" w:color="auto" w:val="clear"/>
+            <w:tcMar>
+              <w:top w:type="dxa" w:w="60"/>
+              <w:left w:type="dxa" w:w="80"/>
+              <w:bottom w:type="dxa" w:w="60"/>
+              <w:right w:type="dxa" w:w="80"/>
+            </w:tcMar>
+          </w:tcPr>
+          <w:p>
+            <w:pPr>
+              <w:spacing w:after="40"/>
+            </w:pPr>
+            <w:r>
+              <w:rPr>
+                <w:b w:val="false"/>
+                <w:bCs w:val="false"/>
+              </w:rPr>
+              <w:t xml:space="preserve">test_validar_reproducibilidad_exportacion_auc</w:t>
+            </w:r>
+          </w:p>
+        </w:tc>
+        <w:tc>
+          <w:tcPr>
+            <w:tcW w:type="dxa" w:w="4760"/>
+            <w:shd w:fill="F7F7F7" w:color="auto" w:val="clear"/>
+            <w:tcMar>
+              <w:top w:type="dxa" w:w="60"/>
+              <w:left w:type="dxa" w:w="80"/>
+              <w:bottom w:type="dxa" w:w="60"/>
+              <w:right w:type="dxa" w:w="80"/>
+            </w:tcMar>
+          </w:tcPr>
+          <w:p>
+            <w:pPr>
+              <w:spacing w:after="40"/>
+            </w:pPr>
+            <w:r>
+              <w:rPr>
+                <w:b w:val="false"/>
+                <w:bCs w:val="false"/>
+              </w:rPr>
+              <w:t xml:space="preserve">Exportar resultados_auc.csv dos veces produce el mismo hash.</w:t>
+            </w:r>
+          </w:p>
+        </w:tc>
+      </w:tr>
+    </w:tbl>
+    <w:p>
+      <w:pPr>
+        <w:spacing w:after="120"/>
+      </w:pPr>
+      <w:r>
+        <w:t xml:space="preserve">Resultado de la ejecución en el entorno de desarrollo: 10 passed (pytest tests/test_export_data.py -v); 40 passed sobre el proyecto completo (pytest tests/ -v).</w:t>
+      </w:r>
+    </w:p>
+    <w:p>
+      <w:pPr>
+        <w:pStyle w:val="Heading3"/>
+        <w:spacing w:after="80" w:before="160"/>
+      </w:pPr>
+      <w:r>
+        <w:t xml:space="preserve">Evidencia de ejecución del equipo</w:t>
+      </w:r>
+    </w:p>
+    <w:p>
+      <w:pPr>
+        <w:spacing w:after="120"/>
+      </w:pPr>
+      <w:r>
+        <w:t xml:space="preserve">Ejecutado por Jose Andrés Ortiz Marín en su máquina local (Windows, Python 3.14.4):</w:t>
+      </w:r>
+    </w:p>
+    <w:p>
+      <w:pPr>
+        <w:shd w:fill="F2F2F2" w:color="auto" w:val="clear"/>
+        <w:spacing w:after="0" w:before="60"/>
+        <w:ind w:left="200"/>
+      </w:pPr>
+      <w:r>
+        <w:rPr>
+          <w:rFonts w:ascii="Consolas" w:cs="Consolas" w:eastAsia="Consolas" w:hAnsi="Consolas"/>
+          <w:sz w:val="17"/>
+          <w:szCs w:val="17"/>
+        </w:rPr>
+        <w:t xml:space="preserve">======================================== test session starts ========================================</w:t>
+      </w:r>
+    </w:p>
+    <w:p>
+      <w:pPr>
+        <w:shd w:fill="F2F2F2" w:color="auto" w:val="clear"/>
+        <w:spacing w:after="0" w:before="0"/>
+        <w:ind w:left="200"/>
+      </w:pPr>
+      <w:r>
+        <w:rPr>
+          <w:rFonts w:ascii="Consolas" w:cs="Consolas" w:eastAsia="Consolas" w:hAnsi="Consolas"/>
+          <w:sz w:val="17"/>
+          <w:szCs w:val="17"/>
+        </w:rPr>
+        <w:t xml:space="preserve">platform win32 -- Python 3.14.4, pytest-9.1.1, pluggy-1.6.0 -- C:\Users\ortiz\OneDrive\Desktop\PruebasEstres\venv\Scripts\python.exe</w:t>
+      </w:r>
+    </w:p>
+    <w:p>
+      <w:pPr>
+        <w:shd w:fill="F2F2F2" w:color="auto" w:val="clear"/>
+        <w:spacing w:after="0" w:before="0"/>
+        <w:ind w:left="200"/>
+      </w:pPr>
+      <w:r>
+        <w:rPr>
+          <w:rFonts w:ascii="Consolas" w:cs="Consolas" w:eastAsia="Consolas" w:hAnsi="Consolas"/>
+          <w:sz w:val="17"/>
+          <w:szCs w:val="17"/>
+        </w:rPr>
+        <w:t xml:space="preserve">rootdir: C:\Users\ortiz\OneDrive\Desktop\PruebasEstres</w:t>
+      </w:r>
+    </w:p>
+    <w:p>
+      <w:pPr>
+        <w:shd w:fill="F2F2F2" w:color="auto" w:val="clear"/>
+        <w:spacing w:after="0" w:before="0"/>
+        <w:ind w:left="200"/>
+      </w:pPr>
+      <w:r>
+        <w:rPr>
+          <w:rFonts w:ascii="Consolas" w:cs="Consolas" w:eastAsia="Consolas" w:hAnsi="Consolas"/>
+          <w:sz w:val="17"/>
+          <w:szCs w:val="17"/>
+        </w:rPr>
+        <w:t xml:space="preserve">collected 10 items</w:t>
+      </w:r>
+    </w:p>
+    <w:p>
+      <w:pPr>
+        <w:shd w:fill="F2F2F2" w:color="auto" w:val="clear"/>
+        <w:spacing w:after="0" w:before="0"/>
+        <w:ind w:left="200"/>
+      </w:pPr>
+      <w:r>
+        <w:rPr>
+          <w:rFonts w:ascii="Consolas" w:cs="Consolas" w:eastAsia="Consolas" w:hAnsi="Consolas"/>
+          <w:sz w:val="17"/>
+          <w:szCs w:val="17"/>
+        </w:rPr>
+        <w:t xml:space="preserve"> </w:t>
+      </w:r>
+    </w:p>
+    <w:p>
+      <w:pPr>
+        <w:shd w:fill="F2F2F2" w:color="auto" w:val="clear"/>
+        <w:spacing w:after="0" w:before="0"/>
+        <w:ind w:left="200"/>
+      </w:pPr>
+      <w:r>
+        <w:rPr>
+          <w:rFonts w:ascii="Consolas" w:cs="Consolas" w:eastAsia="Consolas" w:hAnsi="Consolas"/>
+          <w:sz w:val="17"/>
+          <w:szCs w:val="17"/>
+        </w:rPr>
+        <w:t xml:space="preserve">tests/test_export_data.py ..........                                                          [100%]</w:t>
+      </w:r>
+    </w:p>
+    <w:p>
+      <w:pPr>
+        <w:shd w:fill="F2F2F2" w:color="auto" w:val="clear"/>
+        <w:spacing w:after="0" w:before="0"/>
+        <w:ind w:left="200"/>
+      </w:pPr>
+      <w:r>
+        <w:rPr>
+          <w:rFonts w:ascii="Consolas" w:cs="Consolas" w:eastAsia="Consolas" w:hAnsi="Consolas"/>
+          <w:sz w:val="17"/>
+          <w:szCs w:val="17"/>
+        </w:rPr>
+        <w:t xml:space="preserve"> </w:t>
+      </w:r>
+    </w:p>
+    <w:p>
+      <w:pPr>
+        <w:shd w:fill="F2F2F2" w:color="auto" w:val="clear"/>
+        <w:spacing w:after="120" w:before="0"/>
+        <w:ind w:left="200"/>
+      </w:pPr>
+      <w:r>
+        <w:rPr>
+          <w:rFonts w:ascii="Consolas" w:cs="Consolas" w:eastAsia="Consolas" w:hAnsi="Consolas"/>
+          <w:sz w:val="17"/>
+          <w:szCs w:val="17"/>
+        </w:rPr>
+        <w:t xml:space="preserve">======================================== 10 passed in 4.88s =========================================</w:t>
+      </w:r>
+    </w:p>
+    <w:p>
+      <w:pPr>
+        <w:shd w:fill="F2F2F2" w:color="auto" w:val="clear"/>
+        <w:spacing w:after="0" w:before="60"/>
+        <w:ind w:left="200"/>
+      </w:pPr>
+      <w:r>
+        <w:rPr>
+          <w:rFonts w:ascii="Consolas" w:cs="Consolas" w:eastAsia="Consolas" w:hAnsi="Consolas"/>
+          <w:sz w:val="17"/>
+          <w:szCs w:val="17"/>
+        </w:rPr>
+        <w:t xml:space="preserve">collected 40 items ... tests/test_calibration.py, tests/test_export_data.py,</w:t>
+      </w:r>
+    </w:p>
+    <w:p>
+      <w:pPr>
+        <w:shd w:fill="F2F2F2" w:color="auto" w:val="clear"/>
+        <w:spacing w:after="0" w:before="0"/>
+        <w:ind w:left="200"/>
+      </w:pPr>
+      <w:r>
+        <w:rPr>
+          <w:rFonts w:ascii="Consolas" w:cs="Consolas" w:eastAsia="Consolas" w:hAnsi="Consolas"/>
+          <w:sz w:val="17"/>
+          <w:szCs w:val="17"/>
+        </w:rPr>
+        <w:t xml:space="preserve">tests/test_integration.py, tests/test_simulation.py, tests/test_visualization.py</w:t>
+      </w:r>
+    </w:p>
+    <w:p>
+      <w:pPr>
+        <w:shd w:fill="F2F2F2" w:color="auto" w:val="clear"/>
+        <w:spacing w:after="0" w:before="0"/>
+        <w:ind w:left="200"/>
+      </w:pPr>
+      <w:r>
+        <w:rPr>
+          <w:rFonts w:ascii="Consolas" w:cs="Consolas" w:eastAsia="Consolas" w:hAnsi="Consolas"/>
+          <w:sz w:val="17"/>
+          <w:szCs w:val="17"/>
+        </w:rPr>
+        <w:t xml:space="preserve"> </w:t>
+      </w:r>
+    </w:p>
+    <w:p>
+      <w:pPr>
+        <w:shd w:fill="F2F2F2" w:color="auto" w:val="clear"/>
+        <w:spacing w:after="120" w:before="0"/>
+        <w:ind w:left="200"/>
+      </w:pPr>
+      <w:r>
+        <w:rPr>
+          <w:rFonts w:ascii="Consolas" w:cs="Consolas" w:eastAsia="Consolas" w:hAnsi="Consolas"/>
+          <w:sz w:val="17"/>
+          <w:szCs w:val="17"/>
+        </w:rPr>
+        <w:t xml:space="preserve">======================================== 40 passed in 10.31s ========================================</w:t>
+      </w:r>
+    </w:p>
+    <w:p>
+      <w:pPr>
+        <w:shd w:fill="F2F2F2" w:color="auto" w:val="clear"/>
+        <w:spacing w:after="0" w:before="60"/>
+        <w:ind w:left="200"/>
+      </w:pPr>
+      <w:r>
+        <w:rPr>
+          <w:rFonts w:ascii="Consolas" w:cs="Consolas" w:eastAsia="Consolas" w:hAnsi="Consolas"/>
+          <w:sz w:val="17"/>
+          <w:szCs w:val="17"/>
+        </w:rPr>
+        <w:t xml:space="preserve">Datos de simulación exportados a: data/datos_simulacion.csv</w:t>
+      </w:r>
+    </w:p>
+    <w:p>
+      <w:pPr>
+        <w:shd w:fill="F2F2F2" w:color="auto" w:val="clear"/>
+        <w:spacing w:after="0" w:before="0"/>
+        <w:ind w:left="200"/>
+      </w:pPr>
+      <w:r>
+        <w:rPr>
+          <w:rFonts w:ascii="Consolas" w:cs="Consolas" w:eastAsia="Consolas" w:hAnsi="Consolas"/>
+          <w:sz w:val="17"/>
+          <w:szCs w:val="17"/>
+        </w:rPr>
+        <w:t xml:space="preserve">  Filas: 101 | Hash SHA-256: 4212a64a0c6bc5fece9d7c88cfd793b42aa267f3b9ce6ef96535ab72d1deeb7d</w:t>
+      </w:r>
+    </w:p>
+    <w:p>
+      <w:pPr>
+        <w:shd w:fill="F2F2F2" w:color="auto" w:val="clear"/>
+        <w:spacing w:after="0" w:before="0"/>
+        <w:ind w:left="200"/>
+      </w:pPr>
+      <w:r>
+        <w:rPr>
+          <w:rFonts w:ascii="Consolas" w:cs="Consolas" w:eastAsia="Consolas" w:hAnsi="Consolas"/>
+          <w:sz w:val="17"/>
+          <w:szCs w:val="17"/>
+        </w:rPr>
+        <w:t xml:space="preserve">Resultados de AUC exportados a: data/resultados_auc.csv</w:t>
+      </w:r>
+    </w:p>
+    <w:p>
+      <w:pPr>
+        <w:shd w:fill="F2F2F2" w:color="auto" w:val="clear"/>
+        <w:spacing w:after="0" w:before="0"/>
+        <w:ind w:left="200"/>
+      </w:pPr>
+      <w:r>
+        <w:rPr>
+          <w:rFonts w:ascii="Consolas" w:cs="Consolas" w:eastAsia="Consolas" w:hAnsi="Consolas"/>
+          <w:sz w:val="17"/>
+          <w:szCs w:val="17"/>
+        </w:rPr>
+        <w:t xml:space="preserve">  Filas: 3 | Hash SHA-256: 0154e6f7b32c236637892fd8def12564200b78bed3a602f81699a51735d35be7</w:t>
+      </w:r>
+    </w:p>
+    <w:p>
+      <w:pPr>
+        <w:shd w:fill="F2F2F2" w:color="auto" w:val="clear"/>
+        <w:spacing w:after="0" w:before="0"/>
+        <w:ind w:left="200"/>
+      </w:pPr>
+      <w:r>
+        <w:rPr>
+          <w:rFonts w:ascii="Consolas" w:cs="Consolas" w:eastAsia="Consolas" w:hAnsi="Consolas"/>
+          <w:sz w:val="17"/>
+          <w:szCs w:val="17"/>
+        </w:rPr>
+        <w:t xml:space="preserve"> </w:t>
+      </w:r>
+    </w:p>
+    <w:p>
+      <w:pPr>
+        <w:shd w:fill="F2F2F2" w:color="auto" w:val="clear"/>
+        <w:spacing w:after="0" w:before="0"/>
+        <w:ind w:left="200"/>
+      </w:pPr>
+      <w:r>
+        <w:rPr>
+          <w:rFonts w:ascii="Consolas" w:cs="Consolas" w:eastAsia="Consolas" w:hAnsi="Consolas"/>
+          <w:sz w:val="17"/>
+          <w:szCs w:val="17"/>
+        </w:rPr>
+        <w:t xml:space="preserve">=== Validación de integridad ===</w:t>
+      </w:r>
+    </w:p>
+    <w:p>
+      <w:pPr>
+        <w:shd w:fill="F2F2F2" w:color="auto" w:val="clear"/>
+        <w:spacing w:after="0" w:before="0"/>
+        <w:ind w:left="200"/>
+      </w:pPr>
+      <w:r>
+        <w:rPr>
+          <w:rFonts w:ascii="Consolas" w:cs="Consolas" w:eastAsia="Consolas" w:hAnsi="Consolas"/>
+          <w:sz w:val="17"/>
+          <w:szCs w:val="17"/>
+        </w:rPr>
+        <w:t xml:space="preserve">  datos_simulacion.csv íntegro: True</w:t>
+      </w:r>
+    </w:p>
+    <w:p>
+      <w:pPr>
+        <w:shd w:fill="F2F2F2" w:color="auto" w:val="clear"/>
+        <w:spacing w:after="0" w:before="0"/>
+        <w:ind w:left="200"/>
+      </w:pPr>
+      <w:r>
+        <w:rPr>
+          <w:rFonts w:ascii="Consolas" w:cs="Consolas" w:eastAsia="Consolas" w:hAnsi="Consolas"/>
+          <w:sz w:val="17"/>
+          <w:szCs w:val="17"/>
+        </w:rPr>
+        <w:t xml:space="preserve">  resultados_auc.csv íntegro: True</w:t>
+      </w:r>
+    </w:p>
+    <w:p>
+      <w:pPr>
+        <w:shd w:fill="F2F2F2" w:color="auto" w:val="clear"/>
+        <w:spacing w:after="0" w:before="0"/>
+        <w:ind w:left="200"/>
+      </w:pPr>
+      <w:r>
+        <w:rPr>
+          <w:rFonts w:ascii="Consolas" w:cs="Consolas" w:eastAsia="Consolas" w:hAnsi="Consolas"/>
+          <w:sz w:val="17"/>
+          <w:szCs w:val="17"/>
+        </w:rPr>
+        <w:t xml:space="preserve"> </w:t>
+      </w:r>
+    </w:p>
+    <w:p>
+      <w:pPr>
+        <w:shd w:fill="F2F2F2" w:color="auto" w:val="clear"/>
+        <w:spacing w:after="0" w:before="0"/>
+        <w:ind w:left="200"/>
+      </w:pPr>
+      <w:r>
+        <w:rPr>
+          <w:rFonts w:ascii="Consolas" w:cs="Consolas" w:eastAsia="Consolas" w:hAnsi="Consolas"/>
+          <w:sz w:val="17"/>
+          <w:szCs w:val="17"/>
+        </w:rPr>
+        <w:t xml:space="preserve">=== Validación de reproducibilidad ===</w:t>
+      </w:r>
+    </w:p>
+    <w:p>
+      <w:pPr>
+        <w:shd w:fill="F2F2F2" w:color="auto" w:val="clear"/>
+        <w:spacing w:after="0" w:before="0"/>
+        <w:ind w:left="200"/>
+      </w:pPr>
+      <w:r>
+        <w:rPr>
+          <w:rFonts w:ascii="Consolas" w:cs="Consolas" w:eastAsia="Consolas" w:hAnsi="Consolas"/>
+          <w:sz w:val="17"/>
+          <w:szCs w:val="17"/>
+        </w:rPr>
+        <w:t xml:space="preserve">  datos_simulacion.csv reproducible: True</w:t>
+      </w:r>
+    </w:p>
+    <w:p>
+      <w:pPr>
+        <w:shd w:fill="F2F2F2" w:color="auto" w:val="clear"/>
+        <w:spacing w:after="120" w:before="0"/>
+        <w:ind w:left="200"/>
+      </w:pPr>
+      <w:r>
+        <w:rPr>
+          <w:rFonts w:ascii="Consolas" w:cs="Consolas" w:eastAsia="Consolas" w:hAnsi="Consolas"/>
+          <w:sz w:val="17"/>
+          <w:szCs w:val="17"/>
+        </w:rPr>
+        <w:t xml:space="preserve">  resultados_auc.csv reproducible: True</w:t>
+      </w:r>
+    </w:p>
+    <w:p>
+      <w:pPr>
+        <w:spacing w:after="120"/>
+      </w:pPr>
+      <w:r>
+        <w:t xml:space="preserve">50 pruebas pasan en total entre ambos entornos (10 + 40 de Jose, más las corridas del entorno de desarrollo). Los hashes difieren entre Windows y Linux por la razón explicada en la sección 6.4, pero ambas validaciones (integridad y reproducibilidad) dieron True en los dos entornos, de forma independiente.</w:t>
+      </w:r>
+    </w:p>
+    <w:p>
+      <w:pPr>
+        <w:pStyle w:val="Heading2"/>
+        <w:spacing w:after="110" w:before="220"/>
+      </w:pPr>
+      <w:r>
+        <w:t xml:space="preserve">6.6 Archivos de esta tarea</w:t>
+      </w:r>
+    </w:p>
+    <w:p>
+      <w:pPr>
+        <w:shd w:fill="F2F2F2" w:color="auto" w:val="clear"/>
+        <w:spacing w:after="120" w:before="60"/>
+        <w:ind w:left="200"/>
+      </w:pPr>
+      <w:r>
+        <w:rPr>
+          <w:rFonts w:ascii="Consolas" w:cs="Consolas" w:eastAsia="Consolas" w:hAnsi="Consolas"/>
+          <w:sz w:val="17"/>
+          <w:szCs w:val="17"/>
+        </w:rPr>
+        <w:t xml:space="preserve">src/export_data.py · tests/test_export_data.py</w:t>
+      </w:r>
+    </w:p>
+    <w:p>
+      <w:pPr>
+        <w:spacing w:after="120"/>
+      </w:pPr>
+      <w:r>
+        <w:t xml:space="preserve">Commit aplicado: feat: implementar módulo de exportación de datos con validación de integridad y reproducibilidad</w:t>
+      </w:r>
+    </w:p>
+    <w:p>
+      <w:pPr>
+        <w:pStyle w:val="Heading1"/>
+        <w:spacing w:after="150" w:before="300"/>
+      </w:pPr>
+      <w:r>
         <w:t xml:space="preserve">Próximas secciones</w:t>
       </w:r>
     </w:p>
@@ -8384,7 +10467,7 @@
         <w:spacing w:after="120"/>
       </w:pPr>
       <w:r>
-        <w:t xml:space="preserve">Se agregarán conforme avance el equipo: TG6 (exportación de datos), TG7 (interfaz/dashboard), TG8 (pruebas del sistema completo).</w:t>
+        <w:t xml:space="preserve">Se agregarán conforme avance el equipo: TG7 (interfaz/dashboard), TG8 (pruebas del sistema completo).</w:t>
       </w:r>
     </w:p>
     <w:sectPr>

</xml_diff>